<commit_message>
Quy chế công ty: bổ sung theo audit CLARITY (Coats) — thêm Quy định PCCC và ứng phó khẩn cấp (văn bản 15), bổ sung ATVSLĐ, Nội quy, Dân chủ cơ sở, Tuyển dụng, Thang lương, sửa chỗ vênh giữa các văn bản
Co-Authored-By: Claude Fable 5.1 <noreply@anthropic.com>
</commit_message>
<xml_diff>
--- a/so_tay_quy_che.docx
+++ b/so_tay_quy_che.docx
@@ -1270,6 +1270,86 @@
           </w:p>
         </w:tc>
       </w:tr>
+      <w:tr>
+        <w:tc>
+          <w:tcPr>
+            <w:tcW w:type="dxa" w:w="900"/>
+            <w:tcBorders>
+              <w:top w:val="none" w:color="FFFFFF" w:sz="0"/>
+              <w:left w:val="none" w:color="FFFFFF" w:sz="0"/>
+              <w:bottom w:val="none" w:color="FFFFFF" w:sz="0"/>
+              <w:right w:val="none" w:color="FFFFFF" w:sz="0"/>
+            </w:tcBorders>
+          </w:tcPr>
+          <w:p>
+            <w:pPr>
+              <w:spacing w:after="60"/>
+              <w:jc w:val="center"/>
+            </w:pPr>
+            <w:r>
+              <w:rPr>
+                <w:rFonts w:ascii="Times New Roman" w:cs="Times New Roman" w:eastAsia="Times New Roman" w:hAnsi="Times New Roman"/>
+                <w:b/>
+                <w:bCs/>
+                <w:sz w:val="24"/>
+                <w:szCs w:val="24"/>
+              </w:rPr>
+              <w:t>15</w:t>
+            </w:r>
+          </w:p>
+        </w:tc>
+        <w:tc>
+          <w:tcPr>
+            <w:tcW w:type="dxa" w:w="1500"/>
+            <w:tcBorders>
+              <w:top w:val="none" w:color="FFFFFF" w:sz="0"/>
+              <w:left w:val="none" w:color="FFFFFF" w:sz="0"/>
+              <w:bottom w:val="none" w:color="FFFFFF" w:sz="0"/>
+              <w:right w:val="none" w:color="FFFFFF" w:sz="0"/>
+            </w:tcBorders>
+          </w:tcPr>
+          <w:p>
+            <w:pPr>
+              <w:spacing w:after="60"/>
+            </w:pPr>
+            <w:r>
+              <w:rPr>
+                <w:rFonts w:ascii="Times New Roman" w:cs="Times New Roman" w:eastAsia="Times New Roman" w:hAnsi="Times New Roman"/>
+                <w:b/>
+                <w:bCs/>
+                <w:color w:val="0E7C86"/>
+                <w:sz w:val="22"/>
+                <w:szCs w:val="22"/>
+              </w:rPr>
+              <w:t>PCCC</w:t>
+            </w:r>
+          </w:p>
+        </w:tc>
+        <w:tc>
+          <w:tcPr>
+            <w:tcW w:type="dxa" w:w="7200"/>
+            <w:tcBorders>
+              <w:top w:val="none" w:color="FFFFFF" w:sz="0"/>
+              <w:left w:val="none" w:color="FFFFFF" w:sz="0"/>
+              <w:bottom w:val="none" w:color="FFFFFF" w:sz="0"/>
+              <w:right w:val="none" w:color="FFFFFF" w:sz="0"/>
+            </w:tcBorders>
+          </w:tcPr>
+          <w:p>
+            <w:pPr>
+              <w:spacing w:after="60"/>
+            </w:pPr>
+            <w:r>
+              <w:rPr>
+                <w:rFonts w:ascii="Times New Roman" w:cs="Times New Roman" w:eastAsia="Times New Roman" w:hAnsi="Times New Roman"/>
+                <w:sz w:val="24"/>
+                <w:szCs w:val="24"/>
+              </w:rPr>
+              <w:t>QUY ĐỊNH PHÒNG CHÁY, CHỮA CHÁY VÀ ỨNG PHÓ TÌNH HUỐNG KHẨN CẤP</w:t>
+            </w:r>
+          </w:p>
+        </w:tc>
+      </w:tr>
     </w:tbl>
     <w:p>
       <w:pPr>
@@ -1855,6 +1935,25 @@
     </w:p>
     <w:p>
       <w:pPr>
+        <w:spacing w:after="100" w:line="300"/>
+        <w:ind w:left="360"/>
+        <w:jc w:val="both"/>
+      </w:pPr>
+      <w:r>
+        <w:rPr>
+          <w:rFonts w:ascii="Times New Roman" w:cs="Times New Roman" w:eastAsia="Times New Roman" w:hAnsi="Times New Roman"/>
+          <w:b w:val="false"/>
+          <w:bCs w:val="false"/>
+          <w:i w:val="false"/>
+          <w:iCs w:val="false"/>
+          <w:sz w:val="24"/>
+          <w:szCs w:val="24"/>
+        </w:rPr>
+        <w:t xml:space="preserve">5. NLĐ làm việc theo ca được nghỉ ít nhất 12 giờ trước khi chuyển sang ca làm việc khác; Trưởng bộ phận không bố trí ca kế tiếp khi NLĐ chưa được nghỉ đủ thời gian này.</w:t>
+      </w:r>
+    </w:p>
+    <w:p>
+      <w:pPr>
         <w:spacing w:after="80" w:before="140" w:line="300"/>
       </w:pPr>
       <w:r>
@@ -2477,6 +2576,25 @@
           <w:szCs w:val="24"/>
         </w:rPr>
         <w:t xml:space="preserve">Thực hiện theo quy định của pháp luật về bảo hiểm xã hội. NLĐ phải nộp hồ sơ, giấy tờ hợp lệ cho bộ phận Hành chính – Nhân sự trong thời hạn sớm nhất để làm thủ tục.</w:t>
+      </w:r>
+    </w:p>
+    <w:p>
+      <w:pPr>
+        <w:spacing w:after="100" w:line="300"/>
+        <w:ind w:left="360"/>
+        <w:jc w:val="both"/>
+      </w:pPr>
+      <w:r>
+        <w:rPr>
+          <w:rFonts w:ascii="Times New Roman" w:cs="Times New Roman" w:eastAsia="Times New Roman" w:hAnsi="Times New Roman"/>
+          <w:b w:val="false"/>
+          <w:bCs w:val="false"/>
+          <w:i w:val="false"/>
+          <w:iCs w:val="false"/>
+          <w:sz w:val="24"/>
+          <w:szCs w:val="24"/>
+        </w:rPr>
+        <w:t xml:space="preserve">Lao động nữ được nghỉ thai sản; lao động nam được nghỉ hưởng chế độ thai sản khi vợ sinh con; NLĐ được nghỉ chăm sóc con ốm đau theo quy định của pháp luật về bảo hiểm xã hội.</w:t>
       </w:r>
     </w:p>
     <w:p>
@@ -2641,6 +2759,63 @@
     </w:p>
     <w:p>
       <w:pPr>
+        <w:spacing w:after="100" w:line="300"/>
+        <w:ind w:left="360"/>
+        <w:jc w:val="both"/>
+      </w:pPr>
+      <w:r>
+        <w:rPr>
+          <w:rFonts w:ascii="Times New Roman" w:cs="Times New Roman" w:eastAsia="Times New Roman" w:hAnsi="Times New Roman"/>
+          <w:b w:val="false"/>
+          <w:bCs w:val="false"/>
+          <w:i w:val="false"/>
+          <w:iCs w:val="false"/>
+          <w:sz w:val="24"/>
+          <w:szCs w:val="24"/>
+        </w:rPr>
+        <w:t xml:space="preserve">4. Khách, nhà thầu, người ngoài Công ty khi đến văn phòng, kho, công trường phải đăng ký với bộ phận tiếp nhận, được ghi vào sổ theo dõi khách và có người của Công ty hướng dẫn trong suốt thời gian có mặt; việc phổ biến an toàn cho khách thực hiện theo Quy chế an toàn, vệ sinh lao động.</w:t>
+      </w:r>
+    </w:p>
+    <w:p>
+      <w:pPr>
+        <w:spacing w:after="100" w:line="300"/>
+        <w:ind w:left="360"/>
+        <w:jc w:val="both"/>
+      </w:pPr>
+      <w:r>
+        <w:rPr>
+          <w:rFonts w:ascii="Times New Roman" w:cs="Times New Roman" w:eastAsia="Times New Roman" w:hAnsi="Times New Roman"/>
+          <w:b w:val="false"/>
+          <w:bCs w:val="false"/>
+          <w:i w:val="false"/>
+          <w:iCs w:val="false"/>
+          <w:sz w:val="24"/>
+          <w:szCs w:val="24"/>
+        </w:rPr>
+        <w:t xml:space="preserve">5. Kho, khu vực lưu trữ hóa chất, vật tư, thiết bị và hồ sơ phải được khóa ngoài giờ làm việc; chìa khóa, mã khóa do người được phân công quản lý. Camera an ninh (nếu có) chỉ lắp tại lối ra vào, kho và khu vực chung, có biển thông báo; không lắp tại nhà vệ sinh, phòng thay đồ.</w:t>
+      </w:r>
+    </w:p>
+    <w:p>
+      <w:pPr>
+        <w:spacing w:after="100" w:line="300"/>
+        <w:ind w:left="360"/>
+        <w:jc w:val="both"/>
+      </w:pPr>
+      <w:r>
+        <w:rPr>
+          <w:rFonts w:ascii="Times New Roman" w:cs="Times New Roman" w:eastAsia="Times New Roman" w:hAnsi="Times New Roman"/>
+          <w:b w:val="false"/>
+          <w:bCs w:val="false"/>
+          <w:i w:val="false"/>
+          <w:iCs w:val="false"/>
+          <w:sz w:val="24"/>
+          <w:szCs w:val="24"/>
+        </w:rPr>
+        <w:t xml:space="preserve">6. Công ty tôn trọng quyền riêng tư của NLĐ: không giám sát liên tục cá nhân NLĐ; không kiểm tra tư trang, thư tín, thiết bị cá nhân của NLĐ, trừ trường hợp pháp luật cho phép và có sự chứng kiến của NLĐ. Dữ liệu hình ảnh camera được quản lý theo Chính sách bảo vệ dữ liệu cá nhân.</w:t>
+      </w:r>
+    </w:p>
+    <w:p>
+      <w:pPr>
         <w:spacing w:after="80" w:before="140" w:line="300"/>
       </w:pPr>
       <w:r>
@@ -3545,6 +3720,25 @@
     </w:p>
     <w:p>
       <w:pPr>
+        <w:spacing w:after="100" w:line="300"/>
+        <w:ind w:left="360"/>
+        <w:jc w:val="both"/>
+      </w:pPr>
+      <w:r>
+        <w:rPr>
+          <w:rFonts w:ascii="Times New Roman" w:cs="Times New Roman" w:eastAsia="Times New Roman" w:hAnsi="Times New Roman"/>
+          <w:b w:val="false"/>
+          <w:bCs w:val="false"/>
+          <w:i w:val="false"/>
+          <w:iCs w:val="false"/>
+          <w:sz w:val="24"/>
+          <w:szCs w:val="24"/>
+        </w:rPr>
+        <w:t xml:space="preserve">4. Khi vận chuyển hàng hóa, thiết bị, hóa chất đến kho, công trường hoặc khách hàng, người giao và người nhận kiểm đếm, ký phiếu giao nhận; hàng có giá trị lớn hoặc hóa chất nguy hiểm phải được chằng buộc, niêm phong phù hợp và do đơn vị vận chuyển đủ điều kiện thực hiện. Mất mát, hư hỏng trên đường vận chuyển phải được báo cáo ngay cho người quản lý trực tiếp.</w:t>
+      </w:r>
+    </w:p>
+    <w:p>
+      <w:pPr>
         <w:spacing w:after="80" w:before="140" w:line="300"/>
       </w:pPr>
       <w:r>
@@ -4566,7 +4760,83 @@
           <w:sz w:val="24"/>
           <w:szCs w:val="24"/>
         </w:rPr>
-        <w:t xml:space="preserve">9. Không chấp hành sự điều hành, phân công hợp pháp của người quản lý trực tiếp.</w:t>
+        <w:t xml:space="preserve">9. Không chấp hành sự điều hành, phân công hợp pháp của người quản lý trực tiếp;</w:t>
+      </w:r>
+    </w:p>
+    <w:p>
+      <w:pPr>
+        <w:spacing w:after="100" w:line="300"/>
+        <w:ind w:left="720"/>
+        <w:jc w:val="both"/>
+      </w:pPr>
+      <w:r>
+        <w:rPr>
+          <w:rFonts w:ascii="Times New Roman" w:cs="Times New Roman" w:eastAsia="Times New Roman" w:hAnsi="Times New Roman"/>
+          <w:b w:val="false"/>
+          <w:bCs w:val="false"/>
+          <w:i w:val="false"/>
+          <w:iCs w:val="false"/>
+          <w:sz w:val="24"/>
+          <w:szCs w:val="24"/>
+        </w:rPr>
+        <w:t xml:space="preserve">10. Đe dọa, bắt nạt, có hành vi bạo lực đối với đồng nghiệp, khách hàng, đối tác mà chưa đến mức cố ý gây thương tích;</w:t>
+      </w:r>
+    </w:p>
+    <w:p>
+      <w:pPr>
+        <w:spacing w:after="100" w:line="300"/>
+        <w:ind w:left="720"/>
+        <w:jc w:val="both"/>
+      </w:pPr>
+      <w:r>
+        <w:rPr>
+          <w:rFonts w:ascii="Times New Roman" w:cs="Times New Roman" w:eastAsia="Times New Roman" w:hAnsi="Times New Roman"/>
+          <w:b w:val="false"/>
+          <w:bCs w:val="false"/>
+          <w:i w:val="false"/>
+          <w:iCs w:val="false"/>
+          <w:sz w:val="24"/>
+          <w:szCs w:val="24"/>
+        </w:rPr>
+        <w:t xml:space="preserve">11. Phân biệt đối xử trong tuyển dụng, phân công, đánh giá, trả lương đối với NLĐ;</w:t>
+      </w:r>
+    </w:p>
+    <w:p>
+      <w:pPr>
+        <w:spacing w:after="100" w:line="300"/>
+        <w:ind w:left="720"/>
+        <w:jc w:val="both"/>
+      </w:pPr>
+      <w:r>
+        <w:rPr>
+          <w:rFonts w:ascii="Times New Roman" w:cs="Times New Roman" w:eastAsia="Times New Roman" w:hAnsi="Times New Roman"/>
+          <w:b w:val="false"/>
+          <w:bCs w:val="false"/>
+          <w:i w:val="false"/>
+          <w:iCs w:val="false"/>
+          <w:sz w:val="24"/>
+          <w:szCs w:val="24"/>
+        </w:rPr>
+        <w:t xml:space="preserve">12. Trả thù, trù dập người báo cáo vi phạm, người khiếu nại, người làm chứng (ngoài trường hợp quy định tại khoản 8 Điều 35 Nội quy này);</w:t>
+      </w:r>
+    </w:p>
+    <w:p>
+      <w:pPr>
+        <w:spacing w:after="100" w:line="300"/>
+        <w:ind w:left="720"/>
+        <w:jc w:val="both"/>
+      </w:pPr>
+      <w:r>
+        <w:rPr>
+          <w:rFonts w:ascii="Times New Roman" w:cs="Times New Roman" w:eastAsia="Times New Roman" w:hAnsi="Times New Roman"/>
+          <w:b w:val="false"/>
+          <w:bCs w:val="false"/>
+          <w:i w:val="false"/>
+          <w:iCs w:val="false"/>
+          <w:sz w:val="24"/>
+          <w:szCs w:val="24"/>
+        </w:rPr>
+        <w:t xml:space="preserve">13. Trao đổi, thỏa thuận với đối thủ cạnh tranh về giá, phân chia khách hàng hoặc thông đồng trong chào giá, đấu thầu trái Bộ chính sách tuân thủ của Công ty (chưa gây thiệt hại nghiêm trọng).</w:t>
       </w:r>
     </w:p>
     <w:p>
@@ -4824,7 +5094,7 @@
           <w:sz w:val="24"/>
           <w:szCs w:val="24"/>
         </w:rPr>
-        <w:t xml:space="preserve">5. Nhận tiền, hoa hồng, quà tặng có giá trị hoặc lợi ích khác từ khách hàng, nhà cung cấp, đối tác liên quan đến công việc được giao; thỏa thuận riêng ngoài Hệ thống gây thiệt hại cho Công ty;</w:t>
+        <w:t xml:space="preserve">5. Đưa, nhận hoặc môi giới hối lộ, chi «phí bôi trơn» dưới mọi hình thức; nhận tiền, hoa hồng, quà tặng có giá trị hoặc lợi ích khác từ khách hàng, nhà cung cấp, đối tác liên quan đến công việc được giao; thỏa thuận riêng ngoài Hệ thống gây thiệt hại cho Công ty;</w:t>
       </w:r>
     </w:p>
     <w:p>
@@ -5311,7 +5581,7 @@
           <w:sz w:val="24"/>
           <w:szCs w:val="24"/>
         </w:rPr>
-        <w:t xml:space="preserve">1. Khi phát hiện hành vi vi phạm ngay tại thời điểm xảy ra, Công ty lập biên bản vi phạm và thông báo đến tổ chức đại diện NLĐ tại cơ sở, người đại diện theo pháp luật của NLĐ chưa đủ 15 tuổi (nếu có).</w:t>
+        <w:t xml:space="preserve">1. Khi phát hiện hành vi vi phạm ngay tại thời điểm xảy ra, Công ty lập biên bản vi phạm và thông báo đến tổ chức đại diện NLĐ tại cơ sở.</w:t>
       </w:r>
     </w:p>
     <w:p>
@@ -11952,7 +12222,7 @@
           <w:sz w:val="26"/>
           <w:szCs w:val="26"/>
         </w:rPr>
-        <w:t xml:space="preserve">CHƯƠNG IV — ĐIỀU KHOẢN THI HÀNH</w:t>
+        <w:t xml:space="preserve">CHƯƠNG IV — TRẢ LƯƠNG</w:t>
       </w:r>
     </w:p>
     <w:p>
@@ -11967,7 +12237,114 @@
           <w:sz w:val="24"/>
           <w:szCs w:val="24"/>
         </w:rPr>
-        <w:t xml:space="preserve">Điều 11. Hiệu lực thi hành</w:t>
+        <w:t xml:space="preserve">Điều 11. Kỳ hạn trả lương và bảng kê trả lương</w:t>
+      </w:r>
+    </w:p>
+    <w:p>
+      <w:pPr>
+        <w:spacing w:after="100" w:line="300"/>
+        <w:ind w:left="360"/>
+        <w:jc w:val="both"/>
+      </w:pPr>
+      <w:r>
+        <w:rPr>
+          <w:rFonts w:ascii="Times New Roman" w:cs="Times New Roman" w:eastAsia="Times New Roman" w:hAnsi="Times New Roman"/>
+          <w:b w:val="false"/>
+          <w:bCs w:val="false"/>
+          <w:i w:val="false"/>
+          <w:iCs w:val="false"/>
+          <w:sz w:val="24"/>
+          <w:szCs w:val="24"/>
+        </w:rPr>
+        <w:t xml:space="preserve">1. Tiền lương được trả trực tiếp, đầy đủ, đúng hạn cho người lao động bằng chuyển khoản vào tài khoản của chính người lao động; Công ty chịu phí mở tài khoản và phí chuyển tiền lương.</w:t>
+      </w:r>
+    </w:p>
+    <w:p>
+      <w:pPr>
+        <w:spacing w:after="100" w:line="300"/>
+        <w:ind w:left="360"/>
+        <w:jc w:val="both"/>
+      </w:pPr>
+      <w:r>
+        <w:rPr>
+          <w:rFonts w:ascii="Times New Roman" w:cs="Times New Roman" w:eastAsia="Times New Roman" w:hAnsi="Times New Roman"/>
+          <w:b w:val="false"/>
+          <w:bCs w:val="false"/>
+          <w:i w:val="false"/>
+          <w:iCs w:val="false"/>
+          <w:sz w:val="24"/>
+          <w:szCs w:val="24"/>
+        </w:rPr>
+        <w:t xml:space="preserve">2. Tiền lương tháng được trả một lần vào ngày 07 của tháng kế tiếp; tiền lương làm thêm giờ, làm việc ban đêm của tháng nào được trả cùng kỳ lương của tháng đó.</w:t>
+      </w:r>
+    </w:p>
+    <w:p>
+      <w:pPr>
+        <w:spacing w:after="100" w:line="300"/>
+        <w:ind w:left="360"/>
+        <w:jc w:val="both"/>
+      </w:pPr>
+      <w:r>
+        <w:rPr>
+          <w:rFonts w:ascii="Times New Roman" w:cs="Times New Roman" w:eastAsia="Times New Roman" w:hAnsi="Times New Roman"/>
+          <w:b w:val="false"/>
+          <w:bCs w:val="false"/>
+          <w:i w:val="false"/>
+          <w:iCs w:val="false"/>
+          <w:sz w:val="24"/>
+          <w:szCs w:val="24"/>
+        </w:rPr>
+        <w:t xml:space="preserve">3. Mỗi kỳ trả lương, Công ty gửi cho từng người lao động bảng kê trả lương (phiếu lương) ghi rõ: tiền lương, tiền lương làm thêm giờ, tiền lương làm việc ban đêm, các khoản phụ cấp, thưởng, nội dung và số tiền bị khấu trừ (bảo hiểm bắt buộc, thuế thu nhập cá nhân và khoản khác nếu có).</w:t>
+      </w:r>
+    </w:p>
+    <w:p>
+      <w:pPr>
+        <w:spacing w:after="100" w:line="300"/>
+        <w:ind w:left="360"/>
+        <w:jc w:val="both"/>
+      </w:pPr>
+      <w:r>
+        <w:rPr>
+          <w:rFonts w:ascii="Times New Roman" w:cs="Times New Roman" w:eastAsia="Times New Roman" w:hAnsi="Times New Roman"/>
+          <w:b w:val="false"/>
+          <w:bCs w:val="false"/>
+          <w:i w:val="false"/>
+          <w:iCs w:val="false"/>
+          <w:sz w:val="24"/>
+          <w:szCs w:val="24"/>
+        </w:rPr>
+        <w:t xml:space="preserve">4. Trường hợp vì lý do bất khả kháng không thể trả lương đúng hạn thì không được chậm quá 30 ngày; nếu chậm từ 15 ngày trở lên, Công ty đền bù cho người lao động theo quy định tại Điều 97 Bộ luật Lao động.</w:t>
+      </w:r>
+    </w:p>
+    <w:p>
+      <w:pPr>
+        <w:spacing w:after="140" w:before="260"/>
+        <w:jc w:val="center"/>
+      </w:pPr>
+      <w:r>
+        <w:rPr>
+          <w:rFonts w:ascii="Times New Roman" w:cs="Times New Roman" w:eastAsia="Times New Roman" w:hAnsi="Times New Roman"/>
+          <w:b/>
+          <w:bCs/>
+          <w:sz w:val="26"/>
+          <w:szCs w:val="26"/>
+        </w:rPr>
+        <w:t xml:space="preserve">CHƯƠNG V — ĐIỀU KHOẢN THI HÀNH</w:t>
+      </w:r>
+    </w:p>
+    <w:p>
+      <w:pPr>
+        <w:spacing w:after="80" w:before="140" w:line="300"/>
+      </w:pPr>
+      <w:r>
+        <w:rPr>
+          <w:rFonts w:ascii="Times New Roman" w:cs="Times New Roman" w:eastAsia="Times New Roman" w:hAnsi="Times New Roman"/>
+          <w:b/>
+          <w:bCs/>
+          <w:sz w:val="24"/>
+          <w:szCs w:val="24"/>
+        </w:rPr>
+        <w:t xml:space="preserve">Điều 12. Hiệu lực thi hành</w:t>
       </w:r>
     </w:p>
     <w:p>
@@ -15064,6 +15441,63 @@
     </w:p>
     <w:p>
       <w:pPr>
+        <w:spacing w:after="100" w:line="300"/>
+        <w:ind w:left="360"/>
+        <w:jc w:val="both"/>
+      </w:pPr>
+      <w:r>
+        <w:rPr>
+          <w:rFonts w:ascii="Times New Roman" w:cs="Times New Roman" w:eastAsia="Times New Roman" w:hAnsi="Times New Roman"/>
+          <w:b w:val="false"/>
+          <w:bCs w:val="false"/>
+          <w:i w:val="false"/>
+          <w:iCs w:val="false"/>
+          <w:sz w:val="24"/>
+          <w:szCs w:val="24"/>
+        </w:rPr>
+        <w:t xml:space="preserve">4. Thành viên nhóm đại diện đối thoại của người lao động do người lao động tự đề cử và bầu chọn công khai, dân chủ; Công ty không chỉ định, không can thiệp vào việc bầu chọn và lưu biên bản bầu chọn.</w:t>
+      </w:r>
+    </w:p>
+    <w:p>
+      <w:pPr>
+        <w:spacing w:after="100" w:line="300"/>
+        <w:ind w:left="360"/>
+        <w:jc w:val="both"/>
+      </w:pPr>
+      <w:r>
+        <w:rPr>
+          <w:rFonts w:ascii="Times New Roman" w:cs="Times New Roman" w:eastAsia="Times New Roman" w:hAnsi="Times New Roman"/>
+          <w:b w:val="false"/>
+          <w:bCs w:val="false"/>
+          <w:i w:val="false"/>
+          <w:iCs w:val="false"/>
+          <w:sz w:val="24"/>
+          <w:szCs w:val="24"/>
+        </w:rPr>
+        <w:t xml:space="preserve">5. Thành viên đại diện của người lao động được gặp gỡ, trao đổi và tổ chức họp với người lao động để lấy ý kiến mà không cần sự có mặt của người quản lý; Công ty bố trí thời gian, địa điểm hợp lý và không can thiệp vào nội dung cuộc họp.</w:t>
+      </w:r>
+    </w:p>
+    <w:p>
+      <w:pPr>
+        <w:spacing w:after="100" w:line="300"/>
+        <w:ind w:left="360"/>
+        <w:jc w:val="both"/>
+      </w:pPr>
+      <w:r>
+        <w:rPr>
+          <w:rFonts w:ascii="Times New Roman" w:cs="Times New Roman" w:eastAsia="Times New Roman" w:hAnsi="Times New Roman"/>
+          <w:b w:val="false"/>
+          <w:bCs w:val="false"/>
+          <w:i w:val="false"/>
+          <w:iCs w:val="false"/>
+          <w:sz w:val="24"/>
+          <w:szCs w:val="24"/>
+        </w:rPr>
+        <w:t xml:space="preserve">6. Công ty không dùng biện pháp kinh tế, ưu đãi hoặc đối xử bất lợi để tác động đến việc người lao động thành lập, gia nhập hay không gia nhập tổ chức đại diện người lao động; không phân biệt đối xử với thành viên đại diện vì lý do thực hiện nhiệm vụ đại diện.</w:t>
+      </w:r>
+    </w:p>
+    <w:p>
+      <w:pPr>
         <w:spacing w:after="80" w:before="140" w:line="300"/>
       </w:pPr>
       <w:r>
@@ -17768,26 +18202,26 @@
           <w:sz w:val="24"/>
           <w:szCs w:val="24"/>
         </w:rPr>
-        <w:t xml:space="preserve">1. Khám sức khỏe trước khi bố trí việc làm; khám sức khỏe định kỳ ít nhất 01 lần/năm.</w:t>
-      </w:r>
-    </w:p>
-    <w:p>
-      <w:pPr>
-        <w:spacing w:after="100" w:line="300"/>
-        <w:ind w:left="360"/>
-        <w:jc w:val="both"/>
-      </w:pPr>
-      <w:r>
-        <w:rPr>
-          <w:rFonts w:ascii="Times New Roman" w:cs="Times New Roman" w:eastAsia="Times New Roman" w:hAnsi="Times New Roman"/>
-          <w:b w:val="false"/>
-          <w:bCs w:val="false"/>
-          <w:i w:val="false"/>
-          <w:iCs w:val="false"/>
-          <w:sz w:val="24"/>
-          <w:szCs w:val="24"/>
-        </w:rPr>
-        <w:t xml:space="preserve">2. Đối với người làm nghề, công việc nặng nhọc, độc hại, nguy hiểm; người lao động là người khuyết tật, người lao động chưa thành niên, người lao động cao tuổi: khám sức khỏe ít nhất 06 tháng/lần.</w:t>
+        <w:t xml:space="preserve">1. Khám sức khỏe trước khi bố trí việc làm; khám sức khỏe định kỳ ít nhất 01 lần/năm. Toàn bộ chi phí khám do Công ty chi trả.</w:t>
+      </w:r>
+    </w:p>
+    <w:p>
+      <w:pPr>
+        <w:spacing w:after="100" w:line="300"/>
+        <w:ind w:left="360"/>
+        <w:jc w:val="both"/>
+      </w:pPr>
+      <w:r>
+        <w:rPr>
+          <w:rFonts w:ascii="Times New Roman" w:cs="Times New Roman" w:eastAsia="Times New Roman" w:hAnsi="Times New Roman"/>
+          <w:b w:val="false"/>
+          <w:bCs w:val="false"/>
+          <w:i w:val="false"/>
+          <w:iCs w:val="false"/>
+          <w:sz w:val="24"/>
+          <w:szCs w:val="24"/>
+        </w:rPr>
+        <w:t xml:space="preserve">2. Đối với người làm nghề, công việc nặng nhọc, độc hại, nguy hiểm; người lao động là người khuyết tật, người lao động cao tuổi: khám sức khỏe ít nhất 06 tháng/lần.</w:t>
       </w:r>
     </w:p>
     <w:p>
@@ -17830,6 +18264,25 @@
     </w:p>
     <w:p>
       <w:pPr>
+        <w:spacing w:after="100" w:line="300"/>
+        <w:ind w:left="360"/>
+        <w:jc w:val="both"/>
+      </w:pPr>
+      <w:r>
+        <w:rPr>
+          <w:rFonts w:ascii="Times New Roman" w:cs="Times New Roman" w:eastAsia="Times New Roman" w:hAnsi="Times New Roman"/>
+          <w:b w:val="false"/>
+          <w:bCs w:val="false"/>
+          <w:i w:val="false"/>
+          <w:iCs w:val="false"/>
+          <w:sz w:val="24"/>
+          <w:szCs w:val="24"/>
+        </w:rPr>
+        <w:t xml:space="preserve">5. Việc khám sức khỏe, xét nghiệm y tế chỉ được thực hiện khi người lao động đã được thông báo nội dung và đồng ý, trừ trường hợp pháp luật yêu cầu để bảo đảm an toàn cho chính người lao động hoặc người khác (ví dụ người lái xe, người làm công việc có yêu cầu nghiêm ngặt về ATVSLĐ). Công ty không yêu cầu xét nghiệm thai, HIV.</w:t>
+      </w:r>
+    </w:p>
+    <w:p>
+      <w:pPr>
         <w:spacing w:after="80" w:before="140" w:line="300"/>
       </w:pPr>
       <w:r>
@@ -17860,6 +18313,25 @@
           <w:szCs w:val="24"/>
         </w:rPr>
         <w:t xml:space="preserve">Công ty trang cấp phương tiện bảo vệ cá nhân phù hợp từng công việc, tối thiểu gồm: quần áo bảo hộ, giày/ủng bảo hộ, mũ bảo hộ, găng tay phù hợp; đối với công việc đặc thù bổ sung: kính/mặt nạ chống hóa chất, mặt nạ phòng độc đúng phin lọc, dây đai an toàn toàn thân, máy đo khí đa chỉ tiêu, thiết bị thở, đèn phòng nổ, nút/chụp tai chống ồn. Người lao động phải sử dụng đúng, đủ và bảo quản phương tiện được cấp.</w:t>
+      </w:r>
+    </w:p>
+    <w:p>
+      <w:pPr>
+        <w:spacing w:after="100" w:line="300"/>
+        <w:ind w:left="360"/>
+        <w:jc w:val="both"/>
+      </w:pPr>
+      <w:r>
+        <w:rPr>
+          <w:rFonts w:ascii="Times New Roman" w:cs="Times New Roman" w:eastAsia="Times New Roman" w:hAnsi="Times New Roman"/>
+          <w:b w:val="false"/>
+          <w:bCs w:val="false"/>
+          <w:i w:val="false"/>
+          <w:iCs w:val="false"/>
+          <w:sz w:val="24"/>
+          <w:szCs w:val="24"/>
+        </w:rPr>
+        <w:t xml:space="preserve">Việc cấp phát được ghi vào sổ cấp phát phương tiện bảo vệ cá nhân có chữ ký người nhận; phương tiện hư hỏng, hết hạn sử dụng được đổi mới. Người lao động không phải trả tiền cho phương tiện bảo vệ cá nhân.</w:t>
       </w:r>
     </w:p>
     <w:p>
@@ -18043,6 +18515,82 @@
     </w:p>
     <w:p>
       <w:pPr>
+        <w:spacing w:after="100" w:line="300"/>
+        <w:ind w:left="360"/>
+        <w:jc w:val="both"/>
+      </w:pPr>
+      <w:r>
+        <w:rPr>
+          <w:rFonts w:ascii="Times New Roman" w:cs="Times New Roman" w:eastAsia="Times New Roman" w:hAnsi="Times New Roman"/>
+          <w:b w:val="false"/>
+          <w:bCs w:val="false"/>
+          <w:i w:val="false"/>
+          <w:iCs w:val="false"/>
+          <w:sz w:val="24"/>
+          <w:szCs w:val="24"/>
+        </w:rPr>
+        <w:t xml:space="preserve">4. Mọi hóa chất tại kho, công trường, trạm vận hành phải có phiếu an toàn hóa chất (SDS) bằng tiếng Việt đặt tại nơi lưu trữ và nơi sử dụng; bao bì, thùng chứa, can chiết phải có nhãn ghi tên hóa chất và cảnh báo nguy hiểm.</w:t>
+      </w:r>
+    </w:p>
+    <w:p>
+      <w:pPr>
+        <w:spacing w:after="100" w:line="300"/>
+        <w:ind w:left="360"/>
+        <w:jc w:val="both"/>
+      </w:pPr>
+      <w:r>
+        <w:rPr>
+          <w:rFonts w:ascii="Times New Roman" w:cs="Times New Roman" w:eastAsia="Times New Roman" w:hAnsi="Times New Roman"/>
+          <w:b w:val="false"/>
+          <w:bCs w:val="false"/>
+          <w:i w:val="false"/>
+          <w:iCs w:val="false"/>
+          <w:sz w:val="24"/>
+          <w:szCs w:val="24"/>
+        </w:rPr>
+        <w:t xml:space="preserve">5. Hóa chất dạng lỏng được đặt trên khay hoặc bờ chống tràn có dung tích đủ chứa lượng rò rỉ; tách riêng axit, kiềm, chất ôxy hóa (như NaOCl); khu vực lưu trữ có vật liệu thấm hút và dụng cụ xử lý tràn đổ.</w:t>
+      </w:r>
+    </w:p>
+    <w:p>
+      <w:pPr>
+        <w:spacing w:after="100" w:line="300"/>
+        <w:ind w:left="360"/>
+        <w:jc w:val="both"/>
+      </w:pPr>
+      <w:r>
+        <w:rPr>
+          <w:rFonts w:ascii="Times New Roman" w:cs="Times New Roman" w:eastAsia="Times New Roman" w:hAnsi="Times New Roman"/>
+          <w:b w:val="false"/>
+          <w:bCs w:val="false"/>
+          <w:i w:val="false"/>
+          <w:iCs w:val="false"/>
+          <w:sz w:val="24"/>
+          <w:szCs w:val="24"/>
+        </w:rPr>
+        <w:t xml:space="preserve">6. Nơi lưu trữ, san chiết, pha hóa chất phải có trạm rửa mắt hoặc vòi nước sạch rửa khẩn cấp trong phạm vi tiếp cận nhanh; tại công trường, trạm của khách hàng phải xác định vị trí trạm rửa mắt gần nhất trước khi làm việc, nếu chưa có thì mang theo bình rửa mắt di động.</w:t>
+      </w:r>
+    </w:p>
+    <w:p>
+      <w:pPr>
+        <w:spacing w:after="100" w:line="300"/>
+        <w:ind w:left="360"/>
+        <w:jc w:val="both"/>
+      </w:pPr>
+      <w:r>
+        <w:rPr>
+          <w:rFonts w:ascii="Times New Roman" w:cs="Times New Roman" w:eastAsia="Times New Roman" w:hAnsi="Times New Roman"/>
+          <w:b w:val="false"/>
+          <w:bCs w:val="false"/>
+          <w:i w:val="false"/>
+          <w:iCs w:val="false"/>
+          <w:sz w:val="24"/>
+          <w:szCs w:val="24"/>
+        </w:rPr>
+        <w:t xml:space="preserve">7. Vận chuyển hóa chất nguy hiểm do đơn vị, phương tiện đủ điều kiện thực hiện, có chằng buộc và phiếu an toàn hóa chất đi kèm. Hóa chất thải, bao bì nhiễm hóa chất và chất thải nguy hại được thu gom, lưu chứa riêng và chuyển giao cho đơn vị có giấy phép xử lý; nghiêm cấm đổ, xả ra môi trường.</w:t>
+      </w:r>
+    </w:p>
+    <w:p>
+      <w:pPr>
         <w:spacing w:after="80" w:before="140" w:line="300"/>
       </w:pPr>
       <w:r>
@@ -18111,6 +18659,279 @@
           <w:szCs w:val="24"/>
         </w:rPr>
         <w:t xml:space="preserve">3. Kiểm định kỹ thuật an toàn đối với máy, thiết bị có yêu cầu nghiêm ngặt trước khi đưa vào sử dụng và định kỳ theo quy định.</w:t>
+      </w:r>
+    </w:p>
+    <w:p>
+      <w:pPr>
+        <w:spacing w:after="80" w:before="140" w:line="300"/>
+      </w:pPr>
+      <w:r>
+        <w:rPr>
+          <w:rFonts w:ascii="Times New Roman" w:cs="Times New Roman" w:eastAsia="Times New Roman" w:hAnsi="Times New Roman"/>
+          <w:b/>
+          <w:bCs/>
+          <w:sz w:val="24"/>
+          <w:szCs w:val="24"/>
+        </w:rPr>
+        <w:t xml:space="preserve">Điều 13. Khóa – treo thẻ khi bảo trì, sửa chữa (LOTO)</w:t>
+      </w:r>
+    </w:p>
+    <w:p>
+      <w:pPr>
+        <w:spacing w:after="100" w:line="300"/>
+        <w:ind w:left="360"/>
+        <w:jc w:val="both"/>
+      </w:pPr>
+      <w:r>
+        <w:rPr>
+          <w:rFonts w:ascii="Times New Roman" w:cs="Times New Roman" w:eastAsia="Times New Roman" w:hAnsi="Times New Roman"/>
+          <w:b w:val="false"/>
+          <w:bCs w:val="false"/>
+          <w:i w:val="false"/>
+          <w:iCs w:val="false"/>
+          <w:sz w:val="24"/>
+          <w:szCs w:val="24"/>
+        </w:rPr>
+        <w:t xml:space="preserve">1. Áp dụng cho mọi công việc bảo trì, sửa chữa, vệ sinh bên trong máy, thiết bị, đường ống, tủ điện có nguồn năng lượng nguy hiểm (điện, áp suất, hóa chất, cơ khí).</w:t>
+      </w:r>
+    </w:p>
+    <w:p>
+      <w:pPr>
+        <w:spacing w:after="100" w:line="300"/>
+        <w:ind w:left="360"/>
+        <w:jc w:val="both"/>
+      </w:pPr>
+      <w:r>
+        <w:rPr>
+          <w:rFonts w:ascii="Times New Roman" w:cs="Times New Roman" w:eastAsia="Times New Roman" w:hAnsi="Times New Roman"/>
+          <w:b w:val="false"/>
+          <w:bCs w:val="false"/>
+          <w:i w:val="false"/>
+          <w:iCs w:val="false"/>
+          <w:sz w:val="24"/>
+          <w:szCs w:val="24"/>
+        </w:rPr>
+        <w:t xml:space="preserve">2. Trình tự: thông báo cho người vận hành và người liên quan; dừng máy; cô lập mọi nguồn năng lượng (ngắt cầu dao, đóng van); gắn khóa cá nhân và thẻ cảnh báo ghi tên người thực hiện, ngày giờ; xả năng lượng tồn dư; thử xác nhận không còn năng lượng rồi mới làm việc.</w:t>
+      </w:r>
+    </w:p>
+    <w:p>
+      <w:pPr>
+        <w:spacing w:after="100" w:line="300"/>
+        <w:ind w:left="360"/>
+        <w:jc w:val="both"/>
+      </w:pPr>
+      <w:r>
+        <w:rPr>
+          <w:rFonts w:ascii="Times New Roman" w:cs="Times New Roman" w:eastAsia="Times New Roman" w:hAnsi="Times New Roman"/>
+          <w:b w:val="false"/>
+          <w:bCs w:val="false"/>
+          <w:i w:val="false"/>
+          <w:iCs w:val="false"/>
+          <w:sz w:val="24"/>
+          <w:szCs w:val="24"/>
+        </w:rPr>
+        <w:t xml:space="preserve">3. Mỗi người làm việc gắn một khóa riêng và tự giữ chìa; chỉ người gắn mới được tháo khóa, thẻ của mình. Trước khi đóng điện, mở van trở lại phải kiểm tra đủ người, dụng cụ đã ra khỏi vùng nguy hiểm và che chắn đã lắp lại.</w:t>
+      </w:r>
+    </w:p>
+    <w:p>
+      <w:pPr>
+        <w:spacing w:after="100" w:line="300"/>
+        <w:ind w:left="360"/>
+        <w:jc w:val="both"/>
+      </w:pPr>
+      <w:r>
+        <w:rPr>
+          <w:rFonts w:ascii="Times New Roman" w:cs="Times New Roman" w:eastAsia="Times New Roman" w:hAnsi="Times New Roman"/>
+          <w:b w:val="false"/>
+          <w:bCs w:val="false"/>
+          <w:i w:val="false"/>
+          <w:iCs w:val="false"/>
+          <w:sz w:val="24"/>
+          <w:szCs w:val="24"/>
+        </w:rPr>
+        <w:t xml:space="preserve">4. Tại nhà máy của khách hàng, áp dụng quy trình khóa – treo thẻ của khách hàng nếu chặt chẽ hơn.</w:t>
+      </w:r>
+    </w:p>
+    <w:p>
+      <w:pPr>
+        <w:spacing w:after="80" w:before="140" w:line="300"/>
+      </w:pPr>
+      <w:r>
+        <w:rPr>
+          <w:rFonts w:ascii="Times New Roman" w:cs="Times New Roman" w:eastAsia="Times New Roman" w:hAnsi="Times New Roman"/>
+          <w:b/>
+          <w:bCs/>
+          <w:sz w:val="24"/>
+          <w:szCs w:val="24"/>
+        </w:rPr>
+        <w:t xml:space="preserve">Điều 14. Công việc nóng và vận hành thiết bị đặc biệt</w:t>
+      </w:r>
+    </w:p>
+    <w:p>
+      <w:pPr>
+        <w:spacing w:after="100" w:line="300"/>
+        <w:ind w:left="360"/>
+        <w:jc w:val="both"/>
+      </w:pPr>
+      <w:r>
+        <w:rPr>
+          <w:rFonts w:ascii="Times New Roman" w:cs="Times New Roman" w:eastAsia="Times New Roman" w:hAnsi="Times New Roman"/>
+          <w:b w:val="false"/>
+          <w:bCs w:val="false"/>
+          <w:i w:val="false"/>
+          <w:iCs w:val="false"/>
+          <w:sz w:val="24"/>
+          <w:szCs w:val="24"/>
+        </w:rPr>
+        <w:t xml:space="preserve">1. Hàn, cắt, mài phát tia lửa (công việc nóng) chỉ được thực hiện khi có giấy phép làm việc nóng được duyệt: đã dọn hoặc che chắn vật liệu dễ cháy trong bán kính 10 m, có bình chữa cháy tại chỗ, có người canh lửa trong khi làm và ít nhất 30 phút sau khi kết thúc.</w:t>
+      </w:r>
+    </w:p>
+    <w:p>
+      <w:pPr>
+        <w:spacing w:after="100" w:line="300"/>
+        <w:ind w:left="360"/>
+        <w:jc w:val="both"/>
+      </w:pPr>
+      <w:r>
+        <w:rPr>
+          <w:rFonts w:ascii="Times New Roman" w:cs="Times New Roman" w:eastAsia="Times New Roman" w:hAnsi="Times New Roman"/>
+          <w:b w:val="false"/>
+          <w:bCs w:val="false"/>
+          <w:i w:val="false"/>
+          <w:iCs w:val="false"/>
+          <w:sz w:val="24"/>
+          <w:szCs w:val="24"/>
+        </w:rPr>
+        <w:t xml:space="preserve">2. Xe nâng, thiết bị nâng, thang nâng hàng, bình chịu áp lực, máy nén khí chỉ do người có chứng chỉ, thẻ an toàn phù hợp vận hành; người vận hành kiểm tra thiết bị trước mỗi ca và không vận hành khi phát hiện hư hỏng.</w:t>
+      </w:r>
+    </w:p>
+    <w:p>
+      <w:pPr>
+        <w:spacing w:after="100" w:line="300"/>
+        <w:ind w:left="360"/>
+        <w:jc w:val="both"/>
+      </w:pPr>
+      <w:r>
+        <w:rPr>
+          <w:rFonts w:ascii="Times New Roman" w:cs="Times New Roman" w:eastAsia="Times New Roman" w:hAnsi="Times New Roman"/>
+          <w:b w:val="false"/>
+          <w:bCs w:val="false"/>
+          <w:i w:val="false"/>
+          <w:iCs w:val="false"/>
+          <w:sz w:val="24"/>
+          <w:szCs w:val="24"/>
+        </w:rPr>
+        <w:t xml:space="preserve">3. Công việc về điện chỉ do thợ điện có thẻ an toàn điện thực hiện; nghiêm cấm đấu nối tạm không qua thiết bị bảo vệ, sửa chữa khi chưa cắt điện và khóa – treo thẻ.</w:t>
+      </w:r>
+    </w:p>
+    <w:p>
+      <w:pPr>
+        <w:spacing w:after="100" w:line="300"/>
+        <w:ind w:left="360"/>
+        <w:jc w:val="both"/>
+      </w:pPr>
+      <w:r>
+        <w:rPr>
+          <w:rFonts w:ascii="Times New Roman" w:cs="Times New Roman" w:eastAsia="Times New Roman" w:hAnsi="Times New Roman"/>
+          <w:b w:val="false"/>
+          <w:bCs w:val="false"/>
+          <w:i w:val="false"/>
+          <w:iCs w:val="false"/>
+          <w:sz w:val="24"/>
+          <w:szCs w:val="24"/>
+        </w:rPr>
+        <w:t xml:space="preserve">4. Người lái xe của Công ty phải có giấy phép lái xe phù hợp; không sử dụng rượu bia, chất kích thích khi điều khiển phương tiện.</w:t>
+      </w:r>
+    </w:p>
+    <w:p>
+      <w:pPr>
+        <w:spacing w:after="80" w:before="140" w:line="300"/>
+      </w:pPr>
+      <w:r>
+        <w:rPr>
+          <w:rFonts w:ascii="Times New Roman" w:cs="Times New Roman" w:eastAsia="Times New Roman" w:hAnsi="Times New Roman"/>
+          <w:b/>
+          <w:bCs/>
+          <w:sz w:val="24"/>
+          <w:szCs w:val="24"/>
+        </w:rPr>
+        <w:t xml:space="preserve">Điều 15. Máy móc, thiết bị và hệ thống điện</w:t>
+      </w:r>
+    </w:p>
+    <w:p>
+      <w:pPr>
+        <w:spacing w:after="100" w:line="300"/>
+        <w:ind w:left="360"/>
+        <w:jc w:val="both"/>
+      </w:pPr>
+      <w:r>
+        <w:rPr>
+          <w:rFonts w:ascii="Times New Roman" w:cs="Times New Roman" w:eastAsia="Times New Roman" w:hAnsi="Times New Roman"/>
+          <w:b w:val="false"/>
+          <w:bCs w:val="false"/>
+          <w:i w:val="false"/>
+          <w:iCs w:val="false"/>
+          <w:sz w:val="24"/>
+          <w:szCs w:val="24"/>
+        </w:rPr>
+        <w:t xml:space="preserve">1. Các bộ phận chuyển động, truyền động (đai, khớp nối, cánh quạt, trục bơm) và bộ phận nguy hiểm của máy, thiết bị phải có che chắn an toàn; nghiêm cấm tháo bỏ che chắn hoặc vận hành khi thiếu che chắn.</w:t>
+      </w:r>
+    </w:p>
+    <w:p>
+      <w:pPr>
+        <w:spacing w:after="100" w:line="300"/>
+        <w:ind w:left="360"/>
+        <w:jc w:val="both"/>
+      </w:pPr>
+      <w:r>
+        <w:rPr>
+          <w:rFonts w:ascii="Times New Roman" w:cs="Times New Roman" w:eastAsia="Times New Roman" w:hAnsi="Times New Roman"/>
+          <w:b w:val="false"/>
+          <w:bCs w:val="false"/>
+          <w:i w:val="false"/>
+          <w:iCs w:val="false"/>
+          <w:sz w:val="24"/>
+          <w:szCs w:val="24"/>
+        </w:rPr>
+        <w:t xml:space="preserve">2. Máy móc, thiết bị, dụng cụ cầm tay được kiểm tra trước khi sử dụng và bảo trì định kỳ theo hướng dẫn của nhà sản xuất, ít nhất 06 tháng một lần; kết quả ghi vào sổ bảo trì thiết bị. Thiết bị hư hỏng được gắn thẻ «Không sử dụng» cho đến khi sửa xong.</w:t>
+      </w:r>
+    </w:p>
+    <w:p>
+      <w:pPr>
+        <w:spacing w:after="100" w:line="300"/>
+        <w:ind w:left="360"/>
+        <w:jc w:val="both"/>
+      </w:pPr>
+      <w:r>
+        <w:rPr>
+          <w:rFonts w:ascii="Times New Roman" w:cs="Times New Roman" w:eastAsia="Times New Roman" w:hAnsi="Times New Roman"/>
+          <w:b w:val="false"/>
+          <w:bCs w:val="false"/>
+          <w:i w:val="false"/>
+          <w:iCs w:val="false"/>
+          <w:sz w:val="24"/>
+          <w:szCs w:val="24"/>
+        </w:rPr>
+        <w:t xml:space="preserve">3. Hệ thống điện tại văn phòng, kho (tủ điện, dây dẫn, ổ cắm, thiết bị chống giật) được kiểm tra ít nhất 01 lần/năm và sau mỗi sự cố, có biên bản; tại công trường kiểm tra trước khi đấu nối và định kỳ hằng tuần.</w:t>
+      </w:r>
+    </w:p>
+    <w:p>
+      <w:pPr>
+        <w:spacing w:after="100" w:line="300"/>
+        <w:ind w:left="360"/>
+        <w:jc w:val="both"/>
+      </w:pPr>
+      <w:r>
+        <w:rPr>
+          <w:rFonts w:ascii="Times New Roman" w:cs="Times New Roman" w:eastAsia="Times New Roman" w:hAnsi="Times New Roman"/>
+          <w:b w:val="false"/>
+          <w:bCs w:val="false"/>
+          <w:i w:val="false"/>
+          <w:iCs w:val="false"/>
+          <w:sz w:val="24"/>
+          <w:szCs w:val="24"/>
+        </w:rPr>
+        <w:t xml:space="preserve">4. Dụng cụ điện cầm tay, dây nối dài sử dụng ngoài trời hoặc nơi ẩm ướt phải được cấp nguồn qua thiết bị chống dòng rò.</w:t>
       </w:r>
     </w:p>
     <w:p>
@@ -18126,7 +18947,7 @@
           <w:sz w:val="26"/>
           <w:szCs w:val="26"/>
         </w:rPr>
-        <w:t xml:space="preserve">CHƯƠNG V — SỰ CỐ, TAI NẠN LAO ĐỘNG VÀ CHẾ ĐỘ</w:t>
+        <w:t xml:space="preserve">CHƯƠNG V — KHÁCH ĐẾN LÀM VIỆC, NGƯỜI LAO ĐỘNG CẦN BẢO VỆ ĐẶC BIỆT, SƠ CỨU</w:t>
       </w:r>
     </w:p>
     <w:p>
@@ -18141,64 +18962,64 @@
           <w:sz w:val="24"/>
           <w:szCs w:val="24"/>
         </w:rPr>
-        <w:t xml:space="preserve">Điều 13. Khai báo, sơ cứu, cấp cứu</w:t>
-      </w:r>
-    </w:p>
-    <w:p>
-      <w:pPr>
-        <w:spacing w:after="100" w:line="300"/>
-        <w:ind w:left="360"/>
-        <w:jc w:val="both"/>
-      </w:pPr>
-      <w:r>
-        <w:rPr>
-          <w:rFonts w:ascii="Times New Roman" w:cs="Times New Roman" w:eastAsia="Times New Roman" w:hAnsi="Times New Roman"/>
-          <w:b w:val="false"/>
-          <w:bCs w:val="false"/>
-          <w:i w:val="false"/>
-          <w:iCs w:val="false"/>
-          <w:sz w:val="24"/>
-          <w:szCs w:val="24"/>
-        </w:rPr>
-        <w:t xml:space="preserve">1. Khi xảy ra tai nạn lao động, sự cố: người phát hiện báo ngay người quản lý trực tiếp; tổ chức sơ cứu, cấp cứu và đưa nạn nhân đến cơ sở y tế.</w:t>
-      </w:r>
-    </w:p>
-    <w:p>
-      <w:pPr>
-        <w:spacing w:after="100" w:line="300"/>
-        <w:ind w:left="360"/>
-        <w:jc w:val="both"/>
-      </w:pPr>
-      <w:r>
-        <w:rPr>
-          <w:rFonts w:ascii="Times New Roman" w:cs="Times New Roman" w:eastAsia="Times New Roman" w:hAnsi="Times New Roman"/>
-          <w:b w:val="false"/>
-          <w:bCs w:val="false"/>
-          <w:i w:val="false"/>
-          <w:iCs w:val="false"/>
-          <w:sz w:val="24"/>
-          <w:szCs w:val="24"/>
-        </w:rPr>
-        <w:t xml:space="preserve">2. Giữ nguyên hiện trường vụ tai nạn lao động chết người, tai nạn nặng, trừ trường hợp cấp cứu nạn nhân hoặc ngăn ngừa nguy cơ tiếp diễn.</w:t>
-      </w:r>
-    </w:p>
-    <w:p>
-      <w:pPr>
-        <w:spacing w:after="100" w:line="300"/>
-        <w:ind w:left="360"/>
-        <w:jc w:val="both"/>
-      </w:pPr>
-      <w:r>
-        <w:rPr>
-          <w:rFonts w:ascii="Times New Roman" w:cs="Times New Roman" w:eastAsia="Times New Roman" w:hAnsi="Times New Roman"/>
-          <w:b w:val="false"/>
-          <w:bCs w:val="false"/>
-          <w:i w:val="false"/>
-          <w:iCs w:val="false"/>
-          <w:sz w:val="24"/>
-          <w:szCs w:val="24"/>
-        </w:rPr>
-        <w:t xml:space="preserve">3. Khai báo tai nạn lao động, sự cố kỹ thuật gây mất an toàn với cơ quan có thẩm quyền theo quy định.</w:t>
+        <w:t xml:space="preserve">Điều 16. An toàn cho khách và người ngoài Công ty</w:t>
+      </w:r>
+    </w:p>
+    <w:p>
+      <w:pPr>
+        <w:spacing w:after="100" w:line="300"/>
+        <w:ind w:left="360"/>
+        <w:jc w:val="both"/>
+      </w:pPr>
+      <w:r>
+        <w:rPr>
+          <w:rFonts w:ascii="Times New Roman" w:cs="Times New Roman" w:eastAsia="Times New Roman" w:hAnsi="Times New Roman"/>
+          <w:b w:val="false"/>
+          <w:bCs w:val="false"/>
+          <w:i w:val="false"/>
+          <w:iCs w:val="false"/>
+          <w:sz w:val="24"/>
+          <w:szCs w:val="24"/>
+        </w:rPr>
+        <w:t xml:space="preserve">1. Khách, đại diện khách hàng, nhà thầu khi vào kho, xưởng, công trường, trạm vận hành của Công ty phải được phổ biến an toàn trước khi vào: mối nguy chính, khu vực không được vào, lối thoát nạn, điểm tập kết và người liên hệ khi có sự cố; việc phổ biến được ghi vào sổ khách có chữ ký.</w:t>
+      </w:r>
+    </w:p>
+    <w:p>
+      <w:pPr>
+        <w:spacing w:after="100" w:line="300"/>
+        <w:ind w:left="360"/>
+        <w:jc w:val="both"/>
+      </w:pPr>
+      <w:r>
+        <w:rPr>
+          <w:rFonts w:ascii="Times New Roman" w:cs="Times New Roman" w:eastAsia="Times New Roman" w:hAnsi="Times New Roman"/>
+          <w:b w:val="false"/>
+          <w:bCs w:val="false"/>
+          <w:i w:val="false"/>
+          <w:iCs w:val="false"/>
+          <w:sz w:val="24"/>
+          <w:szCs w:val="24"/>
+        </w:rPr>
+        <w:t xml:space="preserve">2. Công ty cấp cho khách phương tiện bảo vệ cá nhân phù hợp với khu vực (tối thiểu mũ, giày hoặc bọc giày bảo hộ; kính bảo hộ khi vào khu vực hóa chất) và cử người đi cùng trong suốt thời gian khách có mặt.</w:t>
+      </w:r>
+    </w:p>
+    <w:p>
+      <w:pPr>
+        <w:spacing w:after="100" w:line="300"/>
+        <w:ind w:left="360"/>
+        <w:jc w:val="both"/>
+      </w:pPr>
+      <w:r>
+        <w:rPr>
+          <w:rFonts w:ascii="Times New Roman" w:cs="Times New Roman" w:eastAsia="Times New Roman" w:hAnsi="Times New Roman"/>
+          <w:b w:val="false"/>
+          <w:bCs w:val="false"/>
+          <w:i w:val="false"/>
+          <w:iCs w:val="false"/>
+          <w:sz w:val="24"/>
+          <w:szCs w:val="24"/>
+        </w:rPr>
+        <w:t xml:space="preserve">3. Tại nhà máy của khách hàng, người lao động của Công ty tham gia đầy đủ buổi phổ biến an toàn của khách hàng trước khi làm việc.</w:t>
       </w:r>
     </w:p>
     <w:p>
@@ -18213,26 +19034,64 @@
           <w:sz w:val="24"/>
           <w:szCs w:val="24"/>
         </w:rPr>
-        <w:t xml:space="preserve">Điều 14. Điều tra, thống kê, báo cáo</w:t>
-      </w:r>
-    </w:p>
-    <w:p>
-      <w:pPr>
-        <w:spacing w:after="100" w:line="300"/>
-        <w:ind w:left="360"/>
-        <w:jc w:val="both"/>
-      </w:pPr>
-      <w:r>
-        <w:rPr>
-          <w:rFonts w:ascii="Times New Roman" w:cs="Times New Roman" w:eastAsia="Times New Roman" w:hAnsi="Times New Roman"/>
-          <w:b w:val="false"/>
-          <w:bCs w:val="false"/>
-          <w:i w:val="false"/>
-          <w:iCs w:val="false"/>
-          <w:sz w:val="24"/>
-          <w:szCs w:val="24"/>
-        </w:rPr>
-        <w:t xml:space="preserve">Công ty thành lập đoàn điều tra tai nạn lao động theo quy định; thống kê, lập hồ sơ và báo cáo định kỳ về công tác ATVSLĐ và tình hình tai nạn lao động.</w:t>
+        <w:t xml:space="preserve">Điều 17. Bảo vệ người lao động có nguy cơ sức khỏe cao</w:t>
+      </w:r>
+    </w:p>
+    <w:p>
+      <w:pPr>
+        <w:spacing w:after="100" w:line="300"/>
+        <w:ind w:left="360"/>
+        <w:jc w:val="both"/>
+      </w:pPr>
+      <w:r>
+        <w:rPr>
+          <w:rFonts w:ascii="Times New Roman" w:cs="Times New Roman" w:eastAsia="Times New Roman" w:hAnsi="Times New Roman"/>
+          <w:b w:val="false"/>
+          <w:bCs w:val="false"/>
+          <w:i w:val="false"/>
+          <w:iCs w:val="false"/>
+          <w:sz w:val="24"/>
+          <w:szCs w:val="24"/>
+        </w:rPr>
+        <w:t xml:space="preserve">1. Không bố trí lao động nữ mang thai hoặc đang nuôi con dưới 12 tháng tuổi làm công việc tiếp xúc hóa chất độc hại, làm việc trong không gian hạn chế, trên cao, làm ban đêm, làm thêm giờ hoặc đi công tác xa, trừ trường hợp pháp luật cho phép và người lao động đồng ý.</w:t>
+      </w:r>
+    </w:p>
+    <w:p>
+      <w:pPr>
+        <w:spacing w:after="100" w:line="300"/>
+        <w:ind w:left="360"/>
+        <w:jc w:val="both"/>
+      </w:pPr>
+      <w:r>
+        <w:rPr>
+          <w:rFonts w:ascii="Times New Roman" w:cs="Times New Roman" w:eastAsia="Times New Roman" w:hAnsi="Times New Roman"/>
+          <w:b w:val="false"/>
+          <w:bCs w:val="false"/>
+          <w:i w:val="false"/>
+          <w:iCs w:val="false"/>
+          <w:sz w:val="24"/>
+          <w:szCs w:val="24"/>
+        </w:rPr>
+        <w:t xml:space="preserve">2. Người lao động cao tuổi, người khuyết tật, người có bệnh lý tim mạch, hô hấp, động kinh hoặc bệnh lý khác theo kết luận khám sức khỏe không được bố trí làm việc trong không gian hạn chế, trên cao, tiếp xúc hóa chất độc hại hoặc công việc có yêu cầu nghiêm ngặt về ATVSLĐ không phù hợp với sức khỏe.</w:t>
+      </w:r>
+    </w:p>
+    <w:p>
+      <w:pPr>
+        <w:spacing w:after="100" w:line="300"/>
+        <w:ind w:left="360"/>
+        <w:jc w:val="both"/>
+      </w:pPr>
+      <w:r>
+        <w:rPr>
+          <w:rFonts w:ascii="Times New Roman" w:cs="Times New Roman" w:eastAsia="Times New Roman" w:hAnsi="Times New Roman"/>
+          <w:b w:val="false"/>
+          <w:bCs w:val="false"/>
+          <w:i w:val="false"/>
+          <w:iCs w:val="false"/>
+          <w:sz w:val="24"/>
+          <w:szCs w:val="24"/>
+        </w:rPr>
+        <w:t xml:space="preserve">3. Người lao động có quyền thông báo tình trạng sức khỏe để được bố trí công việc phù hợp; thông tin sức khỏe được bảo mật.</w:t>
       </w:r>
     </w:p>
     <w:p>
@@ -18247,26 +19106,64 @@
           <w:sz w:val="24"/>
           <w:szCs w:val="24"/>
         </w:rPr>
-        <w:t xml:space="preserve">Điều 15. Chế độ đối với người bị tai nạn lao động, bệnh nghề nghiệp</w:t>
-      </w:r>
-    </w:p>
-    <w:p>
-      <w:pPr>
-        <w:spacing w:after="100" w:line="300"/>
-        <w:ind w:left="360"/>
-        <w:jc w:val="both"/>
-      </w:pPr>
-      <w:r>
-        <w:rPr>
-          <w:rFonts w:ascii="Times New Roman" w:cs="Times New Roman" w:eastAsia="Times New Roman" w:hAnsi="Times New Roman"/>
-          <w:b w:val="false"/>
-          <w:bCs w:val="false"/>
-          <w:i w:val="false"/>
-          <w:iCs w:val="false"/>
-          <w:sz w:val="24"/>
-          <w:szCs w:val="24"/>
-        </w:rPr>
-        <w:t xml:space="preserve">Người lao động bị tai nạn lao động, bệnh nghề nghiệp được hưởng đầy đủ chế độ theo Luật An toàn, vệ sinh lao động và pháp luật về bảo hiểm xã hội; Công ty chịu trách nhiệm bồi thường, trợ cấp theo quy định.</w:t>
+        <w:t xml:space="preserve">Điều 18. Tủ, túi sơ cứu</w:t>
+      </w:r>
+    </w:p>
+    <w:p>
+      <w:pPr>
+        <w:spacing w:after="100" w:line="300"/>
+        <w:ind w:left="360"/>
+        <w:jc w:val="both"/>
+      </w:pPr>
+      <w:r>
+        <w:rPr>
+          <w:rFonts w:ascii="Times New Roman" w:cs="Times New Roman" w:eastAsia="Times New Roman" w:hAnsi="Times New Roman"/>
+          <w:b w:val="false"/>
+          <w:bCs w:val="false"/>
+          <w:i w:val="false"/>
+          <w:iCs w:val="false"/>
+          <w:sz w:val="24"/>
+          <w:szCs w:val="24"/>
+        </w:rPr>
+        <w:t xml:space="preserve">1. Văn phòng, kho và mỗi công trường, trạm vận hành có ít nhất 01 tủ hoặc túi sơ cứu đặt nơi dễ thấy, dễ lấy; số lượng và loại túi theo quy định của Bộ Y tế tương ứng với số người lao động tại địa điểm đó.</w:t>
+      </w:r>
+    </w:p>
+    <w:p>
+      <w:pPr>
+        <w:spacing w:after="100" w:line="300"/>
+        <w:ind w:left="360"/>
+        <w:jc w:val="both"/>
+      </w:pPr>
+      <w:r>
+        <w:rPr>
+          <w:rFonts w:ascii="Times New Roman" w:cs="Times New Roman" w:eastAsia="Times New Roman" w:hAnsi="Times New Roman"/>
+          <w:b w:val="false"/>
+          <w:bCs w:val="false"/>
+          <w:i w:val="false"/>
+          <w:iCs w:val="false"/>
+          <w:sz w:val="24"/>
+          <w:szCs w:val="24"/>
+        </w:rPr>
+        <w:t xml:space="preserve">2. Túi sơ cứu có đủ vật tư cơ bản: băng, gạc vô trùng, băng dính, kéo, găng tay y tế, dung dịch sát khuẩn, nước muối rửa mắt; người được phân công kiểm tra, bổ sung hằng tháng và ghi sổ.</w:t>
+      </w:r>
+    </w:p>
+    <w:p>
+      <w:pPr>
+        <w:spacing w:after="100" w:line="300"/>
+        <w:ind w:left="360"/>
+        <w:jc w:val="both"/>
+      </w:pPr>
+      <w:r>
+        <w:rPr>
+          <w:rFonts w:ascii="Times New Roman" w:cs="Times New Roman" w:eastAsia="Times New Roman" w:hAnsi="Times New Roman"/>
+          <w:b w:val="false"/>
+          <w:bCs w:val="false"/>
+          <w:i w:val="false"/>
+          <w:iCs w:val="false"/>
+          <w:sz w:val="24"/>
+          <w:szCs w:val="24"/>
+        </w:rPr>
+        <w:t xml:space="preserve">3. Tại mỗi địa điểm làm việc có ít nhất một người đã được huấn luyện sơ cứu, cấp cứu; số điện thoại cấp cứu 115 và cơ sở y tế gần nhất được niêm yết cạnh túi sơ cứu.</w:t>
       </w:r>
     </w:p>
     <w:p>
@@ -18282,7 +19179,7 @@
           <w:sz w:val="26"/>
           <w:szCs w:val="26"/>
         </w:rPr>
-        <w:t xml:space="preserve">CHƯƠNG VI — KIỂM TRA, XỬ LÝ VI PHẠM VÀ ĐIỀU KHOẢN THI HÀNH</w:t>
+        <w:t xml:space="preserve">CHƯƠNG VI — SỰ CỐ, TAI NẠN LAO ĐỘNG VÀ CHẾ ĐỘ</w:t>
       </w:r>
     </w:p>
     <w:p>
@@ -18297,26 +19194,220 @@
           <w:sz w:val="24"/>
           <w:szCs w:val="24"/>
         </w:rPr>
-        <w:t xml:space="preserve">Điều 16. Kiểm tra, khen thưởng và xử lý vi phạm</w:t>
-      </w:r>
-    </w:p>
-    <w:p>
-      <w:pPr>
-        <w:spacing w:after="100" w:line="300"/>
-        <w:ind w:left="360"/>
-        <w:jc w:val="both"/>
-      </w:pPr>
-      <w:r>
-        <w:rPr>
-          <w:rFonts w:ascii="Times New Roman" w:cs="Times New Roman" w:eastAsia="Times New Roman" w:hAnsi="Times New Roman"/>
-          <w:b w:val="false"/>
-          <w:bCs w:val="false"/>
-          <w:i w:val="false"/>
-          <w:iCs w:val="false"/>
-          <w:sz w:val="24"/>
-          <w:szCs w:val="24"/>
-        </w:rPr>
-        <w:t xml:space="preserve">1. Công ty tổ chức tự kiểm tra ATVSLĐ định kỳ và đột xuất.</w:t>
+        <w:t xml:space="preserve">Điều 19. Khai báo, sơ cứu, cấp cứu</w:t>
+      </w:r>
+    </w:p>
+    <w:p>
+      <w:pPr>
+        <w:spacing w:after="100" w:line="300"/>
+        <w:ind w:left="360"/>
+        <w:jc w:val="both"/>
+      </w:pPr>
+      <w:r>
+        <w:rPr>
+          <w:rFonts w:ascii="Times New Roman" w:cs="Times New Roman" w:eastAsia="Times New Roman" w:hAnsi="Times New Roman"/>
+          <w:b w:val="false"/>
+          <w:bCs w:val="false"/>
+          <w:i w:val="false"/>
+          <w:iCs w:val="false"/>
+          <w:sz w:val="24"/>
+          <w:szCs w:val="24"/>
+        </w:rPr>
+        <w:t xml:space="preserve">1. Khi xảy ra tai nạn lao động, sự cố: người phát hiện báo ngay người quản lý trực tiếp; tổ chức sơ cứu, cấp cứu và đưa nạn nhân đến cơ sở y tế.</w:t>
+      </w:r>
+    </w:p>
+    <w:p>
+      <w:pPr>
+        <w:spacing w:after="100" w:line="300"/>
+        <w:ind w:left="360"/>
+        <w:jc w:val="both"/>
+      </w:pPr>
+      <w:r>
+        <w:rPr>
+          <w:rFonts w:ascii="Times New Roman" w:cs="Times New Roman" w:eastAsia="Times New Roman" w:hAnsi="Times New Roman"/>
+          <w:b w:val="false"/>
+          <w:bCs w:val="false"/>
+          <w:i w:val="false"/>
+          <w:iCs w:val="false"/>
+          <w:sz w:val="24"/>
+          <w:szCs w:val="24"/>
+        </w:rPr>
+        <w:t xml:space="preserve">2. Giữ nguyên hiện trường vụ tai nạn lao động chết người, tai nạn nặng, trừ trường hợp cấp cứu nạn nhân hoặc ngăn ngừa nguy cơ tiếp diễn.</w:t>
+      </w:r>
+    </w:p>
+    <w:p>
+      <w:pPr>
+        <w:spacing w:after="100" w:line="300"/>
+        <w:ind w:left="360"/>
+        <w:jc w:val="both"/>
+      </w:pPr>
+      <w:r>
+        <w:rPr>
+          <w:rFonts w:ascii="Times New Roman" w:cs="Times New Roman" w:eastAsia="Times New Roman" w:hAnsi="Times New Roman"/>
+          <w:b w:val="false"/>
+          <w:bCs w:val="false"/>
+          <w:i w:val="false"/>
+          <w:iCs w:val="false"/>
+          <w:sz w:val="24"/>
+          <w:szCs w:val="24"/>
+        </w:rPr>
+        <w:t xml:space="preserve">3. Khai báo tai nạn lao động, sự cố kỹ thuật gây mất an toàn với cơ quan có thẩm quyền theo quy định.</w:t>
+      </w:r>
+    </w:p>
+    <w:p>
+      <w:pPr>
+        <w:spacing w:after="80" w:before="140" w:line="300"/>
+      </w:pPr>
+      <w:r>
+        <w:rPr>
+          <w:rFonts w:ascii="Times New Roman" w:cs="Times New Roman" w:eastAsia="Times New Roman" w:hAnsi="Times New Roman"/>
+          <w:b/>
+          <w:bCs/>
+          <w:sz w:val="24"/>
+          <w:szCs w:val="24"/>
+        </w:rPr>
+        <w:t xml:space="preserve">Điều 20. Điều tra, thống kê, báo cáo</w:t>
+      </w:r>
+    </w:p>
+    <w:p>
+      <w:pPr>
+        <w:spacing w:after="100" w:line="300"/>
+        <w:ind w:left="360"/>
+        <w:jc w:val="both"/>
+      </w:pPr>
+      <w:r>
+        <w:rPr>
+          <w:rFonts w:ascii="Times New Roman" w:cs="Times New Roman" w:eastAsia="Times New Roman" w:hAnsi="Times New Roman"/>
+          <w:b w:val="false"/>
+          <w:bCs w:val="false"/>
+          <w:i w:val="false"/>
+          <w:iCs w:val="false"/>
+          <w:sz w:val="24"/>
+          <w:szCs w:val="24"/>
+        </w:rPr>
+        <w:t xml:space="preserve">Công ty thành lập đoàn điều tra tai nạn lao động theo quy định; thống kê, lập hồ sơ và báo cáo định kỳ về công tác ATVSLĐ và tình hình tai nạn lao động.</w:t>
+      </w:r>
+    </w:p>
+    <w:p>
+      <w:pPr>
+        <w:spacing w:after="100" w:line="300"/>
+        <w:ind w:left="360"/>
+        <w:jc w:val="both"/>
+      </w:pPr>
+      <w:r>
+        <w:rPr>
+          <w:rFonts w:ascii="Times New Roman" w:cs="Times New Roman" w:eastAsia="Times New Roman" w:hAnsi="Times New Roman"/>
+          <w:b w:val="false"/>
+          <w:bCs w:val="false"/>
+          <w:i w:val="false"/>
+          <w:iCs w:val="false"/>
+          <w:sz w:val="24"/>
+          <w:szCs w:val="24"/>
+        </w:rPr>
+        <w:t xml:space="preserve">Mọi tai nạn lao động, sự cố kỹ thuật và sự cố suýt xảy ra đều được ghi vào sổ theo dõi và điều tra để xác định nguyên nhân gốc rễ (con người, thiết bị, quy trình, môi trường làm việc), không chỉ nguyên nhân trực tiếp.</w:t>
+      </w:r>
+    </w:p>
+    <w:p>
+      <w:pPr>
+        <w:spacing w:after="100" w:line="300"/>
+        <w:ind w:left="360"/>
+        <w:jc w:val="both"/>
+      </w:pPr>
+      <w:r>
+        <w:rPr>
+          <w:rFonts w:ascii="Times New Roman" w:cs="Times New Roman" w:eastAsia="Times New Roman" w:hAnsi="Times New Roman"/>
+          <w:b w:val="false"/>
+          <w:bCs w:val="false"/>
+          <w:i w:val="false"/>
+          <w:iCs w:val="false"/>
+          <w:sz w:val="24"/>
+          <w:szCs w:val="24"/>
+        </w:rPr>
+        <w:t xml:space="preserve">Sau điều tra, Công ty đề ra hành động khắc phục và phòng ngừa tái diễn, phân công người thực hiện và thời hạn, theo dõi đến khi hoàn thành; kết quả được phổ biến cho các bộ phận, công trường có nguy cơ tương tự.</w:t>
+      </w:r>
+    </w:p>
+    <w:p>
+      <w:pPr>
+        <w:spacing w:after="80" w:before="140" w:line="300"/>
+      </w:pPr>
+      <w:r>
+        <w:rPr>
+          <w:rFonts w:ascii="Times New Roman" w:cs="Times New Roman" w:eastAsia="Times New Roman" w:hAnsi="Times New Roman"/>
+          <w:b/>
+          <w:bCs/>
+          <w:sz w:val="24"/>
+          <w:szCs w:val="24"/>
+        </w:rPr>
+        <w:t xml:space="preserve">Điều 21. Chế độ đối với người bị tai nạn lao động, bệnh nghề nghiệp</w:t>
+      </w:r>
+    </w:p>
+    <w:p>
+      <w:pPr>
+        <w:spacing w:after="100" w:line="300"/>
+        <w:ind w:left="360"/>
+        <w:jc w:val="both"/>
+      </w:pPr>
+      <w:r>
+        <w:rPr>
+          <w:rFonts w:ascii="Times New Roman" w:cs="Times New Roman" w:eastAsia="Times New Roman" w:hAnsi="Times New Roman"/>
+          <w:b w:val="false"/>
+          <w:bCs w:val="false"/>
+          <w:i w:val="false"/>
+          <w:iCs w:val="false"/>
+          <w:sz w:val="24"/>
+          <w:szCs w:val="24"/>
+        </w:rPr>
+        <w:t xml:space="preserve">Người lao động bị tai nạn lao động, bệnh nghề nghiệp được hưởng đầy đủ chế độ theo Luật An toàn, vệ sinh lao động và pháp luật về bảo hiểm xã hội; Công ty chịu trách nhiệm bồi thường, trợ cấp theo quy định.</w:t>
+      </w:r>
+    </w:p>
+    <w:p>
+      <w:pPr>
+        <w:spacing w:after="140" w:before="260"/>
+        <w:jc w:val="center"/>
+      </w:pPr>
+      <w:r>
+        <w:rPr>
+          <w:rFonts w:ascii="Times New Roman" w:cs="Times New Roman" w:eastAsia="Times New Roman" w:hAnsi="Times New Roman"/>
+          <w:b/>
+          <w:bCs/>
+          <w:sz w:val="26"/>
+          <w:szCs w:val="26"/>
+        </w:rPr>
+        <w:t xml:space="preserve">CHƯƠNG VII — KIỂM TRA, XỬ LÝ VI PHẠM VÀ ĐIỀU KHOẢN THI HÀNH</w:t>
+      </w:r>
+    </w:p>
+    <w:p>
+      <w:pPr>
+        <w:spacing w:after="80" w:before="140" w:line="300"/>
+      </w:pPr>
+      <w:r>
+        <w:rPr>
+          <w:rFonts w:ascii="Times New Roman" w:cs="Times New Roman" w:eastAsia="Times New Roman" w:hAnsi="Times New Roman"/>
+          <w:b/>
+          <w:bCs/>
+          <w:sz w:val="24"/>
+          <w:szCs w:val="24"/>
+        </w:rPr>
+        <w:t xml:space="preserve">Điều 22. Kiểm tra, khen thưởng và xử lý vi phạm</w:t>
+      </w:r>
+    </w:p>
+    <w:p>
+      <w:pPr>
+        <w:spacing w:after="100" w:line="300"/>
+        <w:ind w:left="360"/>
+        <w:jc w:val="both"/>
+      </w:pPr>
+      <w:r>
+        <w:rPr>
+          <w:rFonts w:ascii="Times New Roman" w:cs="Times New Roman" w:eastAsia="Times New Roman" w:hAnsi="Times New Roman"/>
+          <w:b w:val="false"/>
+          <w:bCs w:val="false"/>
+          <w:i w:val="false"/>
+          <w:iCs w:val="false"/>
+          <w:sz w:val="24"/>
+          <w:szCs w:val="24"/>
+        </w:rPr>
+        <w:t xml:space="preserve">1. Công ty tổ chức tự kiểm tra ATVSLĐ định kỳ ít nhất 06 tháng một lần tại văn phòng, kho và hằng tuần tại công trường đang thi công, đồng thời kiểm tra đột xuất; kết quả lập thành biên bản, nêu tồn tại và thời hạn khắc phục.</w:t>
       </w:r>
     </w:p>
     <w:p>
@@ -18369,7 +19460,7 @@
           <w:sz w:val="24"/>
           <w:szCs w:val="24"/>
         </w:rPr>
-        <w:t xml:space="preserve">Điều 17. Hiệu lực thi hành</w:t>
+        <w:t xml:space="preserve">Điều 23. Hiệu lực thi hành</w:t>
       </w:r>
     </w:p>
     <w:p>
@@ -18610,7 +19701,7 @@
           <w:sz w:val="24"/>
           <w:szCs w:val="24"/>
         </w:rPr>
-        <w:t xml:space="preserve">- Căn cứ Nghị định số 13/2023/NĐ-CP ngày 17/4/2023 của Chính phủ về bảo vệ dữ liệu cá nhân;</w:t>
+        <w:t xml:space="preserve">- Căn cứ Luật Bảo vệ dữ liệu cá nhân số 91/2025/QH15 và các văn bản quy định chi tiết, hướng dẫn thi hành;</w:t>
       </w:r>
     </w:p>
     <w:p>
@@ -19204,7 +20295,7 @@
           <w:sz w:val="24"/>
           <w:szCs w:val="24"/>
         </w:rPr>
-        <w:t xml:space="preserve">Chủ thể dữ liệu có các quyền theo Nghị định 13/2023/NĐ-CP: quyền được biết; quyền đồng ý; quyền truy cập; quyền rút lại sự đồng ý; quyền xóa dữ liệu; quyền hạn chế xử lý; quyền cung cấp dữ liệu; quyền phản đối xử lý; quyền khiếu nại, tố cáo, khởi kiện; quyền yêu cầu bồi thường thiệt hại; quyền tự bảo vệ.</w:t>
+        <w:t xml:space="preserve">Chủ thể dữ liệu có các quyền theo pháp luật về bảo vệ dữ liệu cá nhân: quyền được biết; quyền đồng ý; quyền truy cập; quyền rút lại sự đồng ý; quyền xóa dữ liệu; quyền hạn chế xử lý; quyền cung cấp dữ liệu; quyền phản đối xử lý; quyền khiếu nại, tố cáo, khởi kiện; quyền yêu cầu bồi thường thiệt hại; quyền tự bảo vệ.</w:t>
       </w:r>
     </w:p>
     <w:p>
@@ -20663,7 +21754,7 @@
           <w:sz w:val="24"/>
           <w:szCs w:val="24"/>
         </w:rPr>
-        <w:t xml:space="preserve">3. Quá thời hạn 30 ngày chưa quyết toán mà không có lý do chính đáng, Công ty được khấu trừ khoản tạm ứng vào lương theo quy định (không quá 30%/tháng).</w:t>
+        <w:t xml:space="preserve">3. Quá thời hạn 30 ngày chưa quyết toán mà không có lý do chính đáng, khoản tạm ứng chưa quyết toán được thu hồi theo thỏa thuận bằng văn bản với người lao động; Công ty không tự khấu trừ vào tiền lương trái quy định tại Điều 102 Bộ luật Lao động.</w:t>
       </w:r>
     </w:p>
     <w:p>
@@ -21010,6 +22101,25 @@
     </w:p>
     <w:p>
       <w:pPr>
+        <w:spacing w:after="100" w:line="300"/>
+        <w:ind w:left="360"/>
+        <w:jc w:val="both"/>
+      </w:pPr>
+      <w:r>
+        <w:rPr>
+          <w:rFonts w:ascii="Times New Roman" w:cs="Times New Roman" w:eastAsia="Times New Roman" w:hAnsi="Times New Roman"/>
+          <w:b w:val="false"/>
+          <w:bCs w:val="false"/>
+          <w:i w:val="false"/>
+          <w:iCs w:val="false"/>
+          <w:sz w:val="24"/>
+          <w:szCs w:val="24"/>
+        </w:rPr>
+        <w:t xml:space="preserve">Quy tắc này được áp dụng cùng Bộ chính sách tuân thủ của Công ty (SVWS-POL-01, SVWS-POL-02, SVWS-POL-03); trường hợp hai văn bản quy định khác nhau thì áp dụng quy định chặt chẽ hơn.</w:t>
+      </w:r>
+    </w:p>
+    <w:p>
+      <w:pPr>
         <w:spacing w:after="80" w:before="140" w:line="300"/>
       </w:pPr>
       <w:r>
@@ -21362,7 +22472,7 @@
           <w:sz w:val="24"/>
           <w:szCs w:val="24"/>
         </w:rPr>
-        <w:t xml:space="preserve">2. Quà tặng mang tính xã giao thông thường có giá trị nhỏ (không quá ………………… đồng) được phép nhận nhưng phải báo cáo Trưởng bộ phận; quà có giá trị lớn hơn phải từ chối hoặc nộp về Công ty.</w:t>
+        <w:t xml:space="preserve">2. Quà tặng mang tính xã giao thông thường có giá trị nhỏ (không quá 500.000 đồng/lần theo Bộ chính sách tuân thủ SVWS-POL-01) được phép nhận nhưng phải báo cáo Trưởng bộ phận và ghi vào Sổ đăng ký quà tặng; quà có giá trị lớn hơn phải từ chối hoặc nộp về Công ty.</w:t>
       </w:r>
     </w:p>
     <w:p>
@@ -23819,7 +24929,45 @@
           <w:sz w:val="24"/>
           <w:szCs w:val="24"/>
         </w:rPr>
-        <w:t xml:space="preserve">d) Khả năng giao hàng đúng tiến độ, dịch vụ sau bán hàng, bảo hành.</w:t>
+        <w:t xml:space="preserve">d) Khả năng giao hàng đúng tiến độ, dịch vụ sau bán hàng, bảo hành;</w:t>
+      </w:r>
+    </w:p>
+    <w:p>
+      <w:pPr>
+        <w:spacing w:after="100" w:line="300"/>
+        <w:ind w:left="720"/>
+        <w:jc w:val="both"/>
+      </w:pPr>
+      <w:r>
+        <w:rPr>
+          <w:rFonts w:ascii="Times New Roman" w:cs="Times New Roman" w:eastAsia="Times New Roman" w:hAnsi="Times New Roman"/>
+          <w:b w:val="false"/>
+          <w:bCs w:val="false"/>
+          <w:i w:val="false"/>
+          <w:iCs w:val="false"/>
+          <w:sz w:val="24"/>
+          <w:szCs w:val="24"/>
+        </w:rPr>
+        <w:t xml:space="preserve">đ) Tuân thủ Bộ quy tắc ứng xử nhà cung cấp (SVWS-POL-03): nhà cung cấp, nhà thầu phụ mới ký Cam kết theo Phụ lục B của Bộ chính sách tuân thủ trước đơn hàng đầu tiên.</w:t>
+      </w:r>
+    </w:p>
+    <w:p>
+      <w:pPr>
+        <w:spacing w:after="100" w:line="300"/>
+        <w:ind w:left="720"/>
+        <w:jc w:val="both"/>
+      </w:pPr>
+      <w:r>
+        <w:rPr>
+          <w:rFonts w:ascii="Times New Roman" w:cs="Times New Roman" w:eastAsia="Times New Roman" w:hAnsi="Times New Roman"/>
+          <w:b w:val="false"/>
+          <w:bCs w:val="false"/>
+          <w:i w:val="false"/>
+          <w:iCs w:val="false"/>
+          <w:sz w:val="24"/>
+          <w:szCs w:val="24"/>
+        </w:rPr>
+        <w:t xml:space="preserve">Trước khi ký hợp đồng thuộc thẩm quyền phê duyệt của Giám đốc, hoặc hợp đồng với đại lý, môi giới, tư vấn, nhà thầu phụ làm việc thay mặt Công ty, bộ phận đề xuất lập Phiếu thẩm định đối tác gồm: tư cách pháp lý và người đại diện; quan hệ với người lao động của Công ty, với khách hàng hoặc cán bộ, công chức liên quan; lịch sử vi phạm, tranh chấp đã biết; lý do lựa chọn và tính hợp lý của giá, phí, hoa hồng. Phiếu thẩm định được lưu cùng hồ sơ hợp đồng; trường hợp có dấu hiệu rủi ro hối lộ, xung đột lợi ích thì không ký khi chưa có ý kiến của Giám đốc.</w:t>
       </w:r>
     </w:p>
     <w:p>
@@ -25876,6 +27024,25 @@
     </w:p>
     <w:p>
       <w:pPr>
+        <w:spacing w:after="100" w:line="300"/>
+        <w:ind w:left="360"/>
+        <w:jc w:val="both"/>
+      </w:pPr>
+      <w:r>
+        <w:rPr>
+          <w:rFonts w:ascii="Times New Roman" w:cs="Times New Roman" w:eastAsia="Times New Roman" w:hAnsi="Times New Roman"/>
+          <w:b w:val="false"/>
+          <w:bCs w:val="false"/>
+          <w:i w:val="false"/>
+          <w:iCs w:val="false"/>
+          <w:sz w:val="24"/>
+          <w:szCs w:val="24"/>
+        </w:rPr>
+        <w:t xml:space="preserve">Trước khi giao kết hợp đồng thử việc hoặc hợp đồng lao động, Công ty cung cấp trung thực cho người lao động, kể cả người được giới thiệu qua đơn vị tuyển dụng, thông tin về công việc, địa điểm làm việc, điều kiện làm việc, thời giờ làm việc và nghỉ ngơi, an toàn, vệ sinh lao động, tiền lương, hình thức và kỳ hạn trả lương, bảo hiểm và các quy định của Công ty; các nội dung chính được ghi trong thư mời nhận việc. Công ty không thu bất kỳ khoản phí tuyển dụng nào của người lao động.</w:t>
+      </w:r>
+    </w:p>
+    <w:p>
+      <w:pPr>
         <w:spacing w:after="80" w:before="140" w:line="300"/>
       </w:pPr>
       <w:r>
@@ -26017,6 +27184,25 @@
     </w:p>
     <w:p>
       <w:pPr>
+        <w:spacing w:after="100" w:line="300"/>
+        <w:ind w:left="360"/>
+        <w:jc w:val="both"/>
+      </w:pPr>
+      <w:r>
+        <w:rPr>
+          <w:rFonts w:ascii="Times New Roman" w:cs="Times New Roman" w:eastAsia="Times New Roman" w:hAnsi="Times New Roman"/>
+          <w:b w:val="false"/>
+          <w:bCs w:val="false"/>
+          <w:i w:val="false"/>
+          <w:iCs w:val="false"/>
+          <w:sz w:val="24"/>
+          <w:szCs w:val="24"/>
+        </w:rPr>
+        <w:t xml:space="preserve">3. Khi tiếp nhận, bộ phận Hành chính – Nhân sự đối chiếu bản gốc Căn cước/căn cước công dân để xác minh người lao động đủ 18 tuổi, lưu bản sao và trả lại bản gốc ngay. Công ty không giữ bản chính giấy tờ tùy thân, văn bằng, chứng chỉ của người lao động; không yêu cầu đặt cọc, ký quỹ.</w:t>
+      </w:r>
+    </w:p>
+    <w:p>
+      <w:pPr>
         <w:spacing w:after="80" w:before="140" w:line="300"/>
       </w:pPr>
       <w:r>
@@ -26259,7 +27445,7 @@
           <w:sz w:val="24"/>
           <w:szCs w:val="24"/>
         </w:rPr>
-        <w:t xml:space="preserve">2. Công ty hoàn thành thủ tục xác nhận thời gian đóng bảo hiểm và trả lại giấy tờ đã giữ (nếu có).</w:t>
+        <w:t xml:space="preserve">2. Công ty hoàn thành thủ tục xác nhận thời gian đóng bảo hiểm và cung cấp bản sao tài liệu liên quan đến quá trình làm việc khi người lao động yêu cầu.</w:t>
       </w:r>
     </w:p>
     <w:p>
@@ -26279,6 +27465,25 @@
           <w:szCs w:val="24"/>
         </w:rPr>
         <w:t xml:space="preserve">3. Trường hợp người lao động chưa hoàn tất bàn giao hoặc còn nghĩa vụ tài chính, các khoản này được đối chiếu, xử lý theo quy định của pháp luật.</w:t>
+      </w:r>
+    </w:p>
+    <w:p>
+      <w:pPr>
+        <w:spacing w:after="100" w:line="300"/>
+        <w:ind w:left="360"/>
+        <w:jc w:val="both"/>
+      </w:pPr>
+      <w:r>
+        <w:rPr>
+          <w:rFonts w:ascii="Times New Roman" w:cs="Times New Roman" w:eastAsia="Times New Roman" w:hAnsi="Times New Roman"/>
+          <w:b w:val="false"/>
+          <w:bCs w:val="false"/>
+          <w:i w:val="false"/>
+          <w:iCs w:val="false"/>
+          <w:sz w:val="24"/>
+          <w:szCs w:val="24"/>
+        </w:rPr>
+        <w:t xml:space="preserve">4. Khoản tạm ứng, khoản vay của người lao động tại Công ty (nếu có) được người lao động trả trước bất kỳ lúc nào hoặc đối trừ khi thanh toán chấm dứt hợp đồng theo thỏa thuận bằng văn bản; khoản này không phải là điều kiện ràng buộc người lao động tiếp tục làm việc.</w:t>
       </w:r>
     </w:p>
     <w:p>
@@ -34325,6 +35530,1487 @@
         </w:tc>
       </w:tr>
     </w:tbl>
+    <w:p>
+      <w:r>
+        <w:br w:type="page"/>
+      </w:r>
+    </w:p>
+    <w:p>
+      <w:pPr>
+        <w:spacing w:after="0"/>
+        <w:jc w:val="center"/>
+      </w:pPr>
+      <w:r>
+        <w:rPr>
+          <w:rFonts w:ascii="Times New Roman" w:cs="Times New Roman" w:eastAsia="Times New Roman" w:hAnsi="Times New Roman"/>
+          <w:b/>
+          <w:bCs/>
+          <w:sz w:val="24"/>
+          <w:szCs w:val="24"/>
+        </w:rPr>
+        <w:t xml:space="preserve">CÔNG TY TNHH GIẢI PHÁP KỸ THUẬT SÓNG VIỆT</w:t>
+      </w:r>
+    </w:p>
+    <w:p>
+      <w:pPr>
+        <w:spacing w:after="60"/>
+        <w:jc w:val="center"/>
+      </w:pPr>
+      <w:r>
+        <w:rPr>
+          <w:rFonts w:ascii="Times New Roman" w:cs="Times New Roman" w:eastAsia="Times New Roman" w:hAnsi="Times New Roman"/>
+          <w:sz w:val="24"/>
+          <w:szCs w:val="24"/>
+        </w:rPr>
+        <w:t xml:space="preserve">Số: ......../2026/PCCC-SV</w:t>
+      </w:r>
+    </w:p>
+    <w:p>
+      <w:pPr>
+        <w:spacing w:after="0"/>
+        <w:jc w:val="center"/>
+      </w:pPr>
+      <w:r>
+        <w:rPr>
+          <w:rFonts w:ascii="Times New Roman" w:cs="Times New Roman" w:eastAsia="Times New Roman" w:hAnsi="Times New Roman"/>
+          <w:b/>
+          <w:bCs/>
+          <w:sz w:val="24"/>
+          <w:szCs w:val="24"/>
+        </w:rPr>
+        <w:t xml:space="preserve">CỘNG HÒA XÃ HỘI CHỦ NGHĨA VIỆT NAM</w:t>
+      </w:r>
+    </w:p>
+    <w:p>
+      <w:pPr>
+        <w:spacing w:after="240"/>
+        <w:jc w:val="center"/>
+      </w:pPr>
+      <w:r>
+        <w:rPr>
+          <w:rFonts w:ascii="Times New Roman" w:cs="Times New Roman" w:eastAsia="Times New Roman" w:hAnsi="Times New Roman"/>
+          <w:b/>
+          <w:bCs/>
+          <w:sz w:val="24"/>
+          <w:szCs w:val="24"/>
+        </w:rPr>
+        <w:t xml:space="preserve">Độc lập – Tự do – Hạnh phúc</w:t>
+      </w:r>
+    </w:p>
+    <w:p>
+      <w:pPr>
+        <w:spacing w:after="60"/>
+        <w:jc w:val="center"/>
+      </w:pPr>
+      <w:r>
+        <w:rPr>
+          <w:rFonts w:ascii="Times New Roman" w:cs="Times New Roman" w:eastAsia="Times New Roman" w:hAnsi="Times New Roman"/>
+          <w:b/>
+          <w:bCs/>
+          <w:sz w:val="30"/>
+          <w:szCs w:val="30"/>
+        </w:rPr>
+        <w:t xml:space="preserve">QUY ĐỊNH PHÒNG CHÁY, CHỮA CHÁY VÀ ỨNG PHÓ TÌNH HUỐNG KHẨN CẤP</w:t>
+      </w:r>
+    </w:p>
+    <w:p>
+      <w:pPr>
+        <w:spacing w:after="240"/>
+        <w:jc w:val="center"/>
+      </w:pPr>
+      <w:r>
+        <w:rPr>
+          <w:rFonts w:ascii="Times New Roman" w:cs="Times New Roman" w:eastAsia="Times New Roman" w:hAnsi="Times New Roman"/>
+          <w:i/>
+          <w:iCs/>
+          <w:sz w:val="22"/>
+          <w:szCs w:val="22"/>
+        </w:rPr>
+        <w:t xml:space="preserve">(Ban hành kèm theo Quyết định số ......../2026/QĐ-SV ngày ...... tháng ...... năm 2026 của Giám đốc Công ty TNHH Giải pháp Kỹ thuật Sóng Việt)</w:t>
+      </w:r>
+    </w:p>
+    <w:p>
+      <w:pPr>
+        <w:spacing w:after="100" w:line="300"/>
+        <w:jc w:val="both"/>
+      </w:pPr>
+      <w:r>
+        <w:rPr>
+          <w:rFonts w:ascii="Times New Roman" w:cs="Times New Roman" w:eastAsia="Times New Roman" w:hAnsi="Times New Roman"/>
+          <w:b w:val="false"/>
+          <w:bCs w:val="false"/>
+          <w:i w:val="false"/>
+          <w:iCs w:val="false"/>
+          <w:sz w:val="24"/>
+          <w:szCs w:val="24"/>
+        </w:rPr>
+        <w:t xml:space="preserve">- Căn cứ Luật Phòng cháy, chữa cháy và cứu nạn, cứu hộ số 55/2024/QH15 và các văn bản quy định chi tiết, hướng dẫn thi hành;</w:t>
+      </w:r>
+    </w:p>
+    <w:p>
+      <w:pPr>
+        <w:spacing w:after="100" w:line="300"/>
+        <w:jc w:val="both"/>
+      </w:pPr>
+      <w:r>
+        <w:rPr>
+          <w:rFonts w:ascii="Times New Roman" w:cs="Times New Roman" w:eastAsia="Times New Roman" w:hAnsi="Times New Roman"/>
+          <w:b w:val="false"/>
+          <w:bCs w:val="false"/>
+          <w:i w:val="false"/>
+          <w:iCs w:val="false"/>
+          <w:sz w:val="24"/>
+          <w:szCs w:val="24"/>
+        </w:rPr>
+        <w:t xml:space="preserve">- Căn cứ Luật An toàn, vệ sinh lao động số 84/2015/QH13;</w:t>
+      </w:r>
+    </w:p>
+    <w:p>
+      <w:pPr>
+        <w:spacing w:after="100" w:line="300"/>
+        <w:jc w:val="both"/>
+      </w:pPr>
+      <w:r>
+        <w:rPr>
+          <w:rFonts w:ascii="Times New Roman" w:cs="Times New Roman" w:eastAsia="Times New Roman" w:hAnsi="Times New Roman"/>
+          <w:b w:val="false"/>
+          <w:bCs w:val="false"/>
+          <w:i w:val="false"/>
+          <w:iCs w:val="false"/>
+          <w:sz w:val="24"/>
+          <w:szCs w:val="24"/>
+        </w:rPr>
+        <w:t xml:space="preserve">- Căn cứ đặc thù hoạt động của Công ty tại văn phòng, kho, công trường và trạm xử lý của khách hàng,</w:t>
+      </w:r>
+    </w:p>
+    <w:p>
+      <w:pPr>
+        <w:spacing w:after="100" w:line="300"/>
+        <w:jc w:val="both"/>
+      </w:pPr>
+      <w:r>
+        <w:rPr>
+          <w:rFonts w:ascii="Times New Roman" w:cs="Times New Roman" w:eastAsia="Times New Roman" w:hAnsi="Times New Roman"/>
+          <w:b/>
+          <w:bCs/>
+          <w:i w:val="false"/>
+          <w:iCs w:val="false"/>
+          <w:sz w:val="24"/>
+          <w:szCs w:val="24"/>
+        </w:rPr>
+        <w:t xml:space="preserve">Giám đốc Công ty ban hành Quy định phòng cháy, chữa cháy và ứng phó tình huống khẩn cấp như sau:</w:t>
+      </w:r>
+    </w:p>
+    <w:p>
+      <w:pPr>
+        <w:spacing w:after="140" w:before="260"/>
+        <w:jc w:val="center"/>
+      </w:pPr>
+      <w:r>
+        <w:rPr>
+          <w:rFonts w:ascii="Times New Roman" w:cs="Times New Roman" w:eastAsia="Times New Roman" w:hAnsi="Times New Roman"/>
+          <w:b/>
+          <w:bCs/>
+          <w:sz w:val="26"/>
+          <w:szCs w:val="26"/>
+        </w:rPr>
+        <w:t xml:space="preserve">CHƯƠNG I — QUY ĐỊNH CHUNG</w:t>
+      </w:r>
+    </w:p>
+    <w:p>
+      <w:pPr>
+        <w:spacing w:after="80" w:before="140" w:line="300"/>
+      </w:pPr>
+      <w:r>
+        <w:rPr>
+          <w:rFonts w:ascii="Times New Roman" w:cs="Times New Roman" w:eastAsia="Times New Roman" w:hAnsi="Times New Roman"/>
+          <w:b/>
+          <w:bCs/>
+          <w:sz w:val="24"/>
+          <w:szCs w:val="24"/>
+        </w:rPr>
+        <w:t xml:space="preserve">Điều 1. Phạm vi và đối tượng áp dụng</w:t>
+      </w:r>
+    </w:p>
+    <w:p>
+      <w:pPr>
+        <w:spacing w:after="100" w:line="300"/>
+        <w:ind w:left="360"/>
+        <w:jc w:val="both"/>
+      </w:pPr>
+      <w:r>
+        <w:rPr>
+          <w:rFonts w:ascii="Times New Roman" w:cs="Times New Roman" w:eastAsia="Times New Roman" w:hAnsi="Times New Roman"/>
+          <w:b w:val="false"/>
+          <w:bCs w:val="false"/>
+          <w:i w:val="false"/>
+          <w:iCs w:val="false"/>
+          <w:sz w:val="24"/>
+          <w:szCs w:val="24"/>
+        </w:rPr>
+        <w:t xml:space="preserve">1. Quy định này quy định việc phòng cháy, chữa cháy, thoát nạn và ứng phó các tình huống khẩn cấp tại văn phòng, kho, công trường của Công ty và khi người lao động của Công ty làm việc tại nhà máy, trạm xử lý của khách hàng.</w:t>
+      </w:r>
+    </w:p>
+    <w:p>
+      <w:pPr>
+        <w:spacing w:after="100" w:line="300"/>
+        <w:ind w:left="360"/>
+        <w:jc w:val="both"/>
+      </w:pPr>
+      <w:r>
+        <w:rPr>
+          <w:rFonts w:ascii="Times New Roman" w:cs="Times New Roman" w:eastAsia="Times New Roman" w:hAnsi="Times New Roman"/>
+          <w:b w:val="false"/>
+          <w:bCs w:val="false"/>
+          <w:i w:val="false"/>
+          <w:iCs w:val="false"/>
+          <w:sz w:val="24"/>
+          <w:szCs w:val="24"/>
+        </w:rPr>
+        <w:t xml:space="preserve">2. Áp dụng đối với toàn bộ người lao động của Công ty, nhà thầu phụ và khách đến làm việc trong phạm vi cơ sở, công trường do Công ty quản lý.</w:t>
+      </w:r>
+    </w:p>
+    <w:p>
+      <w:pPr>
+        <w:spacing w:after="80" w:before="140" w:line="300"/>
+      </w:pPr>
+      <w:r>
+        <w:rPr>
+          <w:rFonts w:ascii="Times New Roman" w:cs="Times New Roman" w:eastAsia="Times New Roman" w:hAnsi="Times New Roman"/>
+          <w:b/>
+          <w:bCs/>
+          <w:sz w:val="24"/>
+          <w:szCs w:val="24"/>
+        </w:rPr>
+        <w:t xml:space="preserve">Điều 2. Trách nhiệm</w:t>
+      </w:r>
+    </w:p>
+    <w:p>
+      <w:pPr>
+        <w:spacing w:after="100" w:line="300"/>
+        <w:ind w:left="360"/>
+        <w:jc w:val="both"/>
+      </w:pPr>
+      <w:r>
+        <w:rPr>
+          <w:rFonts w:ascii="Times New Roman" w:cs="Times New Roman" w:eastAsia="Times New Roman" w:hAnsi="Times New Roman"/>
+          <w:b w:val="false"/>
+          <w:bCs w:val="false"/>
+          <w:i w:val="false"/>
+          <w:iCs w:val="false"/>
+          <w:sz w:val="24"/>
+          <w:szCs w:val="24"/>
+        </w:rPr>
+        <w:t xml:space="preserve">1. Giám đốc chịu trách nhiệm chung về phòng cháy, chữa cháy; ban hành phương án, bố trí kinh phí, phương tiện và phân công người phụ trách.</w:t>
+      </w:r>
+    </w:p>
+    <w:p>
+      <w:pPr>
+        <w:spacing w:after="100" w:line="300"/>
+        <w:ind w:left="360"/>
+        <w:jc w:val="both"/>
+      </w:pPr>
+      <w:r>
+        <w:rPr>
+          <w:rFonts w:ascii="Times New Roman" w:cs="Times New Roman" w:eastAsia="Times New Roman" w:hAnsi="Times New Roman"/>
+          <w:b w:val="false"/>
+          <w:bCs w:val="false"/>
+          <w:i w:val="false"/>
+          <w:iCs w:val="false"/>
+          <w:sz w:val="24"/>
+          <w:szCs w:val="24"/>
+        </w:rPr>
+        <w:t xml:space="preserve">2. Người phụ trách phòng cháy, chữa cháy do Giám đốc phân công: lập và cập nhật phương án chữa cháy, thoát nạn; tổ chức kiểm tra, huấn luyện, diễn tập; quản lý hồ sơ.</w:t>
+      </w:r>
+    </w:p>
+    <w:p>
+      <w:pPr>
+        <w:spacing w:after="100" w:line="300"/>
+        <w:ind w:left="360"/>
+        <w:jc w:val="both"/>
+      </w:pPr>
+      <w:r>
+        <w:rPr>
+          <w:rFonts w:ascii="Times New Roman" w:cs="Times New Roman" w:eastAsia="Times New Roman" w:hAnsi="Times New Roman"/>
+          <w:b w:val="false"/>
+          <w:bCs w:val="false"/>
+          <w:i w:val="false"/>
+          <w:iCs w:val="false"/>
+          <w:sz w:val="24"/>
+          <w:szCs w:val="24"/>
+        </w:rPr>
+        <w:t xml:space="preserve">3. Trưởng bộ phận, chỉ huy công trình chịu trách nhiệm về an toàn phòng cháy tại khu vực phụ trách và điểm danh người lao động khi sơ tán.</w:t>
+      </w:r>
+    </w:p>
+    <w:p>
+      <w:pPr>
+        <w:spacing w:after="100" w:line="300"/>
+        <w:ind w:left="360"/>
+        <w:jc w:val="both"/>
+      </w:pPr>
+      <w:r>
+        <w:rPr>
+          <w:rFonts w:ascii="Times New Roman" w:cs="Times New Roman" w:eastAsia="Times New Roman" w:hAnsi="Times New Roman"/>
+          <w:b w:val="false"/>
+          <w:bCs w:val="false"/>
+          <w:i w:val="false"/>
+          <w:iCs w:val="false"/>
+          <w:sz w:val="24"/>
+          <w:szCs w:val="24"/>
+        </w:rPr>
+        <w:t xml:space="preserve">4. Người lao động chấp hành quy định; biết vị trí và cách dùng bình chữa cháy, lối thoát nạn, điểm tập kết; báo ngay khi phát hiện nguy cơ cháy, nổ.</w:t>
+      </w:r>
+    </w:p>
+    <w:p>
+      <w:pPr>
+        <w:spacing w:after="100" w:line="300"/>
+        <w:ind w:left="360"/>
+        <w:jc w:val="both"/>
+      </w:pPr>
+      <w:r>
+        <w:rPr>
+          <w:rFonts w:ascii="Times New Roman" w:cs="Times New Roman" w:eastAsia="Times New Roman" w:hAnsi="Times New Roman"/>
+          <w:b w:val="false"/>
+          <w:bCs w:val="false"/>
+          <w:i w:val="false"/>
+          <w:iCs w:val="false"/>
+          <w:sz w:val="24"/>
+          <w:szCs w:val="24"/>
+        </w:rPr>
+        <w:t xml:space="preserve">5. Tại văn phòng, kho thuê trong tòa nhà hoặc khu kho của bên cho thuê, Công ty tuân thủ nội quy phòng cháy, chữa cháy của tòa nhà, tham gia diễn tập do ban quản lý tổ chức và lưu bản sao hồ sơ phòng cháy, chữa cháy của tòa nhà.</w:t>
+      </w:r>
+    </w:p>
+    <w:p>
+      <w:pPr>
+        <w:spacing w:after="140" w:before="260"/>
+        <w:jc w:val="center"/>
+      </w:pPr>
+      <w:r>
+        <w:rPr>
+          <w:rFonts w:ascii="Times New Roman" w:cs="Times New Roman" w:eastAsia="Times New Roman" w:hAnsi="Times New Roman"/>
+          <w:b/>
+          <w:bCs/>
+          <w:sz w:val="26"/>
+          <w:szCs w:val="26"/>
+        </w:rPr>
+        <w:t xml:space="preserve">CHƯƠNG II — PHÒNG CHÁY VÀ THOÁT NẠN</w:t>
+      </w:r>
+    </w:p>
+    <w:p>
+      <w:pPr>
+        <w:spacing w:after="80" w:before="140" w:line="300"/>
+      </w:pPr>
+      <w:r>
+        <w:rPr>
+          <w:rFonts w:ascii="Times New Roman" w:cs="Times New Roman" w:eastAsia="Times New Roman" w:hAnsi="Times New Roman"/>
+          <w:b/>
+          <w:bCs/>
+          <w:sz w:val="24"/>
+          <w:szCs w:val="24"/>
+        </w:rPr>
+        <w:t xml:space="preserve">Điều 3. Quy định phòng cháy</w:t>
+      </w:r>
+    </w:p>
+    <w:p>
+      <w:pPr>
+        <w:spacing w:after="100" w:line="300"/>
+        <w:ind w:left="360"/>
+        <w:jc w:val="both"/>
+      </w:pPr>
+      <w:r>
+        <w:rPr>
+          <w:rFonts w:ascii="Times New Roman" w:cs="Times New Roman" w:eastAsia="Times New Roman" w:hAnsi="Times New Roman"/>
+          <w:b w:val="false"/>
+          <w:bCs w:val="false"/>
+          <w:i w:val="false"/>
+          <w:iCs w:val="false"/>
+          <w:sz w:val="24"/>
+          <w:szCs w:val="24"/>
+        </w:rPr>
+        <w:t xml:space="preserve">1. Không hút thuốc trong văn phòng, kho, khu vực hóa chất và nơi có biển cấm lửa.</w:t>
+      </w:r>
+    </w:p>
+    <w:p>
+      <w:pPr>
+        <w:spacing w:after="100" w:line="300"/>
+        <w:ind w:left="360"/>
+        <w:jc w:val="both"/>
+      </w:pPr>
+      <w:r>
+        <w:rPr>
+          <w:rFonts w:ascii="Times New Roman" w:cs="Times New Roman" w:eastAsia="Times New Roman" w:hAnsi="Times New Roman"/>
+          <w:b w:val="false"/>
+          <w:bCs w:val="false"/>
+          <w:i w:val="false"/>
+          <w:iCs w:val="false"/>
+          <w:sz w:val="24"/>
+          <w:szCs w:val="24"/>
+        </w:rPr>
+        <w:t xml:space="preserve">2. Không để vật liệu dễ cháy gần nguồn nhiệt, tủ điện; hóa chất dễ cháy, chất ôxy hóa được lưu trữ theo Quy chế an toàn, vệ sinh lao động.</w:t>
+      </w:r>
+    </w:p>
+    <w:p>
+      <w:pPr>
+        <w:spacing w:after="100" w:line="300"/>
+        <w:ind w:left="360"/>
+        <w:jc w:val="both"/>
+      </w:pPr>
+      <w:r>
+        <w:rPr>
+          <w:rFonts w:ascii="Times New Roman" w:cs="Times New Roman" w:eastAsia="Times New Roman" w:hAnsi="Times New Roman"/>
+          <w:b w:val="false"/>
+          <w:bCs w:val="false"/>
+          <w:i w:val="false"/>
+          <w:iCs w:val="false"/>
+          <w:sz w:val="24"/>
+          <w:szCs w:val="24"/>
+        </w:rPr>
+        <w:t xml:space="preserve">3. Không câu mắc điện tùy tiện, không dùng thiết bị điện quá tải; cuối ngày làm việc tắt thiết bị điện không cần thiết.</w:t>
+      </w:r>
+    </w:p>
+    <w:p>
+      <w:pPr>
+        <w:spacing w:after="100" w:line="300"/>
+        <w:ind w:left="360"/>
+        <w:jc w:val="both"/>
+      </w:pPr>
+      <w:r>
+        <w:rPr>
+          <w:rFonts w:ascii="Times New Roman" w:cs="Times New Roman" w:eastAsia="Times New Roman" w:hAnsi="Times New Roman"/>
+          <w:b w:val="false"/>
+          <w:bCs w:val="false"/>
+          <w:i w:val="false"/>
+          <w:iCs w:val="false"/>
+          <w:sz w:val="24"/>
+          <w:szCs w:val="24"/>
+        </w:rPr>
+        <w:t xml:space="preserve">4. Hàn, cắt và công việc phát sinh tia lửa chỉ thực hiện khi có giấy phép làm việc nóng theo Quy chế an toàn, vệ sinh lao động.</w:t>
+      </w:r>
+    </w:p>
+    <w:p>
+      <w:pPr>
+        <w:spacing w:after="100" w:line="300"/>
+        <w:ind w:left="360"/>
+        <w:jc w:val="both"/>
+      </w:pPr>
+      <w:r>
+        <w:rPr>
+          <w:rFonts w:ascii="Times New Roman" w:cs="Times New Roman" w:eastAsia="Times New Roman" w:hAnsi="Times New Roman"/>
+          <w:b w:val="false"/>
+          <w:bCs w:val="false"/>
+          <w:i w:val="false"/>
+          <w:iCs w:val="false"/>
+          <w:sz w:val="24"/>
+          <w:szCs w:val="24"/>
+        </w:rPr>
+        <w:t xml:space="preserve">5. Hành lang, cầu thang, cửa thoát nạn luôn thông thoáng; không để hàng hóa, vật dụng chắn lối đi và phương tiện chữa cháy.</w:t>
+      </w:r>
+    </w:p>
+    <w:p>
+      <w:pPr>
+        <w:spacing w:after="80" w:before="140" w:line="300"/>
+      </w:pPr>
+      <w:r>
+        <w:rPr>
+          <w:rFonts w:ascii="Times New Roman" w:cs="Times New Roman" w:eastAsia="Times New Roman" w:hAnsi="Times New Roman"/>
+          <w:b/>
+          <w:bCs/>
+          <w:sz w:val="24"/>
+          <w:szCs w:val="24"/>
+        </w:rPr>
+        <w:t xml:space="preserve">Điều 4. Phương tiện chữa cháy và phát hiện cháy</w:t>
+      </w:r>
+    </w:p>
+    <w:p>
+      <w:pPr>
+        <w:spacing w:after="100" w:line="300"/>
+        <w:ind w:left="360"/>
+        <w:jc w:val="both"/>
+      </w:pPr>
+      <w:r>
+        <w:rPr>
+          <w:rFonts w:ascii="Times New Roman" w:cs="Times New Roman" w:eastAsia="Times New Roman" w:hAnsi="Times New Roman"/>
+          <w:b w:val="false"/>
+          <w:bCs w:val="false"/>
+          <w:i w:val="false"/>
+          <w:iCs w:val="false"/>
+          <w:sz w:val="24"/>
+          <w:szCs w:val="24"/>
+        </w:rPr>
+        <w:t xml:space="preserve">1. Văn phòng, kho, công trường được trang bị bình chữa cháy xách tay phù hợp loại đám cháy (bột ABC; khí CO2 cho khu vực thiết bị điện), đặt nơi dễ thấy, dễ lấy, có biển chỉ vị trí, bảo đảm số lượng theo tiêu chuẩn hiện hành.</w:t>
+      </w:r>
+    </w:p>
+    <w:p>
+      <w:pPr>
+        <w:spacing w:after="100" w:line="300"/>
+        <w:ind w:left="360"/>
+        <w:jc w:val="both"/>
+      </w:pPr>
+      <w:r>
+        <w:rPr>
+          <w:rFonts w:ascii="Times New Roman" w:cs="Times New Roman" w:eastAsia="Times New Roman" w:hAnsi="Times New Roman"/>
+          <w:b w:val="false"/>
+          <w:bCs w:val="false"/>
+          <w:i w:val="false"/>
+          <w:iCs w:val="false"/>
+          <w:sz w:val="24"/>
+          <w:szCs w:val="24"/>
+        </w:rPr>
+        <w:t xml:space="preserve">2. Khu vực làm việc có thiết bị phát hiện, báo cháy (đầu báo cháy, chuông hoặc còi báo cháy) theo thiết kế của tòa nhà hoặc do Công ty lắp bổ sung; có đèn chiếu sáng sự cố và đèn chỉ dẫn thoát nạn.</w:t>
+      </w:r>
+    </w:p>
+    <w:p>
+      <w:pPr>
+        <w:spacing w:after="100" w:line="300"/>
+        <w:ind w:left="360"/>
+        <w:jc w:val="both"/>
+      </w:pPr>
+      <w:r>
+        <w:rPr>
+          <w:rFonts w:ascii="Times New Roman" w:cs="Times New Roman" w:eastAsia="Times New Roman" w:hAnsi="Times New Roman"/>
+          <w:b w:val="false"/>
+          <w:bCs w:val="false"/>
+          <w:i w:val="false"/>
+          <w:iCs w:val="false"/>
+          <w:sz w:val="24"/>
+          <w:szCs w:val="24"/>
+        </w:rPr>
+        <w:t xml:space="preserve">3. Kho hóa chất có thêm phương tiện chữa cháy phù hợp với hóa chất lưu trữ và vật liệu xử lý tràn đổ.</w:t>
+      </w:r>
+    </w:p>
+    <w:p>
+      <w:pPr>
+        <w:spacing w:after="80" w:before="140" w:line="300"/>
+      </w:pPr>
+      <w:r>
+        <w:rPr>
+          <w:rFonts w:ascii="Times New Roman" w:cs="Times New Roman" w:eastAsia="Times New Roman" w:hAnsi="Times New Roman"/>
+          <w:b/>
+          <w:bCs/>
+          <w:sz w:val="24"/>
+          <w:szCs w:val="24"/>
+        </w:rPr>
+        <w:t xml:space="preserve">Điều 5. Kiểm tra, bảo dưỡng phương tiện phòng cháy, chữa cháy</w:t>
+      </w:r>
+    </w:p>
+    <w:p>
+      <w:pPr>
+        <w:spacing w:after="100" w:line="300"/>
+        <w:ind w:left="360"/>
+        <w:jc w:val="both"/>
+      </w:pPr>
+      <w:r>
+        <w:rPr>
+          <w:rFonts w:ascii="Times New Roman" w:cs="Times New Roman" w:eastAsia="Times New Roman" w:hAnsi="Times New Roman"/>
+          <w:b w:val="false"/>
+          <w:bCs w:val="false"/>
+          <w:i w:val="false"/>
+          <w:iCs w:val="false"/>
+          <w:sz w:val="24"/>
+          <w:szCs w:val="24"/>
+        </w:rPr>
+        <w:t xml:space="preserve">1. Người phụ trách kiểm tra bình chữa cháy, đèn sự cố, đèn chỉ dẫn, nút ấn và chuông báo cháy ít nhất 01 lần/tháng, ghi kết quả vào thẻ kiểm tra gắn trên bình và sổ theo dõi phương tiện.</w:t>
+      </w:r>
+    </w:p>
+    <w:p>
+      <w:pPr>
+        <w:spacing w:after="100" w:line="300"/>
+        <w:ind w:left="360"/>
+        <w:jc w:val="both"/>
+      </w:pPr>
+      <w:r>
+        <w:rPr>
+          <w:rFonts w:ascii="Times New Roman" w:cs="Times New Roman" w:eastAsia="Times New Roman" w:hAnsi="Times New Roman"/>
+          <w:b w:val="false"/>
+          <w:bCs w:val="false"/>
+          <w:i w:val="false"/>
+          <w:iCs w:val="false"/>
+          <w:sz w:val="24"/>
+          <w:szCs w:val="24"/>
+        </w:rPr>
+        <w:t xml:space="preserve">2. Bình chữa cháy được nạp lại, bảo dưỡng theo hướng dẫn của nhà sản xuất và ngay sau khi sử dụng, mất áp hoặc hết hạn.</w:t>
+      </w:r>
+    </w:p>
+    <w:p>
+      <w:pPr>
+        <w:spacing w:after="100" w:line="300"/>
+        <w:ind w:left="360"/>
+        <w:jc w:val="both"/>
+      </w:pPr>
+      <w:r>
+        <w:rPr>
+          <w:rFonts w:ascii="Times New Roman" w:cs="Times New Roman" w:eastAsia="Times New Roman" w:hAnsi="Times New Roman"/>
+          <w:b w:val="false"/>
+          <w:bCs w:val="false"/>
+          <w:i w:val="false"/>
+          <w:iCs w:val="false"/>
+          <w:sz w:val="24"/>
+          <w:szCs w:val="24"/>
+        </w:rPr>
+        <w:t xml:space="preserve">3. Hệ thống báo cháy, chữa cháy của tòa nhà do ban quản lý bảo dưỡng; Công ty yêu cầu và lưu bản sao biên bản bảo dưỡng, kiểm tra định kỳ.</w:t>
+      </w:r>
+    </w:p>
+    <w:p>
+      <w:pPr>
+        <w:spacing w:after="80" w:before="140" w:line="300"/>
+      </w:pPr>
+      <w:r>
+        <w:rPr>
+          <w:rFonts w:ascii="Times New Roman" w:cs="Times New Roman" w:eastAsia="Times New Roman" w:hAnsi="Times New Roman"/>
+          <w:b/>
+          <w:bCs/>
+          <w:sz w:val="24"/>
+          <w:szCs w:val="24"/>
+        </w:rPr>
+        <w:t xml:space="preserve">Điều 6. Lối thoát nạn, biển chỉ dẫn và sơ đồ thoát nạn</w:t>
+      </w:r>
+    </w:p>
+    <w:p>
+      <w:pPr>
+        <w:spacing w:after="100" w:line="300"/>
+        <w:ind w:left="360"/>
+        <w:jc w:val="both"/>
+      </w:pPr>
+      <w:r>
+        <w:rPr>
+          <w:rFonts w:ascii="Times New Roman" w:cs="Times New Roman" w:eastAsia="Times New Roman" w:hAnsi="Times New Roman"/>
+          <w:b w:val="false"/>
+          <w:bCs w:val="false"/>
+          <w:i w:val="false"/>
+          <w:iCs w:val="false"/>
+          <w:sz w:val="24"/>
+          <w:szCs w:val="24"/>
+        </w:rPr>
+        <w:t xml:space="preserve">1. Mỗi khu vực làm việc có lối thoát nạn được xác định từ vị trí làm việc đến cửa thoát hiểm và điểm tập kết an toàn bên ngoài.</w:t>
+      </w:r>
+    </w:p>
+    <w:p>
+      <w:pPr>
+        <w:spacing w:after="100" w:line="300"/>
+        <w:ind w:left="360"/>
+        <w:jc w:val="both"/>
+      </w:pPr>
+      <w:r>
+        <w:rPr>
+          <w:rFonts w:ascii="Times New Roman" w:cs="Times New Roman" w:eastAsia="Times New Roman" w:hAnsi="Times New Roman"/>
+          <w:b w:val="false"/>
+          <w:bCs w:val="false"/>
+          <w:i w:val="false"/>
+          <w:iCs w:val="false"/>
+          <w:sz w:val="24"/>
+          <w:szCs w:val="24"/>
+        </w:rPr>
+        <w:t xml:space="preserve">2. Cửa thoát nạn không khóa trong giờ làm việc, mở được từ bên trong mà không cần chìa; phương tiện chữa cháy không bị che chắn.</w:t>
+      </w:r>
+    </w:p>
+    <w:p>
+      <w:pPr>
+        <w:spacing w:after="100" w:line="300"/>
+        <w:ind w:left="360"/>
+        <w:jc w:val="both"/>
+      </w:pPr>
+      <w:r>
+        <w:rPr>
+          <w:rFonts w:ascii="Times New Roman" w:cs="Times New Roman" w:eastAsia="Times New Roman" w:hAnsi="Times New Roman"/>
+          <w:b w:val="false"/>
+          <w:bCs w:val="false"/>
+          <w:i w:val="false"/>
+          <w:iCs w:val="false"/>
+          <w:sz w:val="24"/>
+          <w:szCs w:val="24"/>
+        </w:rPr>
+        <w:t xml:space="preserve">3. Lối thoát nạn có biển chỉ dẫn «LỐI THOÁT» bằng tiếng Việt, nhìn thấy được khi mất điện, tại mỗi tầng và mỗi khu vực làm việc.</w:t>
+      </w:r>
+    </w:p>
+    <w:p>
+      <w:pPr>
+        <w:spacing w:after="100" w:line="300"/>
+        <w:ind w:left="360"/>
+        <w:jc w:val="both"/>
+      </w:pPr>
+      <w:r>
+        <w:rPr>
+          <w:rFonts w:ascii="Times New Roman" w:cs="Times New Roman" w:eastAsia="Times New Roman" w:hAnsi="Times New Roman"/>
+          <w:b w:val="false"/>
+          <w:bCs w:val="false"/>
+          <w:i w:val="false"/>
+          <w:iCs w:val="false"/>
+          <w:sz w:val="24"/>
+          <w:szCs w:val="24"/>
+        </w:rPr>
+        <w:t xml:space="preserve">4. Sơ đồ thoát nạn có ký hiệu «Bạn đang ở đây», vị trí bình chữa cháy, lối thoát và điểm tập kết được treo tại lối ra vào, hành lang và khu vực làm việc chính.</w:t>
+      </w:r>
+    </w:p>
+    <w:p>
+      <w:pPr>
+        <w:spacing w:after="80" w:before="140" w:line="300"/>
+      </w:pPr>
+      <w:r>
+        <w:rPr>
+          <w:rFonts w:ascii="Times New Roman" w:cs="Times New Roman" w:eastAsia="Times New Roman" w:hAnsi="Times New Roman"/>
+          <w:b/>
+          <w:bCs/>
+          <w:sz w:val="24"/>
+          <w:szCs w:val="24"/>
+        </w:rPr>
+        <w:t xml:space="preserve">Điều 7. Tín hiệu báo động</w:t>
+      </w:r>
+    </w:p>
+    <w:p>
+      <w:pPr>
+        <w:spacing w:after="100" w:line="300"/>
+        <w:ind w:left="360"/>
+        <w:jc w:val="both"/>
+      </w:pPr>
+      <w:r>
+        <w:rPr>
+          <w:rFonts w:ascii="Times New Roman" w:cs="Times New Roman" w:eastAsia="Times New Roman" w:hAnsi="Times New Roman"/>
+          <w:b w:val="false"/>
+          <w:bCs w:val="false"/>
+          <w:i w:val="false"/>
+          <w:iCs w:val="false"/>
+          <w:sz w:val="24"/>
+          <w:szCs w:val="24"/>
+        </w:rPr>
+        <w:t xml:space="preserve">1. Tín hiệu báo cháy là chuông hoặc còi kêu liên tục, nghe rõ tại mọi vị trí trong cơ sở và khác với các tín hiệu thông thường khác.</w:t>
+      </w:r>
+    </w:p>
+    <w:p>
+      <w:pPr>
+        <w:spacing w:after="100" w:line="300"/>
+        <w:ind w:left="360"/>
+        <w:jc w:val="both"/>
+      </w:pPr>
+      <w:r>
+        <w:rPr>
+          <w:rFonts w:ascii="Times New Roman" w:cs="Times New Roman" w:eastAsia="Times New Roman" w:hAnsi="Times New Roman"/>
+          <w:b w:val="false"/>
+          <w:bCs w:val="false"/>
+          <w:i w:val="false"/>
+          <w:iCs w:val="false"/>
+          <w:sz w:val="24"/>
+          <w:szCs w:val="24"/>
+        </w:rPr>
+        <w:t xml:space="preserve">2. Nơi chưa có hệ thống báo cháy tự động (công trường, kho tạm) dùng còi cầm tay, kẻng hoặc hô lớn «Cháy!» làm tín hiệu thống nhất, được phổ biến cho mọi người ngay khi vào làm việc.</w:t>
+      </w:r>
+    </w:p>
+    <w:p>
+      <w:pPr>
+        <w:spacing w:after="100" w:line="300"/>
+        <w:ind w:left="360"/>
+        <w:jc w:val="both"/>
+      </w:pPr>
+      <w:r>
+        <w:rPr>
+          <w:rFonts w:ascii="Times New Roman" w:cs="Times New Roman" w:eastAsia="Times New Roman" w:hAnsi="Times New Roman"/>
+          <w:b w:val="false"/>
+          <w:bCs w:val="false"/>
+          <w:i w:val="false"/>
+          <w:iCs w:val="false"/>
+          <w:sz w:val="24"/>
+          <w:szCs w:val="24"/>
+        </w:rPr>
+        <w:t xml:space="preserve">3. Người phát hiện cháy ấn nút báo cháy gần nhất hoặc phát tín hiệu báo động ngay, không chờ xác nhận của cấp trên.</w:t>
+      </w:r>
+    </w:p>
+    <w:p>
+      <w:pPr>
+        <w:spacing w:after="140" w:before="260"/>
+        <w:jc w:val="center"/>
+      </w:pPr>
+      <w:r>
+        <w:rPr>
+          <w:rFonts w:ascii="Times New Roman" w:cs="Times New Roman" w:eastAsia="Times New Roman" w:hAnsi="Times New Roman"/>
+          <w:b/>
+          <w:bCs/>
+          <w:sz w:val="26"/>
+          <w:szCs w:val="26"/>
+        </w:rPr>
+        <w:t xml:space="preserve">CHƯƠNG III — ỨNG PHÓ TÌNH HUỐNG KHẨN CẤP</w:t>
+      </w:r>
+    </w:p>
+    <w:p>
+      <w:pPr>
+        <w:spacing w:after="80" w:before="140" w:line="300"/>
+      </w:pPr>
+      <w:r>
+        <w:rPr>
+          <w:rFonts w:ascii="Times New Roman" w:cs="Times New Roman" w:eastAsia="Times New Roman" w:hAnsi="Times New Roman"/>
+          <w:b/>
+          <w:bCs/>
+          <w:sz w:val="24"/>
+          <w:szCs w:val="24"/>
+        </w:rPr>
+        <w:t xml:space="preserve">Điều 8. Các tình huống khẩn cấp</w:t>
+      </w:r>
+    </w:p>
+    <w:p>
+      <w:pPr>
+        <w:spacing w:after="100" w:line="300"/>
+        <w:ind w:left="360"/>
+        <w:jc w:val="both"/>
+      </w:pPr>
+      <w:r>
+        <w:rPr>
+          <w:rFonts w:ascii="Times New Roman" w:cs="Times New Roman" w:eastAsia="Times New Roman" w:hAnsi="Times New Roman"/>
+          <w:b w:val="false"/>
+          <w:bCs w:val="false"/>
+          <w:i w:val="false"/>
+          <w:iCs w:val="false"/>
+          <w:sz w:val="24"/>
+          <w:szCs w:val="24"/>
+        </w:rPr>
+        <w:t xml:space="preserve">Các tình huống khẩn cấp gồm: cháy, nổ; tai nạn lao động nặng hoặc người cần cấp cứu y tế; tràn đổ, rò rỉ hóa chất, khí độc; ngạt, ngất trong không gian hạn chế; điện giật; thiên tai, ngập lụt và sự cố khẩn cấp tại nhà máy của khách hàng.</w:t>
+      </w:r>
+    </w:p>
+    <w:p>
+      <w:pPr>
+        <w:spacing w:after="80" w:before="140" w:line="300"/>
+      </w:pPr>
+      <w:r>
+        <w:rPr>
+          <w:rFonts w:ascii="Times New Roman" w:cs="Times New Roman" w:eastAsia="Times New Roman" w:hAnsi="Times New Roman"/>
+          <w:b/>
+          <w:bCs/>
+          <w:sz w:val="24"/>
+          <w:szCs w:val="24"/>
+        </w:rPr>
+        <w:t xml:space="preserve">Điều 9. Trình tự ứng phó chung</w:t>
+      </w:r>
+    </w:p>
+    <w:p>
+      <w:pPr>
+        <w:spacing w:after="100" w:line="300"/>
+        <w:ind w:left="360"/>
+        <w:jc w:val="both"/>
+      </w:pPr>
+      <w:r>
+        <w:rPr>
+          <w:rFonts w:ascii="Times New Roman" w:cs="Times New Roman" w:eastAsia="Times New Roman" w:hAnsi="Times New Roman"/>
+          <w:b w:val="false"/>
+          <w:bCs w:val="false"/>
+          <w:i w:val="false"/>
+          <w:iCs w:val="false"/>
+          <w:sz w:val="24"/>
+          <w:szCs w:val="24"/>
+        </w:rPr>
+        <w:t xml:space="preserve">1. Báo động cho những người xung quanh và báo ngay người quản lý trực tiếp, người phụ trách phòng cháy, chữa cháy.</w:t>
+      </w:r>
+    </w:p>
+    <w:p>
+      <w:pPr>
+        <w:spacing w:after="100" w:line="300"/>
+        <w:ind w:left="360"/>
+        <w:jc w:val="both"/>
+      </w:pPr>
+      <w:r>
+        <w:rPr>
+          <w:rFonts w:ascii="Times New Roman" w:cs="Times New Roman" w:eastAsia="Times New Roman" w:hAnsi="Times New Roman"/>
+          <w:b w:val="false"/>
+          <w:bCs w:val="false"/>
+          <w:i w:val="false"/>
+          <w:iCs w:val="false"/>
+          <w:sz w:val="24"/>
+          <w:szCs w:val="24"/>
+        </w:rPr>
+        <w:t xml:space="preserve">2. Gọi lực lượng chức năng khi cần: chữa cháy và cứu nạn, cứu hộ 114; cấp cứu y tế 115; công an 113.</w:t>
+      </w:r>
+    </w:p>
+    <w:p>
+      <w:pPr>
+        <w:spacing w:after="100" w:line="300"/>
+        <w:ind w:left="360"/>
+        <w:jc w:val="both"/>
+      </w:pPr>
+      <w:r>
+        <w:rPr>
+          <w:rFonts w:ascii="Times New Roman" w:cs="Times New Roman" w:eastAsia="Times New Roman" w:hAnsi="Times New Roman"/>
+          <w:b w:val="false"/>
+          <w:bCs w:val="false"/>
+          <w:i w:val="false"/>
+          <w:iCs w:val="false"/>
+          <w:sz w:val="24"/>
+          <w:szCs w:val="24"/>
+        </w:rPr>
+        <w:t xml:space="preserve">3. Nếu đám cháy nhỏ và an toàn, người đã được huấn luyện dùng bình chữa cháy dập lửa; không cố chữa cháy khi lửa lan nhanh, có khói độc hoặc có nguy cơ nổ.</w:t>
+      </w:r>
+    </w:p>
+    <w:p>
+      <w:pPr>
+        <w:spacing w:after="100" w:line="300"/>
+        <w:ind w:left="360"/>
+        <w:jc w:val="both"/>
+      </w:pPr>
+      <w:r>
+        <w:rPr>
+          <w:rFonts w:ascii="Times New Roman" w:cs="Times New Roman" w:eastAsia="Times New Roman" w:hAnsi="Times New Roman"/>
+          <w:b w:val="false"/>
+          <w:bCs w:val="false"/>
+          <w:i w:val="false"/>
+          <w:iCs w:val="false"/>
+          <w:sz w:val="24"/>
+          <w:szCs w:val="24"/>
+        </w:rPr>
+        <w:t xml:space="preserve">4. Sơ tán theo lối thoát nạn đến điểm tập kết; không dùng thang máy; giúp đỡ khách, người khuyết tật, phụ nữ mang thai.</w:t>
+      </w:r>
+    </w:p>
+    <w:p>
+      <w:pPr>
+        <w:spacing w:after="100" w:line="300"/>
+        <w:ind w:left="360"/>
+        <w:jc w:val="both"/>
+      </w:pPr>
+      <w:r>
+        <w:rPr>
+          <w:rFonts w:ascii="Times New Roman" w:cs="Times New Roman" w:eastAsia="Times New Roman" w:hAnsi="Times New Roman"/>
+          <w:b w:val="false"/>
+          <w:bCs w:val="false"/>
+          <w:i w:val="false"/>
+          <w:iCs w:val="false"/>
+          <w:sz w:val="24"/>
+          <w:szCs w:val="24"/>
+        </w:rPr>
+        <w:t xml:space="preserve">5. Trưởng bộ phận, chỉ huy công trình điểm danh tại điểm tập kết và báo ngay người còn thiếu cho lực lượng cứu nạn.</w:t>
+      </w:r>
+    </w:p>
+    <w:p>
+      <w:pPr>
+        <w:spacing w:after="100" w:line="300"/>
+        <w:ind w:left="360"/>
+        <w:jc w:val="both"/>
+      </w:pPr>
+      <w:r>
+        <w:rPr>
+          <w:rFonts w:ascii="Times New Roman" w:cs="Times New Roman" w:eastAsia="Times New Roman" w:hAnsi="Times New Roman"/>
+          <w:b w:val="false"/>
+          <w:bCs w:val="false"/>
+          <w:i w:val="false"/>
+          <w:iCs w:val="false"/>
+          <w:sz w:val="24"/>
+          <w:szCs w:val="24"/>
+        </w:rPr>
+        <w:t xml:space="preserve">6. Chỉ quay lại nơi làm việc khi người có thẩm quyền thông báo đã an toàn.</w:t>
+      </w:r>
+    </w:p>
+    <w:p>
+      <w:pPr>
+        <w:spacing w:after="80" w:before="140" w:line="300"/>
+      </w:pPr>
+      <w:r>
+        <w:rPr>
+          <w:rFonts w:ascii="Times New Roman" w:cs="Times New Roman" w:eastAsia="Times New Roman" w:hAnsi="Times New Roman"/>
+          <w:b/>
+          <w:bCs/>
+          <w:sz w:val="24"/>
+          <w:szCs w:val="24"/>
+        </w:rPr>
+        <w:t xml:space="preserve">Điều 10. Sơ cứu và sơ tán y tế</w:t>
+      </w:r>
+    </w:p>
+    <w:p>
+      <w:pPr>
+        <w:spacing w:after="100" w:line="300"/>
+        <w:ind w:left="360"/>
+        <w:jc w:val="both"/>
+      </w:pPr>
+      <w:r>
+        <w:rPr>
+          <w:rFonts w:ascii="Times New Roman" w:cs="Times New Roman" w:eastAsia="Times New Roman" w:hAnsi="Times New Roman"/>
+          <w:b w:val="false"/>
+          <w:bCs w:val="false"/>
+          <w:i w:val="false"/>
+          <w:iCs w:val="false"/>
+          <w:sz w:val="24"/>
+          <w:szCs w:val="24"/>
+        </w:rPr>
+        <w:t xml:space="preserve">1. Người đã được huấn luyện sơ cứu thực hiện sơ cứu ban đầu bằng túi sơ cứu tại chỗ; không di chuyển nạn nhân nghi chấn thương cột sống trừ khi đang nguy hiểm.</w:t>
+      </w:r>
+    </w:p>
+    <w:p>
+      <w:pPr>
+        <w:spacing w:after="100" w:line="300"/>
+        <w:ind w:left="360"/>
+        <w:jc w:val="both"/>
+      </w:pPr>
+      <w:r>
+        <w:rPr>
+          <w:rFonts w:ascii="Times New Roman" w:cs="Times New Roman" w:eastAsia="Times New Roman" w:hAnsi="Times New Roman"/>
+          <w:b w:val="false"/>
+          <w:bCs w:val="false"/>
+          <w:i w:val="false"/>
+          <w:iCs w:val="false"/>
+          <w:sz w:val="24"/>
+          <w:szCs w:val="24"/>
+        </w:rPr>
+        <w:t xml:space="preserve">2. Gọi 115 hoặc dùng phương tiện của Công ty đưa nạn nhân đến cơ sở y tế gần nhất; cử người đi cùng và báo cho gia đình.</w:t>
+      </w:r>
+    </w:p>
+    <w:p>
+      <w:pPr>
+        <w:spacing w:after="100" w:line="300"/>
+        <w:ind w:left="360"/>
+        <w:jc w:val="both"/>
+      </w:pPr>
+      <w:r>
+        <w:rPr>
+          <w:rFonts w:ascii="Times New Roman" w:cs="Times New Roman" w:eastAsia="Times New Roman" w:hAnsi="Times New Roman"/>
+          <w:b w:val="false"/>
+          <w:bCs w:val="false"/>
+          <w:i w:val="false"/>
+          <w:iCs w:val="false"/>
+          <w:sz w:val="24"/>
+          <w:szCs w:val="24"/>
+        </w:rPr>
+        <w:t xml:space="preserve">3. Danh sách số điện thoại khẩn cấp (114, 115, 113, cơ sở y tế gần nhất, Giám đốc, người phụ trách an toàn) được niêm yết tại văn phòng, kho và mỗi công trường.</w:t>
+      </w:r>
+    </w:p>
+    <w:p>
+      <w:pPr>
+        <w:spacing w:after="80" w:before="140" w:line="300"/>
+      </w:pPr>
+      <w:r>
+        <w:rPr>
+          <w:rFonts w:ascii="Times New Roman" w:cs="Times New Roman" w:eastAsia="Times New Roman" w:hAnsi="Times New Roman"/>
+          <w:b/>
+          <w:bCs/>
+          <w:sz w:val="24"/>
+          <w:szCs w:val="24"/>
+        </w:rPr>
+        <w:t xml:space="preserve">Điều 11. Ứng phó tràn đổ, rò rỉ hóa chất</w:t>
+      </w:r>
+    </w:p>
+    <w:p>
+      <w:pPr>
+        <w:spacing w:after="100" w:line="300"/>
+        <w:ind w:left="360"/>
+        <w:jc w:val="both"/>
+      </w:pPr>
+      <w:r>
+        <w:rPr>
+          <w:rFonts w:ascii="Times New Roman" w:cs="Times New Roman" w:eastAsia="Times New Roman" w:hAnsi="Times New Roman"/>
+          <w:b w:val="false"/>
+          <w:bCs w:val="false"/>
+          <w:i w:val="false"/>
+          <w:iCs w:val="false"/>
+          <w:sz w:val="24"/>
+          <w:szCs w:val="24"/>
+        </w:rPr>
+        <w:t xml:space="preserve">1. Cảnh báo, đưa người không có nhiệm vụ ra khỏi khu vực; mang đủ phương tiện bảo vệ cá nhân theo phiếu an toàn hóa chất trước khi xử lý.</w:t>
+      </w:r>
+    </w:p>
+    <w:p>
+      <w:pPr>
+        <w:spacing w:after="100" w:line="300"/>
+        <w:ind w:left="360"/>
+        <w:jc w:val="both"/>
+      </w:pPr>
+      <w:r>
+        <w:rPr>
+          <w:rFonts w:ascii="Times New Roman" w:cs="Times New Roman" w:eastAsia="Times New Roman" w:hAnsi="Times New Roman"/>
+          <w:b w:val="false"/>
+          <w:bCs w:val="false"/>
+          <w:i w:val="false"/>
+          <w:iCs w:val="false"/>
+          <w:sz w:val="24"/>
+          <w:szCs w:val="24"/>
+        </w:rPr>
+        <w:t xml:space="preserve">2. Ngăn nguồn rò rỉ nếu an toàn; khoanh vùng, dùng vật liệu thấm hút, không để hóa chất chảy vào cống, nguồn nước.</w:t>
+      </w:r>
+    </w:p>
+    <w:p>
+      <w:pPr>
+        <w:spacing w:after="100" w:line="300"/>
+        <w:ind w:left="360"/>
+        <w:jc w:val="both"/>
+      </w:pPr>
+      <w:r>
+        <w:rPr>
+          <w:rFonts w:ascii="Times New Roman" w:cs="Times New Roman" w:eastAsia="Times New Roman" w:hAnsi="Times New Roman"/>
+          <w:b w:val="false"/>
+          <w:bCs w:val="false"/>
+          <w:i w:val="false"/>
+          <w:iCs w:val="false"/>
+          <w:sz w:val="24"/>
+          <w:szCs w:val="24"/>
+        </w:rPr>
+        <w:t xml:space="preserve">3. Người bị hóa chất bắn vào mắt, da được rửa ngay bằng nước sạch ít nhất 15 phút tại trạm rửa mắt, vòi rửa khẩn cấp rồi đưa đi cơ sở y tế, mang theo phiếu an toàn hóa chất.</w:t>
+      </w:r>
+    </w:p>
+    <w:p>
+      <w:pPr>
+        <w:spacing w:after="100" w:line="300"/>
+        <w:ind w:left="360"/>
+        <w:jc w:val="both"/>
+      </w:pPr>
+      <w:r>
+        <w:rPr>
+          <w:rFonts w:ascii="Times New Roman" w:cs="Times New Roman" w:eastAsia="Times New Roman" w:hAnsi="Times New Roman"/>
+          <w:b w:val="false"/>
+          <w:bCs w:val="false"/>
+          <w:i w:val="false"/>
+          <w:iCs w:val="false"/>
+          <w:sz w:val="24"/>
+          <w:szCs w:val="24"/>
+        </w:rPr>
+        <w:t xml:space="preserve">4. Chất thải sau xử lý được thu gom, lưu chứa và chuyển giao như chất thải nguy hại.</w:t>
+      </w:r>
+    </w:p>
+    <w:p>
+      <w:pPr>
+        <w:spacing w:after="80" w:before="140" w:line="300"/>
+      </w:pPr>
+      <w:r>
+        <w:rPr>
+          <w:rFonts w:ascii="Times New Roman" w:cs="Times New Roman" w:eastAsia="Times New Roman" w:hAnsi="Times New Roman"/>
+          <w:b/>
+          <w:bCs/>
+          <w:sz w:val="24"/>
+          <w:szCs w:val="24"/>
+        </w:rPr>
+        <w:t xml:space="preserve">Điều 12. Ứng phó tại cơ sở của khách hàng</w:t>
+      </w:r>
+    </w:p>
+    <w:p>
+      <w:pPr>
+        <w:spacing w:after="100" w:line="300"/>
+        <w:ind w:left="360"/>
+        <w:jc w:val="both"/>
+      </w:pPr>
+      <w:r>
+        <w:rPr>
+          <w:rFonts w:ascii="Times New Roman" w:cs="Times New Roman" w:eastAsia="Times New Roman" w:hAnsi="Times New Roman"/>
+          <w:b w:val="false"/>
+          <w:bCs w:val="false"/>
+          <w:i w:val="false"/>
+          <w:iCs w:val="false"/>
+          <w:sz w:val="24"/>
+          <w:szCs w:val="24"/>
+        </w:rPr>
+        <w:t xml:space="preserve">1. Trước khi làm việc, chỉ huy công trình tìm hiểu và phổ biến cho tổ đội phương án ứng phó khẩn cấp của khách hàng: tín hiệu báo động, lối thoát nạn, điểm tập kết, số điện thoại khẩn cấp nội bộ.</w:t>
+      </w:r>
+    </w:p>
+    <w:p>
+      <w:pPr>
+        <w:spacing w:after="100" w:line="300"/>
+        <w:ind w:left="360"/>
+        <w:jc w:val="both"/>
+      </w:pPr>
+      <w:r>
+        <w:rPr>
+          <w:rFonts w:ascii="Times New Roman" w:cs="Times New Roman" w:eastAsia="Times New Roman" w:hAnsi="Times New Roman"/>
+          <w:b w:val="false"/>
+          <w:bCs w:val="false"/>
+          <w:i w:val="false"/>
+          <w:iCs w:val="false"/>
+          <w:sz w:val="24"/>
+          <w:szCs w:val="24"/>
+        </w:rPr>
+        <w:t xml:space="preserve">2. Khi có báo động, dừng công việc, đưa thiết bị về trạng thái an toàn nếu kịp và sơ tán theo hướng dẫn của khách hàng; điểm danh tổ đội và báo cho đầu mối của khách hàng.</w:t>
+      </w:r>
+    </w:p>
+    <w:p>
+      <w:pPr>
+        <w:spacing w:after="140" w:before="260"/>
+        <w:jc w:val="center"/>
+      </w:pPr>
+      <w:r>
+        <w:rPr>
+          <w:rFonts w:ascii="Times New Roman" w:cs="Times New Roman" w:eastAsia="Times New Roman" w:hAnsi="Times New Roman"/>
+          <w:b/>
+          <w:bCs/>
+          <w:sz w:val="26"/>
+          <w:szCs w:val="26"/>
+        </w:rPr>
+        <w:t xml:space="preserve">CHƯƠNG IV — HUẤN LUYỆN, DIỄN TẬP, HỒ SƠ VÀ ĐIỀU KHOẢN THI HÀNH</w:t>
+      </w:r>
+    </w:p>
+    <w:p>
+      <w:pPr>
+        <w:spacing w:after="80" w:before="140" w:line="300"/>
+      </w:pPr>
+      <w:r>
+        <w:rPr>
+          <w:rFonts w:ascii="Times New Roman" w:cs="Times New Roman" w:eastAsia="Times New Roman" w:hAnsi="Times New Roman"/>
+          <w:b/>
+          <w:bCs/>
+          <w:sz w:val="24"/>
+          <w:szCs w:val="24"/>
+        </w:rPr>
+        <w:t xml:space="preserve">Điều 13. Huấn luyện</w:t>
+      </w:r>
+    </w:p>
+    <w:p>
+      <w:pPr>
+        <w:spacing w:after="100" w:line="300"/>
+        <w:ind w:left="360"/>
+        <w:jc w:val="both"/>
+      </w:pPr>
+      <w:r>
+        <w:rPr>
+          <w:rFonts w:ascii="Times New Roman" w:cs="Times New Roman" w:eastAsia="Times New Roman" w:hAnsi="Times New Roman"/>
+          <w:b w:val="false"/>
+          <w:bCs w:val="false"/>
+          <w:i w:val="false"/>
+          <w:iCs w:val="false"/>
+          <w:sz w:val="24"/>
+          <w:szCs w:val="24"/>
+        </w:rPr>
+        <w:t xml:space="preserve">1. Người lao động mới được hướng dẫn về phòng cháy, lối thoát nạn và cách dùng bình chữa cháy trong tuần đầu làm việc.</w:t>
+      </w:r>
+    </w:p>
+    <w:p>
+      <w:pPr>
+        <w:spacing w:after="100" w:line="300"/>
+        <w:ind w:left="360"/>
+        <w:jc w:val="both"/>
+      </w:pPr>
+      <w:r>
+        <w:rPr>
+          <w:rFonts w:ascii="Times New Roman" w:cs="Times New Roman" w:eastAsia="Times New Roman" w:hAnsi="Times New Roman"/>
+          <w:b w:val="false"/>
+          <w:bCs w:val="false"/>
+          <w:i w:val="false"/>
+          <w:iCs w:val="false"/>
+          <w:sz w:val="24"/>
+          <w:szCs w:val="24"/>
+        </w:rPr>
+        <w:t xml:space="preserve">2. Người phụ trách và thành viên được phân công chữa cháy tại chỗ được huấn luyện nghiệp vụ phòng cháy, chữa cháy và cứu nạn, cứu hộ theo quy định.</w:t>
+      </w:r>
+    </w:p>
+    <w:p>
+      <w:pPr>
+        <w:spacing w:after="80" w:before="140" w:line="300"/>
+      </w:pPr>
+      <w:r>
+        <w:rPr>
+          <w:rFonts w:ascii="Times New Roman" w:cs="Times New Roman" w:eastAsia="Times New Roman" w:hAnsi="Times New Roman"/>
+          <w:b/>
+          <w:bCs/>
+          <w:sz w:val="24"/>
+          <w:szCs w:val="24"/>
+        </w:rPr>
+        <w:t xml:space="preserve">Điều 14. Diễn tập</w:t>
+      </w:r>
+    </w:p>
+    <w:p>
+      <w:pPr>
+        <w:spacing w:after="100" w:line="300"/>
+        <w:ind w:left="360"/>
+        <w:jc w:val="both"/>
+      </w:pPr>
+      <w:r>
+        <w:rPr>
+          <w:rFonts w:ascii="Times New Roman" w:cs="Times New Roman" w:eastAsia="Times New Roman" w:hAnsi="Times New Roman"/>
+          <w:b w:val="false"/>
+          <w:bCs w:val="false"/>
+          <w:i w:val="false"/>
+          <w:iCs w:val="false"/>
+          <w:sz w:val="24"/>
+          <w:szCs w:val="24"/>
+        </w:rPr>
+        <w:t xml:space="preserve">1. Công ty tổ chức hoặc tham gia diễn tập chữa cháy và sơ tán khẩn cấp ít nhất 01 lần/năm tại văn phòng, kho; tại công trường kéo dài trên 03 tháng tổ chức ít nhất 01 lần.</w:t>
+      </w:r>
+    </w:p>
+    <w:p>
+      <w:pPr>
+        <w:spacing w:after="100" w:line="300"/>
+        <w:ind w:left="360"/>
+        <w:jc w:val="both"/>
+      </w:pPr>
+      <w:r>
+        <w:rPr>
+          <w:rFonts w:ascii="Times New Roman" w:cs="Times New Roman" w:eastAsia="Times New Roman" w:hAnsi="Times New Roman"/>
+          <w:b w:val="false"/>
+          <w:bCs w:val="false"/>
+          <w:i w:val="false"/>
+          <w:iCs w:val="false"/>
+          <w:sz w:val="24"/>
+          <w:szCs w:val="24"/>
+        </w:rPr>
+        <w:t xml:space="preserve">2. Mỗi lần diễn tập có kịch bản, danh sách người tham gia, thời gian sơ tán, hình ảnh và biên bản rút kinh nghiệm.</w:t>
+      </w:r>
+    </w:p>
+    <w:p>
+      <w:pPr>
+        <w:spacing w:after="80" w:before="140" w:line="300"/>
+      </w:pPr>
+      <w:r>
+        <w:rPr>
+          <w:rFonts w:ascii="Times New Roman" w:cs="Times New Roman" w:eastAsia="Times New Roman" w:hAnsi="Times New Roman"/>
+          <w:b/>
+          <w:bCs/>
+          <w:sz w:val="24"/>
+          <w:szCs w:val="24"/>
+        </w:rPr>
+        <w:t xml:space="preserve">Điều 15. Hồ sơ</w:t>
+      </w:r>
+    </w:p>
+    <w:p>
+      <w:pPr>
+        <w:spacing w:after="100" w:line="300"/>
+        <w:ind w:left="360"/>
+        <w:jc w:val="both"/>
+      </w:pPr>
+      <w:r>
+        <w:rPr>
+          <w:rFonts w:ascii="Times New Roman" w:cs="Times New Roman" w:eastAsia="Times New Roman" w:hAnsi="Times New Roman"/>
+          <w:b w:val="false"/>
+          <w:bCs w:val="false"/>
+          <w:i w:val="false"/>
+          <w:iCs w:val="false"/>
+          <w:sz w:val="24"/>
+          <w:szCs w:val="24"/>
+        </w:rPr>
+        <w:t xml:space="preserve">Hồ sơ phòng cháy, chữa cháy và ứng phó khẩn cấp gồm: bản sao hồ sơ phòng cháy, chữa cháy của tòa nhà, kho; phương án chữa cháy, thoát nạn; quyết định phân công người phụ trách; sổ kiểm tra phương tiện; biên bản bảo dưỡng; danh sách huấn luyện; biên bản diễn tập; biên bản các sự cố đã xảy ra. Hồ sơ do người phụ trách lưu giữ và sẵn sàng xuất trình khi được kiểm tra.</w:t>
+      </w:r>
+    </w:p>
+    <w:p>
+      <w:pPr>
+        <w:spacing w:after="80" w:before="140" w:line="300"/>
+      </w:pPr>
+      <w:r>
+        <w:rPr>
+          <w:rFonts w:ascii="Times New Roman" w:cs="Times New Roman" w:eastAsia="Times New Roman" w:hAnsi="Times New Roman"/>
+          <w:b/>
+          <w:bCs/>
+          <w:sz w:val="24"/>
+          <w:szCs w:val="24"/>
+        </w:rPr>
+        <w:t xml:space="preserve">Điều 16. Xử lý vi phạm và hiệu lực thi hành</w:t>
+      </w:r>
+    </w:p>
+    <w:p>
+      <w:pPr>
+        <w:spacing w:after="100" w:line="300"/>
+        <w:ind w:left="360"/>
+        <w:jc w:val="both"/>
+      </w:pPr>
+      <w:r>
+        <w:rPr>
+          <w:rFonts w:ascii="Times New Roman" w:cs="Times New Roman" w:eastAsia="Times New Roman" w:hAnsi="Times New Roman"/>
+          <w:b w:val="false"/>
+          <w:bCs w:val="false"/>
+          <w:i w:val="false"/>
+          <w:iCs w:val="false"/>
+          <w:sz w:val="24"/>
+          <w:szCs w:val="24"/>
+        </w:rPr>
+        <w:t xml:space="preserve">1. Người vi phạm Quy định này bị xử lý kỷ luật theo Nội quy lao động; trường hợp gây hậu quả nghiêm trọng bị xử lý theo quy định của pháp luật.</w:t>
+      </w:r>
+    </w:p>
+    <w:p>
+      <w:pPr>
+        <w:spacing w:after="100" w:line="300"/>
+        <w:ind w:left="360"/>
+        <w:jc w:val="both"/>
+      </w:pPr>
+      <w:r>
+        <w:rPr>
+          <w:rFonts w:ascii="Times New Roman" w:cs="Times New Roman" w:eastAsia="Times New Roman" w:hAnsi="Times New Roman"/>
+          <w:b w:val="false"/>
+          <w:bCs w:val="false"/>
+          <w:i w:val="false"/>
+          <w:iCs w:val="false"/>
+          <w:sz w:val="24"/>
+          <w:szCs w:val="24"/>
+        </w:rPr>
+        <w:t xml:space="preserve">2. Quy định này có hiệu lực kể từ ngày ký, được niêm yết và phổ biến đến toàn thể người lao động; mọi sửa đổi, bổ sung do Giám đốc quyết định.</w:t>
+      </w:r>
+    </w:p>
+    <w:p>
+      <w:pPr>
+        <w:spacing w:before="400"/>
+      </w:pPr>
+      <w:r>
+        <w:rPr>
+          <w:rFonts w:ascii="Times New Roman" w:cs="Times New Roman" w:eastAsia="Times New Roman" w:hAnsi="Times New Roman"/>
+        </w:rPr>
+        <w:t xml:space="preserve"/>
+      </w:r>
+    </w:p>
+    <w:tbl>
+      <w:tblPr>
+        <w:tblW w:type="auto" w:w="100"/>
+        <w:tblBorders>
+          <w:top w:val="none"/>
+          <w:left w:val="none"/>
+          <w:bottom w:val="none"/>
+          <w:right w:val="none"/>
+          <w:insideH w:val="none"/>
+          <w:insideV w:val="none"/>
+        </w:tblBorders>
+      </w:tblPr>
+      <w:tblGrid>
+        <w:gridCol w:w="9600"/>
+      </w:tblGrid>
+      <w:tr>
+        <w:tc>
+          <w:tcPr>
+            <w:tcW w:type="dxa" w:w="9600"/>
+            <w:tcBorders>
+              <w:top w:val="none"/>
+              <w:left w:val="none"/>
+              <w:bottom w:val="none"/>
+              <w:right w:val="none"/>
+            </w:tcBorders>
+          </w:tcPr>
+          <w:p>
+            <w:pPr>
+              <w:jc w:val="right"/>
+            </w:pPr>
+            <w:r>
+              <w:rPr>
+                <w:rFonts w:ascii="Times New Roman" w:cs="Times New Roman" w:eastAsia="Times New Roman" w:hAnsi="Times New Roman"/>
+                <w:b/>
+                <w:bCs/>
+                <w:sz w:val="24"/>
+                <w:szCs w:val="24"/>
+              </w:rPr>
+              <w:t xml:space="preserve">GIÁM ĐỐC</w:t>
+            </w:r>
+          </w:p>
+          <w:p>
+            <w:pPr>
+              <w:spacing w:after="900"/>
+              <w:jc w:val="right"/>
+            </w:pPr>
+            <w:r>
+              <w:rPr>
+                <w:rFonts w:ascii="Times New Roman" w:cs="Times New Roman" w:eastAsia="Times New Roman" w:hAnsi="Times New Roman"/>
+                <w:i/>
+                <w:iCs/>
+                <w:sz w:val="22"/>
+                <w:szCs w:val="22"/>
+              </w:rPr>
+              <w:t xml:space="preserve">(Ký tên, đóng dấu)</w:t>
+            </w:r>
+          </w:p>
+          <w:p>
+            <w:pPr>
+              <w:jc w:val="right"/>
+            </w:pPr>
+            <w:r>
+              <w:rPr>
+                <w:rFonts w:ascii="Times New Roman" w:cs="Times New Roman" w:eastAsia="Times New Roman" w:hAnsi="Times New Roman"/>
+                <w:b/>
+                <w:bCs/>
+                <w:sz w:val="24"/>
+                <w:szCs w:val="24"/>
+              </w:rPr>
+              <w:t xml:space="preserve">NGUYỄN LÊ HIẾU</w:t>
+            </w:r>
+          </w:p>
+        </w:tc>
+      </w:tr>
+    </w:tbl>
+    <w:p>
+      <w:pPr>
+        <w:spacing w:before="0" w:after="0" w:line="20" w:lineRule="exact"/>
+        <w:rPr>
+          <w:sz w:val="2"/>
+        </w:rPr>
+      </w:pPr>
+    </w:p>
     <w:sectPr>
       <w:pgSz w:w="11906" w:h="16838" w:orient="portrait"/>
       <w:pgMar w:top="1134" w:right="850" w:bottom="1134" w:left="1418" w:header="708" w:footer="708" w:gutter="0"/>

</xml_diff>

<commit_message>
Quy chế: bổ sung theo đối soát audit Coats (CLARITY) + đánh số ban hành
- ATVSLĐ: Điều 4 k9 quan trắc môi trường lao động; Điều 15 đổi tên, thêm k5 môi trường làm việc (chiếu sáng, sàn khô, 5S), k6 vệ sinh
- TDNV: Điều 4 k4 mẫu HĐLĐ tiếng Việt, quyền chấm dứt hai bên; k5 đăng ký BHXH/BHYT/BHTN từ tháng đầu
- Nội quy: Điều 26 k5 an ninh khi vận chuyển hàng giá trị cao, hóa chất
- CSTT: Phần I Mục 2 thêm kiểm soát nội bộ (rà soát chi phí hằng quý) và thẩm định đối tác; Phụ lục D Phiếu thẩm định đối tác
- Đánh số Quyết định <MÃ>-01-0926 ngày 01/09/2026 cho 14 văn bản
- Thẻ quy chế: BVDLCN ghi Luật 91/2025/QH15; cập nhật điểm chính, mục lục, số phụ lục CSTT
- Sinh lại quy_che_toan_van.json bằng scripts/tach_quy_che.py

Co-Authored-By: Claude Opus 5.5 <noreply@anthropic.com>
Claude-Session: https://claude.ai/code/session_017HhwxHfg9f3QJy9Gq45sT8
</commit_message>
<xml_diff>
--- a/so_tay_quy_che.docx
+++ b/so_tay_quy_che.docx
@@ -1400,7 +1400,7 @@
           <w:sz w:val="24"/>
           <w:szCs w:val="24"/>
         </w:rPr>
-        <w:t xml:space="preserve">Số: ......../2026/NQLĐ-SV</w:t>
+        <w:t>Số: NQLĐ-01-0926</w:t>
       </w:r>
     </w:p>
     <w:p>
@@ -1464,7 +1464,7 @@
           <w:sz w:val="22"/>
           <w:szCs w:val="22"/>
         </w:rPr>
-        <w:t xml:space="preserve">(Ban hành kèm theo Quyết định số ......../2026/QĐ-SV ngày ...... tháng ...... năm 2026 của Giám đốc Công ty TNHH Giải pháp Kỹ thuật Sóng Việt)</w:t>
+        <w:t>(Ban hành kèm theo Quyết định số NQLĐ-01-0926 ngày 01 tháng 09 năm 2026 của Giám đốc Công ty TNHH Giải pháp Kỹ thuật Sóng Việt)</w:t>
       </w:r>
     </w:p>
     <w:p>
@@ -3826,6 +3826,25 @@
           <w:szCs w:val="24"/>
         </w:rPr>
         <w:t xml:space="preserve">4. Khi kết thúc dự án, hai bên kiểm kê, lập biên bản bàn giao trả, đối chiếu với phiếu bàn giao ban đầu và ký xác nhận.</w:t>
+      </w:r>
+    </w:p>
+    <w:p>
+      <w:pPr>
+        <w:spacing w:after="100" w:line="300"/>
+        <w:ind w:left="360"/>
+        <w:jc w:val="both"/>
+      </w:pPr>
+      <w:r>
+        <w:rPr>
+          <w:rFonts w:ascii="Times New Roman" w:cs="Times New Roman" w:eastAsia="Times New Roman" w:hAnsi="Times New Roman"/>
+          <w:b w:val="false"/>
+          <w:bCs w:val="false"/>
+          <w:i w:val="false"/>
+          <w:iCs w:val="false"/>
+          <w:sz w:val="24"/>
+          <w:szCs w:val="24"/>
+        </w:rPr>
+        <w:t>5. Vận chuyển thiết bị, vật tư có giá trị cao (màng lọc, thiết bị đo, tủ điện, bơm) hoặc hóa chất nguy hiểm: lập phiếu xuất kho kèm danh mục; chằng buộc, khóa hoặc niêm phong thùng xe; chỉ dùng xe của Công ty hoặc đơn vị vận chuyển có hợp đồng; lô hàng có giá trị từ 100.000.000 đồng trở lên được mua bảo hiểm hàng hóa. Người áp tải đi đúng lộ trình đã báo, không để xe có hàng không người trông coi và bàn giao có ký nhận tại nơi nhận.</w:t>
       </w:r>
     </w:p>
     <w:p>
@@ -6125,7 +6144,7 @@
           <w:sz w:val="24"/>
           <w:szCs w:val="24"/>
         </w:rPr>
-        <w:t xml:space="preserve">Số: ......../2026/TBL-SV</w:t>
+        <w:t>Số: TBL-01-0926</w:t>
       </w:r>
     </w:p>
     <w:p>
@@ -6189,7 +6208,7 @@
           <w:sz w:val="22"/>
           <w:szCs w:val="22"/>
         </w:rPr>
-        <w:t xml:space="preserve">(Ban hành kèm theo Quyết định số ......../2026/QĐ-SV ngày ...... tháng ...... năm 2026 của Giám đốc Công ty TNHH Giải pháp Kỹ thuật Sóng Việt)</w:t>
+        <w:t>(Ban hành kèm theo Quyết định số TBL-01-0926 ngày 01 tháng 09 năm 2026 của Giám đốc Công ty TNHH Giải pháp Kỹ thuật Sóng Việt)</w:t>
       </w:r>
     </w:p>
     <w:p>
@@ -12565,7 +12584,7 @@
           <w:sz w:val="24"/>
           <w:szCs w:val="24"/>
         </w:rPr>
-        <w:t xml:space="preserve">Số: ......../2026/QCT-SV</w:t>
+        <w:t>Số: QCT-01-0926</w:t>
       </w:r>
     </w:p>
     <w:p>
@@ -12629,7 +12648,7 @@
           <w:sz w:val="22"/>
           <w:szCs w:val="22"/>
         </w:rPr>
-        <w:t xml:space="preserve">(Ban hành kèm theo Quyết định số ......../2026/QĐ-SV ngày ...... tháng ...... năm 2026 của Giám đốc Công ty TNHH Giải pháp Kỹ thuật Sóng Việt)</w:t>
+        <w:t>(Ban hành kèm theo Quyết định số QCT-01-0926 ngày 01 tháng 09 năm 2026 của Giám đốc Công ty TNHH Giải pháp Kỹ thuật Sóng Việt)</w:t>
       </w:r>
     </w:p>
     <w:p>
@@ -14562,7 +14581,7 @@
           <w:sz w:val="24"/>
           <w:szCs w:val="24"/>
         </w:rPr>
-        <w:t xml:space="preserve">Số: ......../2026/QCDC-SV</w:t>
+        <w:t>Số: QCDC-01-0926</w:t>
       </w:r>
     </w:p>
     <w:p>
@@ -14626,7 +14645,7 @@
           <w:sz w:val="22"/>
           <w:szCs w:val="22"/>
         </w:rPr>
-        <w:t xml:space="preserve">(Ban hành kèm theo Quyết định số ......../2026/QĐ-SV ngày ...... tháng ...... năm 2026 của Giám đốc Công ty TNHH Giải pháp Kỹ thuật Sóng Việt)</w:t>
+        <w:t>(Ban hành kèm theo Quyết định số QCDC-01-0926 ngày 01 tháng 09 năm 2026 của Giám đốc Công ty TNHH Giải pháp Kỹ thuật Sóng Việt)</w:t>
       </w:r>
     </w:p>
     <w:p>
@@ -16311,7 +16330,7 @@
           <w:sz w:val="24"/>
           <w:szCs w:val="24"/>
         </w:rPr>
-        <w:t xml:space="preserve">Số: ......../2026/ATVSLĐ-SV</w:t>
+        <w:t>Số: ATVSLĐ-01-0926</w:t>
       </w:r>
     </w:p>
     <w:p>
@@ -16375,7 +16394,7 @@
           <w:sz w:val="22"/>
           <w:szCs w:val="22"/>
         </w:rPr>
-        <w:t xml:space="preserve">(Ban hành kèm theo Quyết định số ......../2026/QĐ-SV ngày ...... tháng ...... năm 2026 của Giám đốc Công ty TNHH Giải pháp Kỹ thuật Sóng Việt)</w:t>
+        <w:t>(Ban hành kèm theo Quyết định số ATVSLĐ-01-0926 ngày 01 tháng 09 năm 2026 của Giám đốc Công ty TNHH Giải pháp Kỹ thuật Sóng Việt)</w:t>
       </w:r>
     </w:p>
     <w:p>
@@ -16805,7 +16824,26 @@
           <w:sz w:val="24"/>
           <w:szCs w:val="24"/>
         </w:rPr>
-        <w:t xml:space="preserve">8. Khai báo, điều tra, thống kê, báo cáo tai nạn lao động, sự cố kỹ thuật gây mất an toàn theo quy định.</w:t>
+        <w:t>8. Khai báo, điều tra, thống kê, báo cáo tai nạn lao động, sự cố kỹ thuật gây mất an toàn theo quy định;</w:t>
+      </w:r>
+    </w:p>
+    <w:p>
+      <w:pPr>
+        <w:spacing w:after="100" w:line="300"/>
+        <w:ind w:left="720"/>
+        <w:jc w:val="both"/>
+      </w:pPr>
+      <w:r>
+        <w:rPr>
+          <w:rFonts w:ascii="Times New Roman" w:cs="Times New Roman" w:eastAsia="Times New Roman" w:hAnsi="Times New Roman"/>
+          <w:b w:val="false"/>
+          <w:bCs w:val="false"/>
+          <w:i w:val="false"/>
+          <w:iCs w:val="false"/>
+          <w:sz w:val="24"/>
+          <w:szCs w:val="24"/>
+        </w:rPr>
+        <w:t>9. Tổ chức quan trắc môi trường lao động ít nhất 01 lần/năm tại nơi làm việc có yếu tố có hại (hóa chất, tiếng ồn, vi khí hậu, chiếu sáng) do tổ chức đủ điều kiện thực hiện; công khai kết quả cho người lao động và áp dụng biện pháp cải thiện khi vượt giới hạn cho phép.</w:t>
       </w:r>
     </w:p>
     <w:p>
@@ -18855,7 +18893,7 @@
           <w:sz w:val="24"/>
           <w:szCs w:val="24"/>
         </w:rPr>
-        <w:t xml:space="preserve">Điều 15. Máy móc, thiết bị và hệ thống điện</w:t>
+        <w:t>Điều 15. Máy móc, thiết bị, hệ thống điện và môi trường làm việc</w:t>
       </w:r>
     </w:p>
     <w:p>
@@ -18932,6 +18970,44 @@
           <w:szCs w:val="24"/>
         </w:rPr>
         <w:t xml:space="preserve">4. Dụng cụ điện cầm tay, dây nối dài sử dụng ngoài trời hoặc nơi ẩm ướt phải được cấp nguồn qua thiết bị chống dòng rò.</w:t>
+      </w:r>
+    </w:p>
+    <w:p>
+      <w:pPr>
+        <w:spacing w:after="100" w:line="300"/>
+        <w:ind w:left="360"/>
+        <w:jc w:val="both"/>
+      </w:pPr>
+      <w:r>
+        <w:rPr>
+          <w:rFonts w:ascii="Times New Roman" w:cs="Times New Roman" w:eastAsia="Times New Roman" w:hAnsi="Times New Roman"/>
+          <w:b w:val="false"/>
+          <w:bCs w:val="false"/>
+          <w:i w:val="false"/>
+          <w:iCs w:val="false"/>
+          <w:sz w:val="24"/>
+          <w:szCs w:val="24"/>
+        </w:rPr>
+        <w:t>5. Khu vực làm việc, vận hành thiết bị phải đủ chiếu sáng, thông gió và nhiệt độ phù hợp; sàn khô ráo, không trơn trượt (lau ngay khi có nước, dầu, hóa chất rơi vãi); lối đi, lối thoát thông thoáng; vật tư, dụng cụ sắp xếp gọn gàng theo 5S. Người quản lý bộ phận, chỉ huy công trình kiểm tra trước khi bắt đầu công việc và dừng công việc khi điều kiện không bảo đảm.</w:t>
+      </w:r>
+    </w:p>
+    <w:p>
+      <w:pPr>
+        <w:spacing w:after="100" w:line="300"/>
+        <w:ind w:left="360"/>
+        <w:jc w:val="both"/>
+      </w:pPr>
+      <w:r>
+        <w:rPr>
+          <w:rFonts w:ascii="Times New Roman" w:cs="Times New Roman" w:eastAsia="Times New Roman" w:hAnsi="Times New Roman"/>
+          <w:b w:val="false"/>
+          <w:bCs w:val="false"/>
+          <w:i w:val="false"/>
+          <w:iCs w:val="false"/>
+          <w:sz w:val="24"/>
+          <w:szCs w:val="24"/>
+        </w:rPr>
+        <w:t>6. Văn phòng, kho, công trường có nước uống sạch, nhà vệ sinh sạch, đủ nước và xà phòng; khu ăn uống, pha chế và phòng thay đồ (nếu có) được vệ sinh hằng ngày; vệ sinh tổng thể ít nhất 01 lần/tháng và ghi vào lịch vệ sinh.</w:t>
       </w:r>
     </w:p>
     <w:p>
@@ -19619,7 +19695,7 @@
           <w:sz w:val="24"/>
           <w:szCs w:val="24"/>
         </w:rPr>
-        <w:t xml:space="preserve">Số: ......../2026/BVDLCN-SV</w:t>
+        <w:t>Số: BVDLCN-01-0926</w:t>
       </w:r>
     </w:p>
     <w:p>
@@ -19683,7 +19759,7 @@
           <w:sz w:val="22"/>
           <w:szCs w:val="22"/>
         </w:rPr>
-        <w:t xml:space="preserve">(Ban hành kèm theo Quyết định số ......../2026/QĐ-SV ngày ...... tháng ...... năm 2026 của Giám đốc Công ty TNHH Giải pháp Kỹ thuật Sóng Việt)</w:t>
+        <w:t>(Ban hành kèm theo Quyết định số BVDLCN-01-0926 ngày 01 tháng 09 năm 2026 của Giám đốc Công ty TNHH Giải pháp Kỹ thuật Sóng Việt)</w:t>
       </w:r>
     </w:p>
     <w:p>
@@ -20788,7 +20864,7 @@
           <w:sz w:val="24"/>
           <w:szCs w:val="24"/>
         </w:rPr>
-        <w:t xml:space="preserve">Số: ......../2026/CTP-SV</w:t>
+        <w:t>Số: CTP-01-0926</w:t>
       </w:r>
     </w:p>
     <w:p>
@@ -20852,7 +20928,7 @@
           <w:sz w:val="22"/>
           <w:szCs w:val="22"/>
         </w:rPr>
-        <w:t xml:space="preserve">(Ban hành kèm theo Quyết định số ......../2026/QĐ-SV ngày ...... tháng ...... năm 2026 của Giám đốc Công ty TNHH Giải pháp Kỹ thuật Sóng Việt)</w:t>
+        <w:t>(Ban hành kèm theo Quyết định số CTP-01-0926 ngày 01 tháng 09 năm 2026 của Giám đốc Công ty TNHH Giải pháp Kỹ thuật Sóng Việt)</w:t>
       </w:r>
     </w:p>
     <w:p>
@@ -21928,7 +22004,7 @@
           <w:sz w:val="24"/>
           <w:szCs w:val="24"/>
         </w:rPr>
-        <w:t xml:space="preserve">Số: ......../2026/UXLI-SV</w:t>
+        <w:t>Số: UXLI-01-0926</w:t>
       </w:r>
     </w:p>
     <w:p>
@@ -21992,7 +22068,7 @@
           <w:sz w:val="22"/>
           <w:szCs w:val="22"/>
         </w:rPr>
-        <w:t xml:space="preserve">(Ban hành kèm theo Quyết định số ......../2026/QĐ-SV ngày ...... tháng ...... năm 2026 của Giám đốc Công ty TNHH Giải pháp Kỹ thuật Sóng Việt)</w:t>
+        <w:t>(Ban hành kèm theo Quyết định số UXLI-01-0926 ngày 01 tháng 09 năm 2026 của Giám đốc Công ty TNHH Giải pháp Kỹ thuật Sóng Việt)</w:t>
       </w:r>
     </w:p>
     <w:p>
@@ -22771,7 +22847,7 @@
           <w:sz w:val="24"/>
           <w:szCs w:val="24"/>
         </w:rPr>
-        <w:t xml:space="preserve">Số: ......../2026/PCPD-SV</w:t>
+        <w:t>Số: PCPD-01-0926</w:t>
       </w:r>
     </w:p>
     <w:p>
@@ -22835,7 +22911,7 @@
           <w:sz w:val="22"/>
           <w:szCs w:val="22"/>
         </w:rPr>
-        <w:t xml:space="preserve">(Ban hành kèm theo Quyết định số ......../2026/QĐ-SV ngày ...... tháng ...... năm 2026 của Giám đốc Công ty TNHH Giải pháp Kỹ thuật Sóng Việt)</w:t>
+        <w:t>(Ban hành kèm theo Quyết định số PCPD-01-0926 ngày 01 tháng 09 năm 2026 của Giám đốc Công ty TNHH Giải pháp Kỹ thuật Sóng Việt)</w:t>
       </w:r>
     </w:p>
     <w:p>
@@ -24425,7 +24501,7 @@
           <w:sz w:val="24"/>
           <w:szCs w:val="24"/>
         </w:rPr>
-        <w:t xml:space="preserve">Số: ......../2026/MHNCC-SV</w:t>
+        <w:t>Số: MHNCC-01-0926</w:t>
       </w:r>
     </w:p>
     <w:p>
@@ -24489,7 +24565,7 @@
           <w:sz w:val="22"/>
           <w:szCs w:val="22"/>
         </w:rPr>
-        <w:t xml:space="preserve">(Ban hành kèm theo Quyết định số ......../2026/QĐ-SV ngày ...... tháng ...... năm 2026 của Giám đốc Công ty TNHH Giải pháp Kỹ thuật Sóng Việt)</w:t>
+        <w:t>(Ban hành kèm theo Quyết định số MHNCC-01-0926 ngày 01 tháng 09 năm 2026 của Giám đốc Công ty TNHH Giải pháp Kỹ thuật Sóng Việt)</w:t>
       </w:r>
     </w:p>
     <w:p>
@@ -25209,7 +25285,7 @@
           <w:sz w:val="24"/>
           <w:szCs w:val="24"/>
         </w:rPr>
-        <w:t xml:space="preserve">Số: ......../2026/QLDA-SV</w:t>
+        <w:t>Số: QLDA-01-0926</w:t>
       </w:r>
     </w:p>
     <w:p>
@@ -25273,7 +25349,7 @@
           <w:sz w:val="22"/>
           <w:szCs w:val="22"/>
         </w:rPr>
-        <w:t xml:space="preserve">(Ban hành kèm theo Quyết định số ......../2026/QĐ-SV ngày ...... tháng ...... năm 2026 của Giám đốc Công ty TNHH Giải pháp Kỹ thuật Sóng Việt)</w:t>
+        <w:t>(Ban hành kèm theo Quyết định số QLDA-01-0926 ngày 01 tháng 09 năm 2026 của Giám đốc Công ty TNHH Giải pháp Kỹ thuật Sóng Việt)</w:t>
       </w:r>
     </w:p>
     <w:p>
@@ -26148,7 +26224,7 @@
           <w:sz w:val="24"/>
           <w:szCs w:val="24"/>
         </w:rPr>
-        <w:t xml:space="preserve">Số: ......../2026/CT-SV</w:t>
+        <w:t>Số: CT-01-0926</w:t>
       </w:r>
     </w:p>
     <w:p>
@@ -26212,7 +26288,7 @@
           <w:sz w:val="22"/>
           <w:szCs w:val="22"/>
         </w:rPr>
-        <w:t xml:space="preserve">(Ban hành kèm theo Quyết định số ......../2026/QĐ-SV ngày ...... tháng ...... năm 2026 của Giám đốc Công ty TNHH Giải pháp Kỹ thuật Sóng Việt)</w:t>
+        <w:t>(Ban hành kèm theo Quyết định số CT-01-0926 ngày 01 tháng 09 năm 2026 của Giám đốc Công ty TNHH Giải pháp Kỹ thuật Sóng Việt)</w:t>
       </w:r>
     </w:p>
     <w:p>
@@ -26817,7 +26893,7 @@
           <w:sz w:val="24"/>
           <w:szCs w:val="24"/>
         </w:rPr>
-        <w:t xml:space="preserve">Số: ......../2026/TDNV-SV</w:t>
+        <w:t>Số: TDNV-01-0926</w:t>
       </w:r>
     </w:p>
     <w:p>
@@ -26881,7 +26957,7 @@
           <w:sz w:val="22"/>
           <w:szCs w:val="22"/>
         </w:rPr>
-        <w:t xml:space="preserve">(Ban hành kèm theo Quyết định số ......../2026/QĐ-SV ngày ...... tháng ...... năm 2026 của Giám đốc Công ty TNHH Giải pháp Kỹ thuật Sóng Việt)</w:t>
+        <w:t>(Ban hành kèm theo Quyết định số TDNV-01-0926 ngày 01 tháng 09 năm 2026 của Giám đốc Công ty TNHH Giải pháp Kỹ thuật Sóng Việt)</w:t>
       </w:r>
     </w:p>
     <w:p>
@@ -27199,6 +27275,44 @@
           <w:szCs w:val="24"/>
         </w:rPr>
         <w:t xml:space="preserve">3. Khi tiếp nhận, bộ phận Hành chính – Nhân sự đối chiếu bản gốc Căn cước/căn cước công dân để xác minh người lao động đủ 18 tuổi, lưu bản sao và trả lại bản gốc ngay. Công ty không giữ bản chính giấy tờ tùy thân, văn bằng, chứng chỉ của người lao động; không yêu cầu đặt cọc, ký quỹ.</w:t>
+      </w:r>
+    </w:p>
+    <w:p>
+      <w:pPr>
+        <w:spacing w:after="100" w:line="300"/>
+        <w:ind w:left="360"/>
+        <w:jc w:val="both"/>
+      </w:pPr>
+      <w:r>
+        <w:rPr>
+          <w:rFonts w:ascii="Times New Roman" w:cs="Times New Roman" w:eastAsia="Times New Roman" w:hAnsi="Times New Roman"/>
+          <w:b w:val="false"/>
+          <w:bCs w:val="false"/>
+          <w:i w:val="false"/>
+          <w:iCs w:val="false"/>
+          <w:sz w:val="24"/>
+          <w:szCs w:val="24"/>
+        </w:rPr>
+        <w:t>4. Hợp đồng lao động lập theo mẫu của Công ty bằng tiếng Việt, có đủ nội dung theo Điều 21 Bộ luật Lao động, ghi rõ quyền chấm dứt hợp đồng của cả hai bên (Điều 34–36) và thời hạn báo trước. Bộ phận Hành chính – Nhân sự giải thích các điều khoản trước khi ký; người lao động giữ 01 bản và ký xác nhận đã được giải thích, hiểu rõ nội dung.</w:t>
+      </w:r>
+    </w:p>
+    <w:p>
+      <w:pPr>
+        <w:spacing w:after="100" w:line="300"/>
+        <w:ind w:left="360"/>
+        <w:jc w:val="both"/>
+      </w:pPr>
+      <w:r>
+        <w:rPr>
+          <w:rFonts w:ascii="Times New Roman" w:cs="Times New Roman" w:eastAsia="Times New Roman" w:hAnsi="Times New Roman"/>
+          <w:b w:val="false"/>
+          <w:bCs w:val="false"/>
+          <w:i w:val="false"/>
+          <w:iCs w:val="false"/>
+          <w:sz w:val="24"/>
+          <w:szCs w:val="24"/>
+        </w:rPr>
+        <w:t>5. Công ty đăng ký tham gia bảo hiểm xã hội, bảo hiểm y tế, bảo hiểm thất nghiệp bắt buộc cho mọi người lao động có hợp đồng lao động từ đủ 01 tháng trở lên, tính từ tháng bắt đầu làm việc; hằng tháng đối chiếu danh sách tham gia với bảng lương. Người lao động làm việc tại công trường được mua thêm bảo hiểm tai nạn theo yêu cầu của dự án.</w:t>
       </w:r>
     </w:p>
     <w:p>
@@ -29133,6 +29247,74 @@
     </w:p>
     <w:p>
       <w:pPr>
+        <w:spacing w:after="100" w:line="300" w:lineRule="auto"/>
+        <w:ind w:left="360"/>
+        <w:jc w:val="both"/>
+      </w:pPr>
+      <w:r>
+        <w:rPr>
+          <w:rFonts w:ascii="Times New Roman" w:hAnsi="Times New Roman" w:eastAsia="Times New Roman" w:cs="Times New Roman"/>
+          <w:b w:val="0"/>
+          <w:i w:val="0"/>
+          <w:sz w:val="24"/>
+        </w:rPr>
+        <w:t xml:space="preserve">– </w:t>
+      </w:r>
+      <w:r>
+        <w:rPr>
+          <w:rFonts w:ascii="Times New Roman" w:hAnsi="Times New Roman" w:eastAsia="Times New Roman" w:cs="Times New Roman"/>
+          <w:b/>
+          <w:i w:val="0"/>
+          <w:sz w:val="24"/>
+        </w:rPr>
+        <w:t>Kiểm soát nội bộ:</w:t>
+      </w:r>
+      <w:r>
+        <w:rPr>
+          <w:rFonts w:ascii="Times New Roman" w:hAnsi="Times New Roman" w:eastAsia="Times New Roman" w:cs="Times New Roman"/>
+          <w:b w:val="0"/>
+          <w:i w:val="0"/>
+          <w:sz w:val="24"/>
+        </w:rPr>
+        <w:t xml:space="preserve"> hằng quý, Kế toán rà soát các khoản chi tiếp khách, quà tặng, hoa hồng, môi giới, tài trợ và khoản chi không có hóa đơn, đối chiếu với Sổ đăng ký quà tặng và phê duyệt; khoản bất thường báo Đầu mối tuân thủ và Giám đốc. Kết quả rà soát lập biên bản, lưu ít nhất 3 năm.</w:t>
+      </w:r>
+    </w:p>
+    <w:p>
+      <w:pPr>
+        <w:spacing w:after="100" w:line="300" w:lineRule="auto"/>
+        <w:ind w:left="360"/>
+        <w:jc w:val="both"/>
+      </w:pPr>
+      <w:r>
+        <w:rPr>
+          <w:rFonts w:ascii="Times New Roman" w:hAnsi="Times New Roman" w:eastAsia="Times New Roman" w:cs="Times New Roman"/>
+          <w:b w:val="0"/>
+          <w:i w:val="0"/>
+          <w:sz w:val="24"/>
+        </w:rPr>
+        <w:t xml:space="preserve">– </w:t>
+      </w:r>
+      <w:r>
+        <w:rPr>
+          <w:rFonts w:ascii="Times New Roman" w:hAnsi="Times New Roman" w:eastAsia="Times New Roman" w:cs="Times New Roman"/>
+          <w:b/>
+          <w:i w:val="0"/>
+          <w:sz w:val="24"/>
+        </w:rPr>
+        <w:t>Thẩm định đối tác:</w:t>
+      </w:r>
+      <w:r>
+        <w:rPr>
+          <w:rFonts w:ascii="Times New Roman" w:hAnsi="Times New Roman" w:eastAsia="Times New Roman" w:cs="Times New Roman"/>
+          <w:b w:val="0"/>
+          <w:i w:val="0"/>
+          <w:sz w:val="24"/>
+        </w:rPr>
+        <w:t xml:space="preserve"> trước khi ký hợp đồng có giá trị từ 500.000.000 đồng, hoặc bất kỳ hợp đồng nào với đại lý, môi giới, tư vấn được hưởng hoa hồng, người phụ trách lập Phiếu thẩm định đối tác (Phụ lục D) và trình Giám đốc duyệt cùng hồ sơ hợp đồng.</w:t>
+      </w:r>
+    </w:p>
+    <w:p>
+      <w:pPr>
         <w:keepNext/>
         <w:spacing w:before="140" w:after="80" w:line="300" w:lineRule="auto"/>
       </w:pPr>
@@ -34170,7 +34352,7 @@
           <w:i w:val="0"/>
           <w:sz w:val="24"/>
         </w:rPr>
-        <w:t>Ba mẫu dưới đây là bằng chứng để trình cho auditor: mỗi người lao động ký Mẫu A, mỗi nhà cung cấp và nhà thầu phụ ký Mẫu B, mọi báo cáo vi phạm được ghi theo Mẫu C.</w:t>
+        <w:t>Bốn mẫu dưới đây là bằng chứng để trình cho auditor: mỗi người lao động ký Mẫu A, mỗi nhà cung cấp và nhà thầu phụ ký Mẫu B, mọi báo cáo vi phạm được ghi theo Mẫu C, mỗi đối tác thuộc diện thẩm định được lập Mẫu D.</w:t>
       </w:r>
     </w:p>
     <w:p>
@@ -35531,6 +35713,458 @@
       </w:tr>
     </w:tbl>
     <w:p>
+      <w:pPr>
+        <w:keepNext/>
+        <w:spacing w:before="140" w:after="80" w:line="300" w:lineRule="auto"/>
+      </w:pPr>
+      <w:r>
+        <w:rPr>
+          <w:rFonts w:ascii="Times New Roman" w:hAnsi="Times New Roman" w:eastAsia="Times New Roman" w:cs="Times New Roman"/>
+          <w:b/>
+          <w:i w:val="0"/>
+          <w:sz w:val="24"/>
+        </w:rPr>
+        <w:t>Phụ lục D – Phiếu thẩm định đối tác</w:t>
+      </w:r>
+    </w:p>
+    <w:tbl>
+      <w:tblPr>
+        <w:tblW w:type="auto" w:w="0"/>
+        <w:tblLayout w:type="fixed"/>
+        <w:tblLook w:firstColumn="1" w:firstRow="1" w:lastColumn="0" w:lastRow="0" w:noHBand="0" w:noVBand="1" w:val="04A0"/>
+        <w:tblBorders>
+          <w:top w:val="single" w:sz="4" w:color="auto"/>
+          <w:left w:val="single" w:sz="4" w:color="auto"/>
+          <w:bottom w:val="single" w:sz="4" w:color="auto"/>
+          <w:right w:val="single" w:sz="4" w:color="auto"/>
+          <w:insideH w:val="single" w:sz="4" w:color="auto"/>
+          <w:insideV w:val="single" w:sz="4" w:color="auto"/>
+        </w:tblBorders>
+      </w:tblPr>
+      <w:tblGrid>
+        <w:gridCol w:w="4819"/>
+        <w:gridCol w:w="4819"/>
+      </w:tblGrid>
+      <w:tr>
+        <w:tc>
+          <w:tcPr>
+            <w:tcW w:type="dxa" w:w="5268"/>
+          </w:tcPr>
+          <w:p>
+            <w:pPr>
+              <w:spacing w:after="60" w:before="60"/>
+            </w:pPr>
+            <w:r>
+              <w:rPr>
+                <w:rFonts w:ascii="Times New Roman" w:hAnsi="Times New Roman" w:eastAsia="Times New Roman" w:cs="Times New Roman"/>
+                <w:b/>
+                <w:i w:val="0"/>
+                <w:sz w:val="24"/>
+              </w:rPr>
+              <w:t>Mục</w:t>
+            </w:r>
+          </w:p>
+        </w:tc>
+        <w:tc>
+          <w:tcPr>
+            <w:tcW w:type="dxa" w:w="4370"/>
+          </w:tcPr>
+          <w:p>
+            <w:pPr>
+              <w:spacing w:after="60" w:before="60"/>
+            </w:pPr>
+            <w:r>
+              <w:rPr>
+                <w:rFonts w:ascii="Times New Roman" w:hAnsi="Times New Roman" w:eastAsia="Times New Roman" w:cs="Times New Roman"/>
+                <w:b/>
+                <w:i w:val="0"/>
+                <w:sz w:val="24"/>
+              </w:rPr>
+              <w:t>Nội dung</w:t>
+            </w:r>
+          </w:p>
+        </w:tc>
+      </w:tr>
+      <w:tr>
+        <w:trPr>
+          <w:trHeight w:val="510" w:hRule="atLeast"/>
+        </w:trPr>
+        <w:tc>
+          <w:tcPr>
+            <w:tcW w:type="dxa" w:w="5268"/>
+          </w:tcPr>
+          <w:p>
+            <w:pPr>
+              <w:spacing w:after="60" w:before="60"/>
+            </w:pPr>
+            <w:r>
+              <w:rPr>
+                <w:rFonts w:ascii="Times New Roman" w:hAnsi="Times New Roman" w:eastAsia="Times New Roman" w:cs="Times New Roman"/>
+                <w:b w:val="0"/>
+                <w:i w:val="0"/>
+                <w:sz w:val="24"/>
+              </w:rPr>
+              <w:t>Tên đối tác · mã số thuế · loại (khách hàng, nhà cung cấp, thầu phụ, đại lý, tư vấn)</w:t>
+            </w:r>
+          </w:p>
+        </w:tc>
+        <w:tc>
+          <w:tcPr>
+            <w:tcW w:type="dxa" w:w="4370"/>
+          </w:tcPr>
+          <w:p>
+            <w:pPr>
+              <w:spacing w:after="60" w:before="60"/>
+            </w:pPr>
+            <w:r>
+              <w:rPr>
+                <w:rFonts w:ascii="Times New Roman" w:hAnsi="Times New Roman" w:eastAsia="Times New Roman" w:cs="Times New Roman"/>
+                <w:b w:val="0"/>
+                <w:i w:val="0"/>
+                <w:sz w:val="24"/>
+              </w:rPr>
+            </w:r>
+          </w:p>
+        </w:tc>
+      </w:tr>
+      <w:tr>
+        <w:trPr>
+          <w:trHeight w:val="510" w:hRule="atLeast"/>
+        </w:trPr>
+        <w:tc>
+          <w:tcPr>
+            <w:tcW w:type="dxa" w:w="5268"/>
+          </w:tcPr>
+          <w:p>
+            <w:pPr>
+              <w:spacing w:after="60" w:before="60"/>
+            </w:pPr>
+            <w:r>
+              <w:rPr>
+                <w:rFonts w:ascii="Times New Roman" w:hAnsi="Times New Roman" w:eastAsia="Times New Roman" w:cs="Times New Roman"/>
+                <w:b w:val="0"/>
+                <w:i w:val="0"/>
+                <w:sz w:val="24"/>
+              </w:rPr>
+              <w:t>Hợp đồng dự kiến: nội dung, giá trị, thời hạn</w:t>
+            </w:r>
+          </w:p>
+        </w:tc>
+        <w:tc>
+          <w:tcPr>
+            <w:tcW w:type="dxa" w:w="4370"/>
+          </w:tcPr>
+          <w:p>
+            <w:pPr>
+              <w:spacing w:after="60" w:before="60"/>
+            </w:pPr>
+            <w:r>
+              <w:rPr>
+                <w:rFonts w:ascii="Times New Roman" w:hAnsi="Times New Roman" w:eastAsia="Times New Roman" w:cs="Times New Roman"/>
+                <w:b w:val="0"/>
+                <w:i w:val="0"/>
+                <w:sz w:val="24"/>
+              </w:rPr>
+            </w:r>
+          </w:p>
+        </w:tc>
+      </w:tr>
+      <w:tr>
+        <w:trPr>
+          <w:trHeight w:val="510" w:hRule="atLeast"/>
+        </w:trPr>
+        <w:tc>
+          <w:tcPr>
+            <w:tcW w:type="dxa" w:w="5268"/>
+          </w:tcPr>
+          <w:p>
+            <w:pPr>
+              <w:spacing w:after="60" w:before="60"/>
+            </w:pPr>
+            <w:r>
+              <w:rPr>
+                <w:rFonts w:ascii="Times New Roman" w:hAnsi="Times New Roman" w:eastAsia="Times New Roman" w:cs="Times New Roman"/>
+                <w:b w:val="0"/>
+                <w:i w:val="0"/>
+                <w:sz w:val="24"/>
+              </w:rPr>
+              <w:t>Tình trạng pháp lý (tra cứu Cổng thông tin quốc gia về đăng ký doanh nghiệp, mã số thuế đang hoạt động)</w:t>
+            </w:r>
+          </w:p>
+        </w:tc>
+        <w:tc>
+          <w:tcPr>
+            <w:tcW w:type="dxa" w:w="4370"/>
+          </w:tcPr>
+          <w:p>
+            <w:pPr>
+              <w:spacing w:after="60" w:before="60"/>
+            </w:pPr>
+            <w:r>
+              <w:rPr>
+                <w:rFonts w:ascii="Times New Roman" w:hAnsi="Times New Roman" w:eastAsia="Times New Roman" w:cs="Times New Roman"/>
+                <w:b w:val="0"/>
+                <w:i w:val="0"/>
+                <w:sz w:val="24"/>
+              </w:rPr>
+            </w:r>
+          </w:p>
+        </w:tc>
+      </w:tr>
+      <w:tr>
+        <w:trPr>
+          <w:trHeight w:val="510" w:hRule="atLeast"/>
+        </w:trPr>
+        <w:tc>
+          <w:tcPr>
+            <w:tcW w:type="dxa" w:w="5268"/>
+          </w:tcPr>
+          <w:p>
+            <w:pPr>
+              <w:spacing w:after="60" w:before="60"/>
+            </w:pPr>
+            <w:r>
+              <w:rPr>
+                <w:rFonts w:ascii="Times New Roman" w:hAnsi="Times New Roman" w:eastAsia="Times New Roman" w:cs="Times New Roman"/>
+                <w:b w:val="0"/>
+                <w:i w:val="0"/>
+                <w:sz w:val="24"/>
+              </w:rPr>
+              <w:t>Người đại diện, chủ sở hữu – có liên quan đến công chức hoặc nhân viên của khách hàng không?</w:t>
+            </w:r>
+          </w:p>
+        </w:tc>
+        <w:tc>
+          <w:tcPr>
+            <w:tcW w:type="dxa" w:w="4370"/>
+          </w:tcPr>
+          <w:p>
+            <w:pPr>
+              <w:spacing w:after="60" w:before="60"/>
+            </w:pPr>
+            <w:r>
+              <w:rPr>
+                <w:rFonts w:ascii="Times New Roman" w:hAnsi="Times New Roman" w:eastAsia="Times New Roman" w:cs="Times New Roman"/>
+                <w:b w:val="0"/>
+                <w:i w:val="0"/>
+                <w:sz w:val="24"/>
+              </w:rPr>
+            </w:r>
+          </w:p>
+        </w:tc>
+      </w:tr>
+      <w:tr>
+        <w:trPr>
+          <w:trHeight w:val="1134" w:hRule="atLeast"/>
+        </w:trPr>
+        <w:tc>
+          <w:tcPr>
+            <w:tcW w:type="dxa" w:w="5268"/>
+          </w:tcPr>
+          <w:p>
+            <w:pPr>
+              <w:spacing w:after="60" w:before="60"/>
+            </w:pPr>
+            <w:r>
+              <w:rPr>
+                <w:rFonts w:ascii="Times New Roman" w:hAnsi="Times New Roman" w:eastAsia="Times New Roman" w:cs="Times New Roman"/>
+                <w:b w:val="0"/>
+                <w:i w:val="0"/>
+                <w:sz w:val="24"/>
+              </w:rPr>
+              <w:t>Xung đột lợi ích với nhân viên SVWS (có / không, nêu rõ)</w:t>
+            </w:r>
+          </w:p>
+        </w:tc>
+        <w:tc>
+          <w:tcPr>
+            <w:tcW w:type="dxa" w:w="4370"/>
+          </w:tcPr>
+          <w:p>
+            <w:pPr>
+              <w:spacing w:after="60" w:before="60"/>
+            </w:pPr>
+            <w:r>
+              <w:rPr>
+                <w:rFonts w:ascii="Times New Roman" w:hAnsi="Times New Roman" w:eastAsia="Times New Roman" w:cs="Times New Roman"/>
+                <w:b w:val="0"/>
+                <w:i w:val="0"/>
+                <w:sz w:val="24"/>
+              </w:rPr>
+            </w:r>
+          </w:p>
+        </w:tc>
+      </w:tr>
+      <w:tr>
+        <w:trPr>
+          <w:trHeight w:val="510" w:hRule="atLeast"/>
+        </w:trPr>
+        <w:tc>
+          <w:tcPr>
+            <w:tcW w:type="dxa" w:w="5268"/>
+          </w:tcPr>
+          <w:p>
+            <w:pPr>
+              <w:spacing w:after="60" w:before="60"/>
+            </w:pPr>
+            <w:r>
+              <w:rPr>
+                <w:rFonts w:ascii="Times New Roman" w:hAnsi="Times New Roman" w:eastAsia="Times New Roman" w:cs="Times New Roman"/>
+                <w:b w:val="0"/>
+                <w:i w:val="0"/>
+                <w:sz w:val="24"/>
+              </w:rPr>
+              <w:t>Thông tin tiêu cực công khai (hối lộ, gian lận, xử phạt, tranh chấp)</w:t>
+            </w:r>
+          </w:p>
+        </w:tc>
+        <w:tc>
+          <w:tcPr>
+            <w:tcW w:type="dxa" w:w="4370"/>
+          </w:tcPr>
+          <w:p>
+            <w:pPr>
+              <w:spacing w:after="60" w:before="60"/>
+            </w:pPr>
+            <w:r>
+              <w:rPr>
+                <w:rFonts w:ascii="Times New Roman" w:hAnsi="Times New Roman" w:eastAsia="Times New Roman" w:cs="Times New Roman"/>
+                <w:b w:val="0"/>
+                <w:i w:val="0"/>
+                <w:sz w:val="24"/>
+              </w:rPr>
+            </w:r>
+          </w:p>
+        </w:tc>
+      </w:tr>
+      <w:tr>
+        <w:trPr>
+          <w:trHeight w:val="510" w:hRule="atLeast"/>
+        </w:trPr>
+        <w:tc>
+          <w:tcPr>
+            <w:tcW w:type="dxa" w:w="5268"/>
+          </w:tcPr>
+          <w:p>
+            <w:pPr>
+              <w:spacing w:after="60" w:before="60"/>
+            </w:pPr>
+            <w:r>
+              <w:rPr>
+                <w:rFonts w:ascii="Times New Roman" w:hAnsi="Times New Roman" w:eastAsia="Times New Roman" w:cs="Times New Roman"/>
+                <w:b w:val="0"/>
+                <w:i w:val="0"/>
+                <w:sz w:val="24"/>
+              </w:rPr>
+              <w:t>Hoa hồng, phí môi giới: mức, căn cứ tính, có hợp đồng và hóa đơn không?</w:t>
+            </w:r>
+          </w:p>
+        </w:tc>
+        <w:tc>
+          <w:tcPr>
+            <w:tcW w:type="dxa" w:w="4370"/>
+          </w:tcPr>
+          <w:p>
+            <w:pPr>
+              <w:spacing w:after="60" w:before="60"/>
+            </w:pPr>
+            <w:r>
+              <w:rPr>
+                <w:rFonts w:ascii="Times New Roman" w:hAnsi="Times New Roman" w:eastAsia="Times New Roman" w:cs="Times New Roman"/>
+                <w:b w:val="0"/>
+                <w:i w:val="0"/>
+                <w:sz w:val="24"/>
+              </w:rPr>
+            </w:r>
+          </w:p>
+        </w:tc>
+      </w:tr>
+      <w:tr>
+        <w:trPr>
+          <w:trHeight w:val="1134" w:hRule="atLeast"/>
+        </w:trPr>
+        <w:tc>
+          <w:tcPr>
+            <w:tcW w:type="dxa" w:w="5268"/>
+          </w:tcPr>
+          <w:p>
+            <w:pPr>
+              <w:spacing w:after="60" w:before="60"/>
+            </w:pPr>
+            <w:r>
+              <w:rPr>
+                <w:rFonts w:ascii="Times New Roman" w:hAnsi="Times New Roman" w:eastAsia="Times New Roman" w:cs="Times New Roman"/>
+                <w:b w:val="0"/>
+                <w:i w:val="0"/>
+                <w:sz w:val="24"/>
+              </w:rPr>
+              <w:t>Đối tác đồng ý điều khoản chống hối lộ trong hợp đồng / đã ký Phụ lục B (với nhà cung cấp)</w:t>
+            </w:r>
+          </w:p>
+        </w:tc>
+        <w:tc>
+          <w:tcPr>
+            <w:tcW w:type="dxa" w:w="4370"/>
+          </w:tcPr>
+          <w:p>
+            <w:pPr>
+              <w:spacing w:after="60" w:before="60"/>
+            </w:pPr>
+            <w:r>
+              <w:rPr>
+                <w:rFonts w:ascii="Times New Roman" w:hAnsi="Times New Roman" w:eastAsia="Times New Roman" w:cs="Times New Roman"/>
+                <w:b w:val="0"/>
+                <w:i w:val="0"/>
+                <w:sz w:val="24"/>
+              </w:rPr>
+            </w:r>
+          </w:p>
+        </w:tc>
+      </w:tr>
+      <w:tr>
+        <w:trPr>
+          <w:trHeight w:val="510" w:hRule="atLeast"/>
+        </w:trPr>
+        <w:tc>
+          <w:tcPr>
+            <w:tcW w:type="dxa" w:w="5268"/>
+          </w:tcPr>
+          <w:p>
+            <w:pPr>
+              <w:spacing w:after="60" w:before="60"/>
+            </w:pPr>
+            <w:r>
+              <w:rPr>
+                <w:rFonts w:ascii="Times New Roman" w:hAnsi="Times New Roman" w:eastAsia="Times New Roman" w:cs="Times New Roman"/>
+                <w:b w:val="0"/>
+                <w:i w:val="0"/>
+                <w:sz w:val="24"/>
+              </w:rPr>
+              <w:t>Mức rủi ro (thấp / trung bình / cao) · biện pháp kiểm soát · người lập, ngày · Giám đốc duyệt</w:t>
+            </w:r>
+          </w:p>
+        </w:tc>
+        <w:tc>
+          <w:tcPr>
+            <w:tcW w:type="dxa" w:w="4370"/>
+          </w:tcPr>
+          <w:p>
+            <w:pPr>
+              <w:spacing w:after="60" w:before="60"/>
+            </w:pPr>
+            <w:r>
+              <w:rPr>
+                <w:rFonts w:ascii="Times New Roman" w:hAnsi="Times New Roman" w:eastAsia="Times New Roman" w:cs="Times New Roman"/>
+                <w:b w:val="0"/>
+                <w:i w:val="0"/>
+                <w:sz w:val="24"/>
+              </w:rPr>
+            </w:r>
+          </w:p>
+        </w:tc>
+      </w:tr>
+    </w:tbl>
+    <w:p>
       <w:r>
         <w:br w:type="page"/>
       </w:r>
@@ -35562,7 +36196,7 @@
           <w:sz w:val="24"/>
           <w:szCs w:val="24"/>
         </w:rPr>
-        <w:t xml:space="preserve">Số: ......../2026/PCCC-SV</w:t>
+        <w:t>Số: PCCC-01-0926</w:t>
       </w:r>
     </w:p>
     <w:p>
@@ -35626,7 +36260,7 @@
           <w:sz w:val="22"/>
           <w:szCs w:val="22"/>
         </w:rPr>
-        <w:t xml:space="preserve">(Ban hành kèm theo Quyết định số ......../2026/QĐ-SV ngày ...... tháng ...... năm 2026 của Giám đốc Công ty TNHH Giải pháp Kỹ thuật Sóng Việt)</w:t>
+        <w:t>(Ban hành kèm theo Quyết định số PCCC-01-0926 ngày 01 tháng 09 năm 2026 của Giám đốc Công ty TNHH Giải pháp Kỹ thuật Sóng Việt)</w:t>
       </w:r>
     </w:p>
     <w:p>

</xml_diff>